<commit_message>
docs: include detailed step-by-step guides for contracts, innovations, assets, rewards and org-chart into master handover document
</commit_message>
<xml_diff>
--- a/HO_SO_BAN_GIAO_VA_HUONG_DAN_SU_DUNG_HRM_VIET_A.docx
+++ b/HO_SO_BAN_GIAO_VA_HUONG_DAN_SU_DUNG_HRM_VIET_A.docx
@@ -870,7 +870,7 @@
     </w:p>
     <w:p>
       <w:pPr>
-        <w:spacing w:after="40" w:before="40"/>
+        <w:spacing w:after="80" w:before="160"/>
       </w:pPr>
       <w:r>
         <w:rPr>
@@ -881,27 +881,7 @@
           <w:sz w:val="21"/>
           <w:szCs w:val="21"/>
         </w:rPr>
-        <w:t xml:space="preserve">• </w:t>
-      </w:r>
-      <w:r>
-        <w:rPr>
-          <w:rFonts w:ascii="Times New Roman" w:cs="Times New Roman" w:eastAsia="Times New Roman" w:hAnsi="Times New Roman"/>
-          <w:b/>
-          <w:bCs/>
-          <w:color w:val="0F172A"/>
-          <w:sz w:val="21"/>
-          <w:szCs w:val="21"/>
-        </w:rPr>
-        <w:t xml:space="preserve">1. Quản lý Hồ sơ nhân sự (/employees): </w:t>
-      </w:r>
-      <w:r>
-        <w:rPr>
-          <w:rFonts w:ascii="Times New Roman" w:cs="Times New Roman" w:eastAsia="Times New Roman" w:hAnsi="Times New Roman"/>
-          <w:color w:val="334155"/>
-          <w:sz w:val="21"/>
-          <w:szCs w:val="21"/>
-        </w:rPr>
-        <w:t xml:space="preserve">Thêm mới nhân viên, cập nhật mức lương ngạch bậc, theo dõi hợp đồng, in hợp đồng lao động chuẩn tự động.</w:t>
+        <w:t xml:space="preserve">1. QUẢN LÝ HỒ SƠ NHÂN SỰ &amp; TỰ ĐỘNG IN HỢP ĐỒNG LAO ĐỘNG (/employees, /contracts)</w:t>
       </w:r>
     </w:p>
     <w:p>
@@ -928,7 +908,7 @@
           <w:sz w:val="21"/>
           <w:szCs w:val="21"/>
         </w:rPr>
-        <w:t xml:space="preserve">2. Chấm công &amp; Duyệt đơn (/attendance): </w:t>
+        <w:t xml:space="preserve">Hồ sơ nhân sự (/employees): </w:t>
       </w:r>
       <w:r>
         <w:rPr>
@@ -937,7 +917,7 @@
           <w:sz w:val="21"/>
           <w:szCs w:val="21"/>
         </w:rPr>
-        <w:t xml:space="preserve">Theo dõi bảng công 26 ngày chuẩn theo tháng, phê duyệt đơn xin nghỉ phép/đi muộn/làm thêm giờ của toàn công ty, chốt công tháng.</w:t>
+        <w:t xml:space="preserve">Theo dõi danh sách 57 nhân sự, lọc theo 11 phòng ban, cập nhật thông tin cá nhân, CCCD, ngày sinh, chức danh và mức lương ngạch bậc chuẩn.</w:t>
       </w:r>
     </w:p>
     <w:p>
@@ -964,7 +944,7 @@
           <w:sz w:val="21"/>
           <w:szCs w:val="21"/>
         </w:rPr>
-        <w:t xml:space="preserve">3. Quản lý KPI (/kpi): </w:t>
+        <w:t xml:space="preserve">📄 Tự động in Hợp đồng lao động chuẩn (/contracts): </w:t>
       </w:r>
       <w:r>
         <w:rPr>
@@ -973,7 +953,23 @@
           <w:sz w:val="21"/>
           <w:szCs w:val="21"/>
         </w:rPr>
-        <w:t xml:space="preserve">Chọn tháng/năm, thiết lập KPI trách nhiệm theo chức vụ, nhập % hoàn thành để hệ thống tự động tính thưởng trách nhiệm và thưởng hiệu suất.</w:t>
+        <w:t xml:space="preserve">Vào menu 'Hợp đồng lao động' hoặc chọn nhân viên cụ thể -&gt; Bấm 'In Hợp đồng'. Hệ thống tự động trích xuất đầy đủ thông tin: Họ tên, CMND/CCCD, địa chỉ, ngạch bậc lương, phụ cấp, người đại diện theo pháp luật và xuất ra file Word (.docx) hoặc in trực tiếp PDF chuẩn theo quy chế lao động công ty.</w:t>
+      </w:r>
+    </w:p>
+    <w:p>
+      <w:pPr>
+        <w:spacing w:after="80" w:before="160"/>
+      </w:pPr>
+      <w:r>
+        <w:rPr>
+          <w:rFonts w:ascii="Times New Roman" w:cs="Times New Roman" w:eastAsia="Times New Roman" w:hAnsi="Times New Roman"/>
+          <w:b/>
+          <w:bCs/>
+          <w:color w:val="0284C7"/>
+          <w:sz w:val="21"/>
+          <w:szCs w:val="21"/>
+        </w:rPr>
+        <w:t xml:space="preserve">2. CHẤM CÔNG, QUẢN LÝ NGHỈ PHÉP &amp; LÀM THÊM GIỜ (/attendance)</w:t>
       </w:r>
     </w:p>
     <w:p>
@@ -1000,7 +996,7 @@
           <w:sz w:val="21"/>
           <w:szCs w:val="21"/>
         </w:rPr>
-        <w:t xml:space="preserve">4. Tính &amp; Xuất Bảng lương (/payroll): </w:t>
+        <w:t xml:space="preserve">Bảng chấm công tổng hợp: </w:t>
       </w:r>
       <w:r>
         <w:rPr>
@@ -1009,7 +1005,7 @@
           <w:sz w:val="21"/>
           <w:szCs w:val="21"/>
         </w:rPr>
-        <w:t xml:space="preserve">Chọn Tháng/Năm -&gt; Bấm 'Tính lương tự động' -&gt; Kiểm tra tổng quỹ lương 11 phòng ban -&gt; Bấm 'Xuất Bảng Lương Excel' -&gt; Bấm 'Gửi phiếu lương'.</w:t>
+        <w:t xml:space="preserve">Theo dõi dữ liệu 26 ngày công chuẩn theo từng tháng, tự động tính số ngày làm việc thực tế, số ngày nghỉ phép năm, nghỉ không lương, giờ đi muộn/về sớm.</w:t>
       </w:r>
     </w:p>
     <w:p>
@@ -1036,7 +1032,7 @@
           <w:sz w:val="21"/>
           <w:szCs w:val="21"/>
         </w:rPr>
-        <w:t xml:space="preserve">5. Phúc lợi, Kỷ luật &amp; Sáng kiến (/rewards, /innovations, /assets): </w:t>
+        <w:t xml:space="preserve">Phê duyệt đơn từ trực tuyến: </w:t>
       </w:r>
       <w:r>
         <w:rPr>
@@ -1045,7 +1041,679 @@
           <w:sz w:val="21"/>
           <w:szCs w:val="21"/>
         </w:rPr>
-        <w:t xml:space="preserve">Ban hành khen thưởng/kỷ luật, tiếp nhận và thẩm định sáng kiến cải tiến, quản lý kho tài sản thiết bị và cấp phát.</w:t>
+        <w:t xml:space="preserve">Vào tab 'Đơn xin nghỉ phép / Đi muộn / OT' -&gt; Quản lý hoặc HCNS bấm Duyệt (Approve) hoặc Từ chối (Reject) kèm lý do phản hồi cho nhân viên.</w:t>
+      </w:r>
+    </w:p>
+    <w:p>
+      <w:pPr>
+        <w:spacing w:after="40" w:before="40"/>
+      </w:pPr>
+      <w:r>
+        <w:rPr>
+          <w:rFonts w:ascii="Times New Roman" w:cs="Times New Roman" w:eastAsia="Times New Roman" w:hAnsi="Times New Roman"/>
+          <w:b/>
+          <w:bCs/>
+          <w:color w:val="0284C7"/>
+          <w:sz w:val="21"/>
+          <w:szCs w:val="21"/>
+        </w:rPr>
+        <w:t xml:space="preserve">• </w:t>
+      </w:r>
+      <w:r>
+        <w:rPr>
+          <w:rFonts w:ascii="Times New Roman" w:cs="Times New Roman" w:eastAsia="Times New Roman" w:hAnsi="Times New Roman"/>
+          <w:b/>
+          <w:bCs/>
+          <w:color w:val="0F172A"/>
+          <w:sz w:val="21"/>
+          <w:szCs w:val="21"/>
+        </w:rPr>
+        <w:t xml:space="preserve">Chốt công tháng: </w:t>
+      </w:r>
+      <w:r>
+        <w:rPr>
+          <w:rFonts w:ascii="Times New Roman" w:cs="Times New Roman" w:eastAsia="Times New Roman" w:hAnsi="Times New Roman"/>
+          <w:color w:val="334155"/>
+          <w:sz w:val="21"/>
+          <w:szCs w:val="21"/>
+        </w:rPr>
+        <w:t xml:space="preserve">Bấm nút 'Đồng bộ bảng công' trước khi tính lương để tự động chuyển số ngày công thực tế và giờ OT sang phân hệ Tính lương.</w:t>
+      </w:r>
+    </w:p>
+    <w:p>
+      <w:pPr>
+        <w:spacing w:after="80" w:before="160"/>
+      </w:pPr>
+      <w:r>
+        <w:rPr>
+          <w:rFonts w:ascii="Times New Roman" w:cs="Times New Roman" w:eastAsia="Times New Roman" w:hAnsi="Times New Roman"/>
+          <w:b/>
+          <w:bCs/>
+          <w:color w:val="0284C7"/>
+          <w:sz w:val="21"/>
+          <w:szCs w:val="21"/>
+        </w:rPr>
+        <w:t xml:space="preserve">3. QUẢN LÝ KPI &amp; ĐÁNH GIÁ THÁNG (/kpi)</w:t>
+      </w:r>
+    </w:p>
+    <w:p>
+      <w:pPr>
+        <w:spacing w:after="40" w:before="40"/>
+      </w:pPr>
+      <w:r>
+        <w:rPr>
+          <w:rFonts w:ascii="Times New Roman" w:cs="Times New Roman" w:eastAsia="Times New Roman" w:hAnsi="Times New Roman"/>
+          <w:b/>
+          <w:bCs/>
+          <w:color w:val="0284C7"/>
+          <w:sz w:val="21"/>
+          <w:szCs w:val="21"/>
+        </w:rPr>
+        <w:t xml:space="preserve">• </w:t>
+      </w:r>
+      <w:r>
+        <w:rPr>
+          <w:rFonts w:ascii="Times New Roman" w:cs="Times New Roman" w:eastAsia="Times New Roman" w:hAnsi="Times New Roman"/>
+          <w:b/>
+          <w:bCs/>
+          <w:color w:val="0F172A"/>
+          <w:sz w:val="21"/>
+          <w:szCs w:val="21"/>
+        </w:rPr>
+        <w:t xml:space="preserve">Thiết lập hạn mức KPI: </w:t>
+      </w:r>
+      <w:r>
+        <w:rPr>
+          <w:rFonts w:ascii="Times New Roman" w:cs="Times New Roman" w:eastAsia="Times New Roman" w:hAnsi="Times New Roman"/>
+          <w:color w:val="334155"/>
+          <w:sz w:val="21"/>
+          <w:szCs w:val="21"/>
+        </w:rPr>
+        <w:t xml:space="preserve">Chọn tháng/năm cần đánh giá (ví dụ: Tháng 08/2026), thiết lập mức thưởng trách nhiệm định mức theo chức danh (1.000.000đ, 2.000.000đ,...).</w:t>
+      </w:r>
+    </w:p>
+    <w:p>
+      <w:pPr>
+        <w:spacing w:after="40" w:before="40"/>
+      </w:pPr>
+      <w:r>
+        <w:rPr>
+          <w:rFonts w:ascii="Times New Roman" w:cs="Times New Roman" w:eastAsia="Times New Roman" w:hAnsi="Times New Roman"/>
+          <w:b/>
+          <w:bCs/>
+          <w:color w:val="0284C7"/>
+          <w:sz w:val="21"/>
+          <w:szCs w:val="21"/>
+        </w:rPr>
+        <w:t xml:space="preserve">• </w:t>
+      </w:r>
+      <w:r>
+        <w:rPr>
+          <w:rFonts w:ascii="Times New Roman" w:cs="Times New Roman" w:eastAsia="Times New Roman" w:hAnsi="Times New Roman"/>
+          <w:b/>
+          <w:bCs/>
+          <w:color w:val="0F172A"/>
+          <w:sz w:val="21"/>
+          <w:szCs w:val="21"/>
+        </w:rPr>
+        <w:t xml:space="preserve">Chấm điểm &amp; Tự động tính tiền: </w:t>
+      </w:r>
+      <w:r>
+        <w:rPr>
+          <w:rFonts w:ascii="Times New Roman" w:cs="Times New Roman" w:eastAsia="Times New Roman" w:hAnsi="Times New Roman"/>
+          <w:color w:val="334155"/>
+          <w:sz w:val="21"/>
+          <w:szCs w:val="21"/>
+        </w:rPr>
+        <w:t xml:space="preserve">Trưởng phòng hoặc HCNS chấm điểm theo tỷ lệ % hoàn thành (100%, 80%, 50%,...) -&gt; Hệ thống tự động tính tiền Thưởng trách nhiệm thực nhận và Thưởng hiệu suất (Performance Bonus).</w:t>
+      </w:r>
+    </w:p>
+    <w:p>
+      <w:pPr>
+        <w:spacing w:after="80" w:before="160"/>
+      </w:pPr>
+      <w:r>
+        <w:rPr>
+          <w:rFonts w:ascii="Times New Roman" w:cs="Times New Roman" w:eastAsia="Times New Roman" w:hAnsi="Times New Roman"/>
+          <w:b/>
+          <w:bCs/>
+          <w:color w:val="0284C7"/>
+          <w:sz w:val="21"/>
+          <w:szCs w:val="21"/>
+        </w:rPr>
+        <w:t xml:space="preserve">4. TÍNH TOÁN, DUYỆT &amp; XUẤT BẢNG LƯƠNG (/payroll)</w:t>
+      </w:r>
+    </w:p>
+    <w:p>
+      <w:pPr>
+        <w:spacing w:after="40" w:before="40"/>
+      </w:pPr>
+      <w:r>
+        <w:rPr>
+          <w:rFonts w:ascii="Times New Roman" w:cs="Times New Roman" w:eastAsia="Times New Roman" w:hAnsi="Times New Roman"/>
+          <w:b/>
+          <w:bCs/>
+          <w:color w:val="0284C7"/>
+          <w:sz w:val="21"/>
+          <w:szCs w:val="21"/>
+        </w:rPr>
+        <w:t xml:space="preserve">• </w:t>
+      </w:r>
+      <w:r>
+        <w:rPr>
+          <w:rFonts w:ascii="Times New Roman" w:cs="Times New Roman" w:eastAsia="Times New Roman" w:hAnsi="Times New Roman"/>
+          <w:b/>
+          <w:bCs/>
+          <w:color w:val="0F172A"/>
+          <w:sz w:val="21"/>
+          <w:szCs w:val="21"/>
+        </w:rPr>
+        <w:t xml:space="preserve">Bước 1 - Chọn kỳ lương: </w:t>
+      </w:r>
+      <w:r>
+        <w:rPr>
+          <w:rFonts w:ascii="Times New Roman" w:cs="Times New Roman" w:eastAsia="Times New Roman" w:hAnsi="Times New Roman"/>
+          <w:color w:val="334155"/>
+          <w:sz w:val="21"/>
+          <w:szCs w:val="21"/>
+        </w:rPr>
+        <w:t xml:space="preserve">Chọn Tháng và Năm cần lập bảng lương trên thanh công cụ.</w:t>
+      </w:r>
+    </w:p>
+    <w:p>
+      <w:pPr>
+        <w:spacing w:after="40" w:before="40"/>
+      </w:pPr>
+      <w:r>
+        <w:rPr>
+          <w:rFonts w:ascii="Times New Roman" w:cs="Times New Roman" w:eastAsia="Times New Roman" w:hAnsi="Times New Roman"/>
+          <w:b/>
+          <w:bCs/>
+          <w:color w:val="0284C7"/>
+          <w:sz w:val="21"/>
+          <w:szCs w:val="21"/>
+        </w:rPr>
+        <w:t xml:space="preserve">• </w:t>
+      </w:r>
+      <w:r>
+        <w:rPr>
+          <w:rFonts w:ascii="Times New Roman" w:cs="Times New Roman" w:eastAsia="Times New Roman" w:hAnsi="Times New Roman"/>
+          <w:b/>
+          <w:bCs/>
+          <w:color w:val="0F172A"/>
+          <w:sz w:val="21"/>
+          <w:szCs w:val="21"/>
+        </w:rPr>
+        <w:t xml:space="preserve">Bước 2 - Tính lương tự động: </w:t>
+      </w:r>
+      <w:r>
+        <w:rPr>
+          <w:rFonts w:ascii="Times New Roman" w:cs="Times New Roman" w:eastAsia="Times New Roman" w:hAnsi="Times New Roman"/>
+          <w:color w:val="334155"/>
+          <w:sz w:val="21"/>
+          <w:szCs w:val="21"/>
+        </w:rPr>
+        <w:t xml:space="preserve">Bấm 'Tính lương tự động' -&gt; Hệ thống lấy 100% dữ liệu gốc: Lương ngạch bậc theo ngày công + Tiền OT (x1.5) + Tiền KPI + Phụ cấp ăn/điện thoại - BHXH (10.5%) - Công đoàn (1%) - Tạm ứng/Giảm trừ.</w:t>
+      </w:r>
+    </w:p>
+    <w:p>
+      <w:pPr>
+        <w:spacing w:after="40" w:before="40"/>
+      </w:pPr>
+      <w:r>
+        <w:rPr>
+          <w:rFonts w:ascii="Times New Roman" w:cs="Times New Roman" w:eastAsia="Times New Roman" w:hAnsi="Times New Roman"/>
+          <w:b/>
+          <w:bCs/>
+          <w:color w:val="0284C7"/>
+          <w:sz w:val="21"/>
+          <w:szCs w:val="21"/>
+        </w:rPr>
+        <w:t xml:space="preserve">• </w:t>
+      </w:r>
+      <w:r>
+        <w:rPr>
+          <w:rFonts w:ascii="Times New Roman" w:cs="Times New Roman" w:eastAsia="Times New Roman" w:hAnsi="Times New Roman"/>
+          <w:b/>
+          <w:bCs/>
+          <w:color w:val="0F172A"/>
+          <w:sz w:val="21"/>
+          <w:szCs w:val="21"/>
+        </w:rPr>
+        <w:t xml:space="preserve">Bước 3 - Xuất Báo cáo: </w:t>
+      </w:r>
+      <w:r>
+        <w:rPr>
+          <w:rFonts w:ascii="Times New Roman" w:cs="Times New Roman" w:eastAsia="Times New Roman" w:hAnsi="Times New Roman"/>
+          <w:color w:val="334155"/>
+          <w:sz w:val="21"/>
+          <w:szCs w:val="21"/>
+        </w:rPr>
+        <w:t xml:space="preserve">Bấm 'Xuất Bảng Lương Excel' để lưu trữ hoặc trình Ban Giám Đốc phê duyệt; Bấm 'Gửi phiếu lương' để nhân viên tự tra cứu trên tài khoản cá nhân.</w:t>
+      </w:r>
+    </w:p>
+    <w:p>
+      <w:pPr>
+        <w:spacing w:after="80" w:before="160"/>
+      </w:pPr>
+      <w:r>
+        <w:rPr>
+          <w:rFonts w:ascii="Times New Roman" w:cs="Times New Roman" w:eastAsia="Times New Roman" w:hAnsi="Times New Roman"/>
+          <w:b/>
+          <w:bCs/>
+          <w:color w:val="0284C7"/>
+          <w:sz w:val="21"/>
+          <w:szCs w:val="21"/>
+        </w:rPr>
+        <w:t xml:space="preserve">5. 💡 HÒM THƯ &amp; SÁNG KIẾN CẢI TIẾN SẢN XUẤT (/innovations)</w:t>
+      </w:r>
+    </w:p>
+    <w:p>
+      <w:pPr>
+        <w:spacing w:after="40" w:before="40"/>
+      </w:pPr>
+      <w:r>
+        <w:rPr>
+          <w:rFonts w:ascii="Times New Roman" w:cs="Times New Roman" w:eastAsia="Times New Roman" w:hAnsi="Times New Roman"/>
+          <w:b/>
+          <w:bCs/>
+          <w:color w:val="0284C7"/>
+          <w:sz w:val="21"/>
+          <w:szCs w:val="21"/>
+        </w:rPr>
+        <w:t xml:space="preserve">• </w:t>
+      </w:r>
+      <w:r>
+        <w:rPr>
+          <w:rFonts w:ascii="Times New Roman" w:cs="Times New Roman" w:eastAsia="Times New Roman" w:hAnsi="Times New Roman"/>
+          <w:b/>
+          <w:bCs/>
+          <w:color w:val="0F172A"/>
+          <w:sz w:val="21"/>
+          <w:szCs w:val="21"/>
+        </w:rPr>
+        <w:t xml:space="preserve">Mục đích: </w:t>
+      </w:r>
+      <w:r>
+        <w:rPr>
+          <w:rFonts w:ascii="Times New Roman" w:cs="Times New Roman" w:eastAsia="Times New Roman" w:hAnsi="Times New Roman"/>
+          <w:color w:val="334155"/>
+          <w:sz w:val="21"/>
+          <w:szCs w:val="21"/>
+        </w:rPr>
+        <w:t xml:space="preserve">Khuyến khích công nhân viên tại các xưởng sản xuất, kho bãi và văn phòng đóng góp các ý tưởng cải tiến kỹ thuật, tiết kiệm nguyên vật liệu, tối ưu quy trình làm việc.</w:t>
+      </w:r>
+    </w:p>
+    <w:p>
+      <w:pPr>
+        <w:spacing w:after="40" w:before="40"/>
+      </w:pPr>
+      <w:r>
+        <w:rPr>
+          <w:rFonts w:ascii="Times New Roman" w:cs="Times New Roman" w:eastAsia="Times New Roman" w:hAnsi="Times New Roman"/>
+          <w:b/>
+          <w:bCs/>
+          <w:color w:val="0284C7"/>
+          <w:sz w:val="21"/>
+          <w:szCs w:val="21"/>
+        </w:rPr>
+        <w:t xml:space="preserve">• </w:t>
+      </w:r>
+      <w:r>
+        <w:rPr>
+          <w:rFonts w:ascii="Times New Roman" w:cs="Times New Roman" w:eastAsia="Times New Roman" w:hAnsi="Times New Roman"/>
+          <w:b/>
+          <w:bCs/>
+          <w:color w:val="0F172A"/>
+          <w:sz w:val="21"/>
+          <w:szCs w:val="21"/>
+        </w:rPr>
+        <w:t xml:space="preserve">Nhân viên gửi sáng kiến: </w:t>
+      </w:r>
+      <w:r>
+        <w:rPr>
+          <w:rFonts w:ascii="Times New Roman" w:cs="Times New Roman" w:eastAsia="Times New Roman" w:hAnsi="Times New Roman"/>
+          <w:color w:val="334155"/>
+          <w:sz w:val="21"/>
+          <w:szCs w:val="21"/>
+        </w:rPr>
+        <w:t xml:space="preserve">Nhân viên gửi ý tưởng kèm mô tả hiệu quả dự kiến (tiết kiệm chi phí, tăng năng suất, an toàn lao động), có thể đính kèm tài liệu/hình ảnh và chọn chế độ Gửi ẩn danh hoặc Công khai.</w:t>
+      </w:r>
+    </w:p>
+    <w:p>
+      <w:pPr>
+        <w:spacing w:after="40" w:before="40"/>
+      </w:pPr>
+      <w:r>
+        <w:rPr>
+          <w:rFonts w:ascii="Times New Roman" w:cs="Times New Roman" w:eastAsia="Times New Roman" w:hAnsi="Times New Roman"/>
+          <w:b/>
+          <w:bCs/>
+          <w:color w:val="0284C7"/>
+          <w:sz w:val="21"/>
+          <w:szCs w:val="21"/>
+        </w:rPr>
+        <w:t xml:space="preserve">• </w:t>
+      </w:r>
+      <w:r>
+        <w:rPr>
+          <w:rFonts w:ascii="Times New Roman" w:cs="Times New Roman" w:eastAsia="Times New Roman" w:hAnsi="Times New Roman"/>
+          <w:b/>
+          <w:bCs/>
+          <w:color w:val="0F172A"/>
+          <w:sz w:val="21"/>
+          <w:szCs w:val="21"/>
+        </w:rPr>
+        <w:t xml:space="preserve">Thẩm định &amp; Duyệt thưởng: </w:t>
+      </w:r>
+      <w:r>
+        <w:rPr>
+          <w:rFonts w:ascii="Times New Roman" w:cs="Times New Roman" w:eastAsia="Times New Roman" w:hAnsi="Times New Roman"/>
+          <w:color w:val="334155"/>
+          <w:sz w:val="21"/>
+          <w:szCs w:val="21"/>
+        </w:rPr>
+        <w:t xml:space="preserve">Ban Giám Đốc và Phòng HCNS tiếp nhận đề xuất, đánh giá tính khả thi và duyệt mức Thưởng sáng kiến -&gt; Số tiền thưởng tự động được cộng vào kỳ lương của nhân viên.</w:t>
+      </w:r>
+    </w:p>
+    <w:p>
+      <w:pPr>
+        <w:spacing w:after="80" w:before="160"/>
+      </w:pPr>
+      <w:r>
+        <w:rPr>
+          <w:rFonts w:ascii="Times New Roman" w:cs="Times New Roman" w:eastAsia="Times New Roman" w:hAnsi="Times New Roman"/>
+          <w:b/>
+          <w:bCs/>
+          <w:color w:val="0284C7"/>
+          <w:sz w:val="21"/>
+          <w:szCs w:val="21"/>
+        </w:rPr>
+        <w:t xml:space="preserve">6. 📦 QUẢN LÝ TÀI SẢN &amp; CÔNG CỤ DỤNG CỤ (CCDC) (/assets)</w:t>
+      </w:r>
+    </w:p>
+    <w:p>
+      <w:pPr>
+        <w:spacing w:after="40" w:before="40"/>
+      </w:pPr>
+      <w:r>
+        <w:rPr>
+          <w:rFonts w:ascii="Times New Roman" w:cs="Times New Roman" w:eastAsia="Times New Roman" w:hAnsi="Times New Roman"/>
+          <w:b/>
+          <w:bCs/>
+          <w:color w:val="0284C7"/>
+          <w:sz w:val="21"/>
+          <w:szCs w:val="21"/>
+        </w:rPr>
+        <w:t xml:space="preserve">• </w:t>
+      </w:r>
+      <w:r>
+        <w:rPr>
+          <w:rFonts w:ascii="Times New Roman" w:cs="Times New Roman" w:eastAsia="Times New Roman" w:hAnsi="Times New Roman"/>
+          <w:b/>
+          <w:bCs/>
+          <w:color w:val="0F172A"/>
+          <w:sz w:val="21"/>
+          <w:szCs w:val="21"/>
+        </w:rPr>
+        <w:t xml:space="preserve">Quản lý danh mục tài sản: </w:t>
+      </w:r>
+      <w:r>
+        <w:rPr>
+          <w:rFonts w:ascii="Times New Roman" w:cs="Times New Roman" w:eastAsia="Times New Roman" w:hAnsi="Times New Roman"/>
+          <w:color w:val="334155"/>
+          <w:sz w:val="21"/>
+          <w:szCs w:val="21"/>
+        </w:rPr>
+        <w:t xml:space="preserve">Theo dõi danh mục máy móc xưởng nệm/gối, xe tải giao hàng kho Cần Thơ/Mỹ Tho, máy tính văn phòng, tình trạng sử dụng, thời gian khấu hao và giá trị còn lại.</w:t>
+      </w:r>
+    </w:p>
+    <w:p>
+      <w:pPr>
+        <w:spacing w:after="40" w:before="40"/>
+      </w:pPr>
+      <w:r>
+        <w:rPr>
+          <w:rFonts w:ascii="Times New Roman" w:cs="Times New Roman" w:eastAsia="Times New Roman" w:hAnsi="Times New Roman"/>
+          <w:b/>
+          <w:bCs/>
+          <w:color w:val="0284C7"/>
+          <w:sz w:val="21"/>
+          <w:szCs w:val="21"/>
+        </w:rPr>
+        <w:t xml:space="preserve">• </w:t>
+      </w:r>
+      <w:r>
+        <w:rPr>
+          <w:rFonts w:ascii="Times New Roman" w:cs="Times New Roman" w:eastAsia="Times New Roman" w:hAnsi="Times New Roman"/>
+          <w:b/>
+          <w:bCs/>
+          <w:color w:val="0F172A"/>
+          <w:sz w:val="21"/>
+          <w:szCs w:val="21"/>
+        </w:rPr>
+        <w:t xml:space="preserve">Theo dõi cấp phát: </w:t>
+      </w:r>
+      <w:r>
+        <w:rPr>
+          <w:rFonts w:ascii="Times New Roman" w:cs="Times New Roman" w:eastAsia="Times New Roman" w:hAnsi="Times New Roman"/>
+          <w:color w:val="334155"/>
+          <w:sz w:val="21"/>
+          <w:szCs w:val="21"/>
+        </w:rPr>
+        <w:t xml:space="preserve">Gán tài sản/công cụ cho từng nhân viên hoặc từng phòng ban phụ trách chịu trách nhiệm quản lý.</w:t>
+      </w:r>
+    </w:p>
+    <w:p>
+      <w:pPr>
+        <w:spacing w:after="40" w:before="40"/>
+      </w:pPr>
+      <w:r>
+        <w:rPr>
+          <w:rFonts w:ascii="Times New Roman" w:cs="Times New Roman" w:eastAsia="Times New Roman" w:hAnsi="Times New Roman"/>
+          <w:b/>
+          <w:bCs/>
+          <w:color w:val="0284C7"/>
+          <w:sz w:val="21"/>
+          <w:szCs w:val="21"/>
+        </w:rPr>
+        <w:t xml:space="preserve">• </w:t>
+      </w:r>
+      <w:r>
+        <w:rPr>
+          <w:rFonts w:ascii="Times New Roman" w:cs="Times New Roman" w:eastAsia="Times New Roman" w:hAnsi="Times New Roman"/>
+          <w:b/>
+          <w:bCs/>
+          <w:color w:val="0F172A"/>
+          <w:sz w:val="21"/>
+          <w:szCs w:val="21"/>
+        </w:rPr>
+        <w:t xml:space="preserve">Xử lý phiếu báo hỏng: </w:t>
+      </w:r>
+      <w:r>
+        <w:rPr>
+          <w:rFonts w:ascii="Times New Roman" w:cs="Times New Roman" w:eastAsia="Times New Roman" w:hAnsi="Times New Roman"/>
+          <w:color w:val="334155"/>
+          <w:sz w:val="21"/>
+          <w:szCs w:val="21"/>
+        </w:rPr>
+        <w:t xml:space="preserve">Nhân viên tạo phiếu báo hỏng tài sản trực tuyến khi gặp sự cố; Trưởng phòng và Bộ phận kỹ thuật tiếp nhận xử lý, cập nhật chi phí sửa chữa và thời gian hoàn thành.</w:t>
+      </w:r>
+    </w:p>
+    <w:p>
+      <w:pPr>
+        <w:spacing w:after="80" w:before="160"/>
+      </w:pPr>
+      <w:r>
+        <w:rPr>
+          <w:rFonts w:ascii="Times New Roman" w:cs="Times New Roman" w:eastAsia="Times New Roman" w:hAnsi="Times New Roman"/>
+          <w:b/>
+          <w:bCs/>
+          <w:color w:val="0284C7"/>
+          <w:sz w:val="21"/>
+          <w:szCs w:val="21"/>
+        </w:rPr>
+        <w:t xml:space="preserve">7. 🏆 KHEN THƯỞNG &amp; KỶ LUẬT ĐỒNG BỘ BẢNG LƯƠNG (/rewards)</w:t>
+      </w:r>
+    </w:p>
+    <w:p>
+      <w:pPr>
+        <w:spacing w:after="40" w:before="40"/>
+      </w:pPr>
+      <w:r>
+        <w:rPr>
+          <w:rFonts w:ascii="Times New Roman" w:cs="Times New Roman" w:eastAsia="Times New Roman" w:hAnsi="Times New Roman"/>
+          <w:b/>
+          <w:bCs/>
+          <w:color w:val="0284C7"/>
+          <w:sz w:val="21"/>
+          <w:szCs w:val="21"/>
+        </w:rPr>
+        <w:t xml:space="preserve">• </w:t>
+      </w:r>
+      <w:r>
+        <w:rPr>
+          <w:rFonts w:ascii="Times New Roman" w:cs="Times New Roman" w:eastAsia="Times New Roman" w:hAnsi="Times New Roman"/>
+          <w:b/>
+          <w:bCs/>
+          <w:color w:val="0F172A"/>
+          <w:sz w:val="21"/>
+          <w:szCs w:val="21"/>
+        </w:rPr>
+        <w:t xml:space="preserve">Ban hành Khen thưởng: </w:t>
+      </w:r>
+      <w:r>
+        <w:rPr>
+          <w:rFonts w:ascii="Times New Roman" w:cs="Times New Roman" w:eastAsia="Times New Roman" w:hAnsi="Times New Roman"/>
+          <w:color w:val="334155"/>
+          <w:sz w:val="21"/>
+          <w:szCs w:val="21"/>
+        </w:rPr>
+        <w:t xml:space="preserve">Lập quyết định khen thưởng cá nhân/tập thể xuất sắc, khen thưởng đột xuất kèm số tiền thưởng -&gt; Tự động cộng vào cột Thưởng khác trên Bảng lương.</w:t>
+      </w:r>
+    </w:p>
+    <w:p>
+      <w:pPr>
+        <w:spacing w:after="40" w:before="40"/>
+      </w:pPr>
+      <w:r>
+        <w:rPr>
+          <w:rFonts w:ascii="Times New Roman" w:cs="Times New Roman" w:eastAsia="Times New Roman" w:hAnsi="Times New Roman"/>
+          <w:b/>
+          <w:bCs/>
+          <w:color w:val="0284C7"/>
+          <w:sz w:val="21"/>
+          <w:szCs w:val="21"/>
+        </w:rPr>
+        <w:t xml:space="preserve">• </w:t>
+      </w:r>
+      <w:r>
+        <w:rPr>
+          <w:rFonts w:ascii="Times New Roman" w:cs="Times New Roman" w:eastAsia="Times New Roman" w:hAnsi="Times New Roman"/>
+          <w:b/>
+          <w:bCs/>
+          <w:color w:val="0F172A"/>
+          <w:sz w:val="21"/>
+          <w:szCs w:val="21"/>
+        </w:rPr>
+        <w:t xml:space="preserve">Ghi nhận Kỷ luật: </w:t>
+      </w:r>
+      <w:r>
+        <w:rPr>
+          <w:rFonts w:ascii="Times New Roman" w:cs="Times New Roman" w:eastAsia="Times New Roman" w:hAnsi="Times New Roman"/>
+          <w:color w:val="334155"/>
+          <w:sz w:val="21"/>
+          <w:szCs w:val="21"/>
+        </w:rPr>
+        <w:t xml:space="preserve">Ghi nhận các biên bản vi phạm nội quy, đi muộn, vi phạm an toàn lao động kèm số tiền phạt -&gt; Tự động trừ vào cột Giảm trừ kỷ luật trên Bảng lương.</w:t>
+      </w:r>
+    </w:p>
+    <w:p>
+      <w:pPr>
+        <w:spacing w:after="80" w:before="160"/>
+      </w:pPr>
+      <w:r>
+        <w:rPr>
+          <w:rFonts w:ascii="Times New Roman" w:cs="Times New Roman" w:eastAsia="Times New Roman" w:hAnsi="Times New Roman"/>
+          <w:b/>
+          <w:bCs/>
+          <w:color w:val="0284C7"/>
+          <w:sz w:val="21"/>
+          <w:szCs w:val="21"/>
+        </w:rPr>
+        <w:t xml:space="preserve">8. 🌳 SƠ ĐỒ TỔ CHỨC ĐỘNG &amp; DANH BẠ CÔNG TY (/settings/departments-positions, /employees)</w:t>
+      </w:r>
+    </w:p>
+    <w:p>
+      <w:pPr>
+        <w:spacing w:after="40" w:before="40"/>
+      </w:pPr>
+      <w:r>
+        <w:rPr>
+          <w:rFonts w:ascii="Times New Roman" w:cs="Times New Roman" w:eastAsia="Times New Roman" w:hAnsi="Times New Roman"/>
+          <w:b/>
+          <w:bCs/>
+          <w:color w:val="0284C7"/>
+          <w:sz w:val="21"/>
+          <w:szCs w:val="21"/>
+        </w:rPr>
+        <w:t xml:space="preserve">• </w:t>
+      </w:r>
+      <w:r>
+        <w:rPr>
+          <w:rFonts w:ascii="Times New Roman" w:cs="Times New Roman" w:eastAsia="Times New Roman" w:hAnsi="Times New Roman"/>
+          <w:b/>
+          <w:bCs/>
+          <w:color w:val="0F172A"/>
+          <w:sz w:val="21"/>
+          <w:szCs w:val="21"/>
+        </w:rPr>
+        <w:t xml:space="preserve">Trực quan hóa bộ máy: </w:t>
+      </w:r>
+      <w:r>
+        <w:rPr>
+          <w:rFonts w:ascii="Times New Roman" w:cs="Times New Roman" w:eastAsia="Times New Roman" w:hAnsi="Times New Roman"/>
+          <w:color w:val="334155"/>
+          <w:sz w:val="21"/>
+          <w:szCs w:val="21"/>
+        </w:rPr>
+        <w:t xml:space="preserve">Hiển thị cây phả hệ tổ chức toàn diện từ Ban Giám Đốc -&gt; Khối Văn phòng, Kho Cần Thơ, Kho Mỹ Tho, Xưởng Nệm, Xưởng Gối, Phòng Kinh doanh, Phòng Marketing.</w:t>
+      </w:r>
+    </w:p>
+    <w:p>
+      <w:pPr>
+        <w:spacing w:after="40" w:before="40"/>
+      </w:pPr>
+      <w:r>
+        <w:rPr>
+          <w:rFonts w:ascii="Times New Roman" w:cs="Times New Roman" w:eastAsia="Times New Roman" w:hAnsi="Times New Roman"/>
+          <w:b/>
+          <w:bCs/>
+          <w:color w:val="0284C7"/>
+          <w:sz w:val="21"/>
+          <w:szCs w:val="21"/>
+        </w:rPr>
+        <w:t xml:space="preserve">• </w:t>
+      </w:r>
+      <w:r>
+        <w:rPr>
+          <w:rFonts w:ascii="Times New Roman" w:cs="Times New Roman" w:eastAsia="Times New Roman" w:hAnsi="Times New Roman"/>
+          <w:b/>
+          <w:bCs/>
+          <w:color w:val="0F172A"/>
+          <w:sz w:val="21"/>
+          <w:szCs w:val="21"/>
+        </w:rPr>
+        <w:t xml:space="preserve">Cơ cấu nhân sự: </w:t>
+      </w:r>
+      <w:r>
+        <w:rPr>
+          <w:rFonts w:ascii="Times New Roman" w:cs="Times New Roman" w:eastAsia="Times New Roman" w:hAnsi="Times New Roman"/>
+          <w:color w:val="334155"/>
+          <w:sz w:val="21"/>
+          <w:szCs w:val="21"/>
+        </w:rPr>
+        <w:t xml:space="preserve">Xem nhanh số lượng nhân sự, danh sách chức danh và nhân viên trực thuộc từng phòng ban theo thời gian thực.</w:t>
       </w:r>
     </w:p>
     <w:p>

</xml_diff>

<commit_message>
feat: enforce strict Level 3 employee permissions (forbid KPI viewing and employee listing)
</commit_message>
<xml_diff>
--- a/HO_SO_BAN_GIAO_VA_HUONG_DAN_SU_DUNG_HRM_VIET_A.docx
+++ b/HO_SO_BAN_GIAO_VA_HUONG_DAN_SU_DUNG_HRM_VIET_A.docx
@@ -807,12 +807,13 @@
                 <w:sz w:val="19"/>
                 <w:szCs w:val="19"/>
               </w:rPr>
-              <w:t xml:space="preserve">✓ Xem thông tin hồ sơ của chính mình
+              <w:t xml:space="preserve">✓ Xem thông tin hồ sơ của chính mình (Profile)
 ✓ Xem lịch sử chấm công &amp; ngày phép cá nhân
-✓ Xem chỉ tiêu KPI &amp; kết quả đánh giá của mình
 ✓ XEM DUY NHẤT PHIẾU LƯƠNG CÁ NHÂN
-✓ Xem Sơ đồ tổ chức &amp; Danh bạ công ty
-✓ Xem Văn bản, quy định &amp; đào tạo nội bộ
+✓ Xem Sơ đồ tổ chức
+✓ Xem Văn bản, quy định &amp; tài sản được cấp
+🔒 TUYỆT ĐỐI KHÔNG xem KPI (của mình &amp; người khác)
+🔒 KHÔNG xem danh sách nhân viên trong công ty
 🔒 ẨN 100% MỨC LƯƠNG CỦA TẤT CẢ NGƯỜI KHÁC</w:t>
             </w:r>
           </w:p>

</xml_diff>

<commit_message>
docs: enrich master handover doc with 16 module detailed specifications
</commit_message>
<xml_diff>
--- a/HO_SO_BAN_GIAO_VA_HUONG_DAN_SU_DUNG_HRM_VIET_A.docx
+++ b/HO_SO_BAN_GIAO_VA_HUONG_DAN_SU_DUNG_HRM_VIET_A.docx
@@ -50,12 +50,12 @@
           <w:sz w:val="28"/>
           <w:szCs w:val="28"/>
         </w:rPr>
-        <w:t xml:space="preserve">HỒ SƠ BÀN GIAO TOÀN DIỆN, MA TRẬN PHÂN QUYỀN, DANH SÁCH TÀI KHOẢN &amp; HƯỚNG DẪN NGHIỆM THU</w:t>
+        <w:t xml:space="preserve">HỒ SƠ BÀN GIAO TOÀN DIỆN, CHI TIẾT TỪNG PHÂN HỆ TÍNH NĂNG, MA TRẬN PHÂN QUYỀN &amp; DANH SÁCH TÀI KHOẢN</w:t>
       </w:r>
     </w:p>
     <w:p>
       <w:pPr>
-        <w:spacing w:after="120" w:before="260"/>
+        <w:spacing w:after="120" w:before="280"/>
       </w:pPr>
       <w:r>
         <w:rPr>
@@ -282,12 +282,12 @@
           <w:sz w:val="21"/>
           <w:szCs w:val="21"/>
         </w:rPr>
-        <w:t xml:space="preserve">Mỗi người có 1 mật khẩu riêng biệt (chữ HOA + chữ thường + số + ký tự đặc biệt). Không thể đoán mật khẩu của nhau.</w:t>
+        <w:t xml:space="preserve">Mỗi người có 1 mật khẩu riêng biệt (chữ HOA + chữ thường + số + ký tự đặc biệt). Đã mã hóa Bcrypt 10 rounds, chống rò rỉ và đoán mật khẩu.</w:t>
       </w:r>
     </w:p>
     <w:p>
       <w:pPr>
-        <w:spacing w:after="120" w:before="260"/>
+        <w:spacing w:after="120" w:before="280"/>
       </w:pPr>
       <w:r>
         <w:rPr>
@@ -546,7 +546,8 @@
 ✓ Xem bảng chấm công toàn công ty
 ✓ Xem toàn bộ điểm KPI các phòng ban
 ✓ Xem 100% BẢNG LƯƠNG TOÀN CÔNG TY
-✓ Xem báo cáo thống kê &amp; nhật ký audit log</w:t>
+✓ Xem báo cáo thống kê &amp; nhật ký audit log
+✓ Xem toàn bộ tài sản, văn bản, hòm thư</w:t>
             </w:r>
           </w:p>
         </w:tc>
@@ -580,6 +581,8 @@
 ✓ Phê duyệt đơn nghỉ phép / OT toàn cty
 ✓ Thiết lập chỉ tiêu &amp; chốt điểm KPI tháng
 ✓ TÍNH TOÁN, KHÓA &amp; XUẤT BẢNG LƯƠNG
+✓ Ban hành Khen thưởng, Kỷ luật
+✓ Thẩm định &amp; duyệt thưởng Sáng kiến
 ✓ Quản trị tài khoản, phân quyền &amp; sao lưu</w:t>
             </w:r>
           </w:p>
@@ -649,7 +652,8 @@
 - Tấn Hưng (Kinh doanh)
 - Thái Cần (Xưởng gối)
 - Minh Lý (Xưởng nệm)
-- Bảo Châu (Kế toán xưởng)</w:t>
+- Bảo Châu (Kế toán xưởng)
+(Khối VP do Huỳnh Thị Trúc Xinh quản lý)</w:t>
             </w:r>
           </w:p>
         </w:tc>
@@ -683,6 +687,7 @@
 ✓ Xem chi tiết KPI nhân viên phòng mình
 ✓ XEM BẢNG LƯƠNG NHÂN VIÊN PHÒNG MÌNH
 ✓ Xem phiếu lương cá nhân của chính mình
+✓ Xem Sơ đồ tổ chức, Tài sản, Văn bản
 🔒 TUYỆT ĐỐI KHÔNG xem lương Ban Giám Đốc
 🔒 KHÔNG xem lương phòng ban khác</w:t>
             </w:r>
@@ -714,10 +719,11 @@
                 <w:szCs w:val="19"/>
               </w:rPr>
               <w:t xml:space="preserve">✓ Điểm danh &amp; chấm công nhân viên phòng mình
-✓ Phê duyệt đơn xin nghỉ phép / OT của cấp dưới
-✓ Chấm điểm &amp; đánh giá % KPI tháng của nhân viên
-✓ Đề xuất khen thưởng / kỷ luật cho nhân viên
-✓ Tạo yêu cầu cấp phát &amp; báo hỏng tài sản phòng</w:t>
+✓ Phê duyệt đơn xin nghỉ phép / OT cấp dưới
+✓ Chấm điểm &amp; đánh giá % KPI tháng nhân viên
+✓ Đề xuất khen thưởng / kỷ luật nhân viên phòng
+✓ Tạo yêu cầu cấp phát &amp; báo hỏng tài sản phòng
+✓ Gửi sáng kiến cải tiến &amp; đóng góp ý kiến</w:t>
             </w:r>
           </w:p>
         </w:tc>
@@ -810,10 +816,11 @@
               <w:t xml:space="preserve">✓ Xem thông tin hồ sơ của chính mình (Profile)
 ✓ Xem lịch sử chấm công &amp; ngày phép cá nhân
 ✓ XEM DUY NHẤT PHIẾU LƯƠNG CÁ NHÂN
-✓ Xem Sơ đồ tổ chức
-✓ Xem Văn bản, quy định &amp; tài sản được cấp
-🔒 TUYỆT ĐỐI KHÔNG xem KPI (của mình &amp; người khác)
-🔒 KHÔNG xem danh sách nhân viên trong công ty
+✓ Xem Sơ đồ tổ chức công ty
+✓ Xem Văn bản, quy định &amp; tài sản được giao
+✓ Xem danh sách sáng kiến công khai
+🔒 TUYỆT ĐỐI KHÔNG XEM KPI (của mình &amp; người khác - ẩn menu KPI)
+🔒 KHÔNG XEM DANH SÁCH NHÂN VIÊN (ẩn menu Hồ sơ)
 🔒 ẨN 100% MỨC LƯƠNG CỦA TẤT CẢ NGƯỜI KHÁC</w:t>
             </w:r>
           </w:p>
@@ -844,8 +851,8 @@
                 <w:szCs w:val="19"/>
               </w:rPr>
               <w:t xml:space="preserve">✓ Thực hiện điểm danh chấm công hàng ngày
-✓ Gửi đơn xin nghỉ phép, đi muộn, làm thêm giờ
-✓ Gửi ý kiến đề xuất tại Hòm thư &amp; Sáng kiến
+✓ GỬI ĐƠN CÁ NHÂN: Xin nghỉ phép năm, nghỉ không lương, nghỉ ốm, đi muộn, tăng ca OT, giải trình công
+✓ GỬI HÒM THƯ &amp; SÁNG KIẾN: Hiến kế cải tiến sản xuất, đóng góp ý kiến (có tùy chọn ẨN DANH)
 ✓ Báo hỏng công cụ dụng cụ / tài sản được giao
 ✓ Tự đổi mật khẩu tài khoản cá nhân</w:t>
             </w:r>
@@ -855,7 +862,7 @@
     </w:tbl>
     <w:p>
       <w:pPr>
-        <w:spacing w:after="120" w:before="260"/>
+        <w:spacing w:after="120" w:before="280"/>
       </w:pPr>
       <w:r>
         <w:rPr>
@@ -866,23 +873,23 @@
           <w:sz w:val="24"/>
           <w:szCs w:val="24"/>
         </w:rPr>
-        <w:t xml:space="preserve">PHẦN III: HƯỚNG DẪN SỬ DỤNG VÀ VẬN HÀNH NGHIỆP VỤ CHO PHÒNG HCNS</w:t>
+        <w:t xml:space="preserve">PHẦN III: HƯỚNG DẪN CHI TIẾT 16 PHÂN HỆ TÍNH NĂNG CỦA ỨNG DỤNG</w:t>
       </w:r>
     </w:p>
     <w:p>
       <w:pPr>
-        <w:spacing w:after="80" w:before="160"/>
+        <w:spacing w:after="80" w:before="180"/>
       </w:pPr>
       <w:r>
         <w:rPr>
           <w:rFonts w:ascii="Times New Roman" w:cs="Times New Roman" w:eastAsia="Times New Roman" w:hAnsi="Times New Roman"/>
           <w:b/>
           <w:bCs/>
-          <w:color w:val="0284C7"/>
+          <w:color w:val="1E3A8A"/>
           <w:sz w:val="21"/>
           <w:szCs w:val="21"/>
         </w:rPr>
-        <w:t xml:space="preserve">1. QUẢN LÝ HỒ SƠ NHÂN SỰ &amp; TỰ ĐỘNG IN HỢP ĐỒNG LAO ĐỘNG (/employees, /contracts)</w:t>
+        <w:t xml:space="preserve">1. BÀN LÀM VIỆC TỔNG QUAN (DASHBOARD - /)</w:t>
       </w:r>
     </w:p>
     <w:p>
@@ -909,7 +916,7 @@
           <w:sz w:val="21"/>
           <w:szCs w:val="21"/>
         </w:rPr>
-        <w:t xml:space="preserve">Hồ sơ nhân sự (/employees): </w:t>
+        <w:t xml:space="preserve">Thống kê thời gian thực: </w:t>
       </w:r>
       <w:r>
         <w:rPr>
@@ -918,7 +925,7 @@
           <w:sz w:val="21"/>
           <w:szCs w:val="21"/>
         </w:rPr>
-        <w:t xml:space="preserve">Theo dõi danh sách 57 nhân sự, lọc theo 11 phòng ban, cập nhật thông tin cá nhân, CCCD, ngày sinh, chức danh và mức lương ngạch bậc chuẩn.</w:t>
+        <w:t xml:space="preserve">Hiển thị tổng số 57 nhân sự, tỷ lệ đi làm hôm nay, số lượng nhân sự vắng mặt/nghỉ phép, cảnh báo hợp đồng sắp hết hạn trong 30 ngày và danh sách sinh nhật trong tháng.</w:t>
       </w:r>
     </w:p>
     <w:p>
@@ -945,7 +952,7 @@
           <w:sz w:val="21"/>
           <w:szCs w:val="21"/>
         </w:rPr>
-        <w:t xml:space="preserve">📄 Tự động in Hợp đồng lao động chuẩn (/contracts): </w:t>
+        <w:t xml:space="preserve">Phím tắt tác vụ nhanh: </w:t>
       </w:r>
       <w:r>
         <w:rPr>
@@ -954,12 +961,12 @@
           <w:sz w:val="21"/>
           <w:szCs w:val="21"/>
         </w:rPr>
-        <w:t xml:space="preserve">Vào menu 'Hợp đồng lao động' hoặc chọn nhân viên cụ thể -&gt; Bấm 'In Hợp đồng'. Hệ thống tự động trích xuất đầy đủ thông tin: Họ tên, CMND/CCCD, địa chỉ, ngạch bậc lương, phụ cấp, người đại diện theo pháp luật và xuất ra file Word (.docx) hoặc in trực tiếp PDF chuẩn theo quy chế lao động công ty.</w:t>
+        <w:t xml:space="preserve">Hỗ trợ nút bấm nhanh: Chấm công, Nộp đơn nghỉ phép, Xem bảng lương, Tra cứu phiếu lương cá nhân.</w:t>
       </w:r>
     </w:p>
     <w:p>
       <w:pPr>
-        <w:spacing w:after="80" w:before="160"/>
+        <w:spacing w:after="40" w:before="40"/>
       </w:pPr>
       <w:r>
         <w:rPr>
@@ -970,7 +977,451 @@
           <w:sz w:val="21"/>
           <w:szCs w:val="21"/>
         </w:rPr>
-        <w:t xml:space="preserve">2. CHẤM CÔNG, QUẢN LÝ NGHỈ PHÉP &amp; LÀM THÊM GIỜ (/attendance)</w:t>
+        <w:t xml:space="preserve">• </w:t>
+      </w:r>
+      <w:r>
+        <w:rPr>
+          <w:rFonts w:ascii="Times New Roman" w:cs="Times New Roman" w:eastAsia="Times New Roman" w:hAnsi="Times New Roman"/>
+          <w:b/>
+          <w:bCs/>
+          <w:color w:val="0F172A"/>
+          <w:sz w:val="21"/>
+          <w:szCs w:val="21"/>
+        </w:rPr>
+        <w:t xml:space="preserve">Phân quyền áp dụng: </w:t>
+      </w:r>
+      <w:r>
+        <w:rPr>
+          <w:rFonts w:ascii="Times New Roman" w:cs="Times New Roman" w:eastAsia="Times New Roman" w:hAnsi="Times New Roman"/>
+          <w:color w:val="334155"/>
+          <w:sz w:val="21"/>
+          <w:szCs w:val="21"/>
+        </w:rPr>
+        <w:t xml:space="preserve">Cấp 1 - Admin (Xem toàn công ty), Cấp 2 - Manager (Xem số liệu phòng ban mình), Cấp 3 - Employee (Xem tổng quan cá nhân).</w:t>
+      </w:r>
+    </w:p>
+    <w:p>
+      <w:pPr>
+        <w:spacing w:after="80" w:before="180"/>
+      </w:pPr>
+      <w:r>
+        <w:rPr>
+          <w:rFonts w:ascii="Times New Roman" w:cs="Times New Roman" w:eastAsia="Times New Roman" w:hAnsi="Times New Roman"/>
+          <w:b/>
+          <w:bCs/>
+          <w:color w:val="1E3A8A"/>
+          <w:sz w:val="21"/>
+          <w:szCs w:val="21"/>
+        </w:rPr>
+        <w:t xml:space="preserve">2. SƠ ĐỒ TỔ CHỨC ĐỘNG &amp; BỘ MÁY DOANH NGHIỆP (/settings/departments-positions)</w:t>
+      </w:r>
+    </w:p>
+    <w:p>
+      <w:pPr>
+        <w:spacing w:after="40" w:before="40"/>
+      </w:pPr>
+      <w:r>
+        <w:rPr>
+          <w:rFonts w:ascii="Times New Roman" w:cs="Times New Roman" w:eastAsia="Times New Roman" w:hAnsi="Times New Roman"/>
+          <w:b/>
+          <w:bCs/>
+          <w:color w:val="0284C7"/>
+          <w:sz w:val="21"/>
+          <w:szCs w:val="21"/>
+        </w:rPr>
+        <w:t xml:space="preserve">• </w:t>
+      </w:r>
+      <w:r>
+        <w:rPr>
+          <w:rFonts w:ascii="Times New Roman" w:cs="Times New Roman" w:eastAsia="Times New Roman" w:hAnsi="Times New Roman"/>
+          <w:b/>
+          <w:bCs/>
+          <w:color w:val="0F172A"/>
+          <w:sz w:val="21"/>
+          <w:szCs w:val="21"/>
+        </w:rPr>
+        <w:t xml:space="preserve">Cơ cấu cây tổ chức: </w:t>
+      </w:r>
+      <w:r>
+        <w:rPr>
+          <w:rFonts w:ascii="Times New Roman" w:cs="Times New Roman" w:eastAsia="Times New Roman" w:hAnsi="Times New Roman"/>
+          <w:color w:val="334155"/>
+          <w:sz w:val="21"/>
+          <w:szCs w:val="21"/>
+        </w:rPr>
+        <w:t xml:space="preserve">Trực quan hóa bộ máy doanh nghiệp từ Ban Giám Đốc -&gt; 11 Đơn vị (Khối Văn phòng, Kho Cần Thơ, Kho Mỹ Tho, Xưởng Nệm, Xưởng Gối, Kinh doanh, Marketing, Kế toán, R&amp;D, Giao hàng, Tạp vụ).</w:t>
+      </w:r>
+    </w:p>
+    <w:p>
+      <w:pPr>
+        <w:spacing w:after="40" w:before="40"/>
+      </w:pPr>
+      <w:r>
+        <w:rPr>
+          <w:rFonts w:ascii="Times New Roman" w:cs="Times New Roman" w:eastAsia="Times New Roman" w:hAnsi="Times New Roman"/>
+          <w:b/>
+          <w:bCs/>
+          <w:color w:val="0284C7"/>
+          <w:sz w:val="21"/>
+          <w:szCs w:val="21"/>
+        </w:rPr>
+        <w:t xml:space="preserve">• </w:t>
+      </w:r>
+      <w:r>
+        <w:rPr>
+          <w:rFonts w:ascii="Times New Roman" w:cs="Times New Roman" w:eastAsia="Times New Roman" w:hAnsi="Times New Roman"/>
+          <w:b/>
+          <w:bCs/>
+          <w:color w:val="0F172A"/>
+          <w:sz w:val="21"/>
+          <w:szCs w:val="21"/>
+        </w:rPr>
+        <w:t xml:space="preserve">Định biên &amp; Quản lý trực tiếp: </w:t>
+      </w:r>
+      <w:r>
+        <w:rPr>
+          <w:rFonts w:ascii="Times New Roman" w:cs="Times New Roman" w:eastAsia="Times New Roman" w:hAnsi="Times New Roman"/>
+          <w:color w:val="334155"/>
+          <w:sz w:val="21"/>
+          <w:szCs w:val="21"/>
+        </w:rPr>
+        <w:t xml:space="preserve">Hiển thị rõ chức danh, số lượng nhân sự trực thuộc và người quản lý trực tiếp (Manager ID) của từng bộ phận.</w:t>
+      </w:r>
+    </w:p>
+    <w:p>
+      <w:pPr>
+        <w:spacing w:after="40" w:before="40"/>
+      </w:pPr>
+      <w:r>
+        <w:rPr>
+          <w:rFonts w:ascii="Times New Roman" w:cs="Times New Roman" w:eastAsia="Times New Roman" w:hAnsi="Times New Roman"/>
+          <w:b/>
+          <w:bCs/>
+          <w:color w:val="0284C7"/>
+          <w:sz w:val="21"/>
+          <w:szCs w:val="21"/>
+        </w:rPr>
+        <w:t xml:space="preserve">• </w:t>
+      </w:r>
+      <w:r>
+        <w:rPr>
+          <w:rFonts w:ascii="Times New Roman" w:cs="Times New Roman" w:eastAsia="Times New Roman" w:hAnsi="Times New Roman"/>
+          <w:b/>
+          <w:bCs/>
+          <w:color w:val="0F172A"/>
+          <w:sz w:val="21"/>
+          <w:szCs w:val="21"/>
+        </w:rPr>
+        <w:t xml:space="preserve">Phân quyền áp dụng: </w:t>
+      </w:r>
+      <w:r>
+        <w:rPr>
+          <w:rFonts w:ascii="Times New Roman" w:cs="Times New Roman" w:eastAsia="Times New Roman" w:hAnsi="Times New Roman"/>
+          <w:color w:val="334155"/>
+          <w:sz w:val="21"/>
+          <w:szCs w:val="21"/>
+        </w:rPr>
+        <w:t xml:space="preserve">Tất cả 3 Cấp bậc (Admin, Manager, Employee) đều được xem để nắm rõ bộ máy công ty.</w:t>
+      </w:r>
+    </w:p>
+    <w:p>
+      <w:pPr>
+        <w:spacing w:after="80" w:before="180"/>
+      </w:pPr>
+      <w:r>
+        <w:rPr>
+          <w:rFonts w:ascii="Times New Roman" w:cs="Times New Roman" w:eastAsia="Times New Roman" w:hAnsi="Times New Roman"/>
+          <w:b/>
+          <w:bCs/>
+          <w:color w:val="1E3A8A"/>
+          <w:sz w:val="21"/>
+          <w:szCs w:val="21"/>
+        </w:rPr>
+        <w:t xml:space="preserve">3. QUẢN LÝ HỒ SƠ NHÂN VIÊN 360 ĐỘ (/employees)</w:t>
+      </w:r>
+    </w:p>
+    <w:p>
+      <w:pPr>
+        <w:spacing w:after="40" w:before="40"/>
+      </w:pPr>
+      <w:r>
+        <w:rPr>
+          <w:rFonts w:ascii="Times New Roman" w:cs="Times New Roman" w:eastAsia="Times New Roman" w:hAnsi="Times New Roman"/>
+          <w:b/>
+          <w:bCs/>
+          <w:color w:val="0284C7"/>
+          <w:sz w:val="21"/>
+          <w:szCs w:val="21"/>
+        </w:rPr>
+        <w:t xml:space="preserve">• </w:t>
+      </w:r>
+      <w:r>
+        <w:rPr>
+          <w:rFonts w:ascii="Times New Roman" w:cs="Times New Roman" w:eastAsia="Times New Roman" w:hAnsi="Times New Roman"/>
+          <w:b/>
+          <w:bCs/>
+          <w:color w:val="0F172A"/>
+          <w:sz w:val="21"/>
+          <w:szCs w:val="21"/>
+        </w:rPr>
+        <w:t xml:space="preserve">Hồ sơ điện tử toàn diện: </w:t>
+      </w:r>
+      <w:r>
+        <w:rPr>
+          <w:rFonts w:ascii="Times New Roman" w:cs="Times New Roman" w:eastAsia="Times New Roman" w:hAnsi="Times New Roman"/>
+          <w:color w:val="334155"/>
+          <w:sz w:val="21"/>
+          <w:szCs w:val="21"/>
+        </w:rPr>
+        <w:t xml:space="preserve">Lưu trữ đầy đủ Mã NV, Họ tên, Ngày sinh, CCCD/CMND, Quê quán, Địa chỉ, Số điện thoại, Email, Trình độ học vấn, Tài khoản ngân hàng chi trả lương.</w:t>
+      </w:r>
+    </w:p>
+    <w:p>
+      <w:pPr>
+        <w:spacing w:after="40" w:before="40"/>
+      </w:pPr>
+      <w:r>
+        <w:rPr>
+          <w:rFonts w:ascii="Times New Roman" w:cs="Times New Roman" w:eastAsia="Times New Roman" w:hAnsi="Times New Roman"/>
+          <w:b/>
+          <w:bCs/>
+          <w:color w:val="0284C7"/>
+          <w:sz w:val="21"/>
+          <w:szCs w:val="21"/>
+        </w:rPr>
+        <w:t xml:space="preserve">• </w:t>
+      </w:r>
+      <w:r>
+        <w:rPr>
+          <w:rFonts w:ascii="Times New Roman" w:cs="Times New Roman" w:eastAsia="Times New Roman" w:hAnsi="Times New Roman"/>
+          <w:b/>
+          <w:bCs/>
+          <w:color w:val="0F172A"/>
+          <w:sz w:val="21"/>
+          <w:szCs w:val="21"/>
+        </w:rPr>
+        <w:t xml:space="preserve">Thiết lập ngạch bậc lương &amp; Chế độ: </w:t>
+      </w:r>
+      <w:r>
+        <w:rPr>
+          <w:rFonts w:ascii="Times New Roman" w:cs="Times New Roman" w:eastAsia="Times New Roman" w:hAnsi="Times New Roman"/>
+          <w:color w:val="334155"/>
+          <w:sz w:val="21"/>
+          <w:szCs w:val="21"/>
+        </w:rPr>
+        <w:t xml:space="preserve">Quản lý Lương ngạch bậc, Lương đóng bảo hiểm xã hội, Phụ cấp trách nhiệm, Phụ cấp ăn trưa, Phụ cấp xăng xe điện thoại.</w:t>
+      </w:r>
+    </w:p>
+    <w:p>
+      <w:pPr>
+        <w:spacing w:after="40" w:before="40"/>
+      </w:pPr>
+      <w:r>
+        <w:rPr>
+          <w:rFonts w:ascii="Times New Roman" w:cs="Times New Roman" w:eastAsia="Times New Roman" w:hAnsi="Times New Roman"/>
+          <w:b/>
+          <w:bCs/>
+          <w:color w:val="0284C7"/>
+          <w:sz w:val="21"/>
+          <w:szCs w:val="21"/>
+        </w:rPr>
+        <w:t xml:space="preserve">• </w:t>
+      </w:r>
+      <w:r>
+        <w:rPr>
+          <w:rFonts w:ascii="Times New Roman" w:cs="Times New Roman" w:eastAsia="Times New Roman" w:hAnsi="Times New Roman"/>
+          <w:b/>
+          <w:bCs/>
+          <w:color w:val="0F172A"/>
+          <w:sz w:val="21"/>
+          <w:szCs w:val="21"/>
+        </w:rPr>
+        <w:t xml:space="preserve">🔒 Phân quyền nghiêm ngặt: </w:t>
+      </w:r>
+      <w:r>
+        <w:rPr>
+          <w:rFonts w:ascii="Times New Roman" w:cs="Times New Roman" w:eastAsia="Times New Roman" w:hAnsi="Times New Roman"/>
+          <w:color w:val="334155"/>
+          <w:sz w:val="21"/>
+          <w:szCs w:val="21"/>
+        </w:rPr>
+        <w:t xml:space="preserve">Chỉ Cấp 1 (Admin) và Cấp 2 (Manager xem phòng mình); Cấp 3 (Employee) BỊ ẨN HOÀN TOÀN MENU để bảo mật danh bạ nội bộ.</w:t>
+      </w:r>
+    </w:p>
+    <w:p>
+      <w:pPr>
+        <w:spacing w:after="80" w:before="180"/>
+      </w:pPr>
+      <w:r>
+        <w:rPr>
+          <w:rFonts w:ascii="Times New Roman" w:cs="Times New Roman" w:eastAsia="Times New Roman" w:hAnsi="Times New Roman"/>
+          <w:b/>
+          <w:bCs/>
+          <w:color w:val="1E3A8A"/>
+          <w:sz w:val="21"/>
+          <w:szCs w:val="21"/>
+        </w:rPr>
+        <w:t xml:space="preserve">4. HỢP ĐỒNG LAO ĐỘNG &amp; TỰ ĐỘNG IN WORD/PDF (/contracts)</w:t>
+      </w:r>
+    </w:p>
+    <w:p>
+      <w:pPr>
+        <w:spacing w:after="40" w:before="40"/>
+      </w:pPr>
+      <w:r>
+        <w:rPr>
+          <w:rFonts w:ascii="Times New Roman" w:cs="Times New Roman" w:eastAsia="Times New Roman" w:hAnsi="Times New Roman"/>
+          <w:b/>
+          <w:bCs/>
+          <w:color w:val="0284C7"/>
+          <w:sz w:val="21"/>
+          <w:szCs w:val="21"/>
+        </w:rPr>
+        <w:t xml:space="preserve">• </w:t>
+      </w:r>
+      <w:r>
+        <w:rPr>
+          <w:rFonts w:ascii="Times New Roman" w:cs="Times New Roman" w:eastAsia="Times New Roman" w:hAnsi="Times New Roman"/>
+          <w:b/>
+          <w:bCs/>
+          <w:color w:val="0F172A"/>
+          <w:sz w:val="21"/>
+          <w:szCs w:val="21"/>
+        </w:rPr>
+        <w:t xml:space="preserve">Quản lý vòng đời hợp đồng: </w:t>
+      </w:r>
+      <w:r>
+        <w:rPr>
+          <w:rFonts w:ascii="Times New Roman" w:cs="Times New Roman" w:eastAsia="Times New Roman" w:hAnsi="Times New Roman"/>
+          <w:color w:val="334155"/>
+          <w:sz w:val="21"/>
+          <w:szCs w:val="21"/>
+        </w:rPr>
+        <w:t xml:space="preserve">Quản lý HĐ Thử việc, HĐ xác định thời hạn (12 tháng, 24 tháng), HĐ không xác định thời hạn, cảnh báo tự động trước khi hết hạn 30 ngày.</w:t>
+      </w:r>
+    </w:p>
+    <w:p>
+      <w:pPr>
+        <w:spacing w:after="40" w:before="40"/>
+      </w:pPr>
+      <w:r>
+        <w:rPr>
+          <w:rFonts w:ascii="Times New Roman" w:cs="Times New Roman" w:eastAsia="Times New Roman" w:hAnsi="Times New Roman"/>
+          <w:b/>
+          <w:bCs/>
+          <w:color w:val="0284C7"/>
+          <w:sz w:val="21"/>
+          <w:szCs w:val="21"/>
+        </w:rPr>
+        <w:t xml:space="preserve">• </w:t>
+      </w:r>
+      <w:r>
+        <w:rPr>
+          <w:rFonts w:ascii="Times New Roman" w:cs="Times New Roman" w:eastAsia="Times New Roman" w:hAnsi="Times New Roman"/>
+          <w:b/>
+          <w:bCs/>
+          <w:color w:val="0F172A"/>
+          <w:sz w:val="21"/>
+          <w:szCs w:val="21"/>
+        </w:rPr>
+        <w:t xml:space="preserve">📄 In hợp đồng 1 chạm: </w:t>
+      </w:r>
+      <w:r>
+        <w:rPr>
+          <w:rFonts w:ascii="Times New Roman" w:cs="Times New Roman" w:eastAsia="Times New Roman" w:hAnsi="Times New Roman"/>
+          <w:color w:val="334155"/>
+          <w:sz w:val="21"/>
+          <w:szCs w:val="21"/>
+        </w:rPr>
+        <w:t xml:space="preserve">Bấm nút 'In Hợp đồng' -&gt; Hệ thống tự động trích xuất thông tin người lao động và đại diện pháp luật, xuất ngay file Word (.docx) hoặc PDF chuẩn quy chế công ty Nệm Việt Á.</w:t>
+      </w:r>
+    </w:p>
+    <w:p>
+      <w:pPr>
+        <w:spacing w:after="40" w:before="40"/>
+      </w:pPr>
+      <w:r>
+        <w:rPr>
+          <w:rFonts w:ascii="Times New Roman" w:cs="Times New Roman" w:eastAsia="Times New Roman" w:hAnsi="Times New Roman"/>
+          <w:b/>
+          <w:bCs/>
+          <w:color w:val="0284C7"/>
+          <w:sz w:val="21"/>
+          <w:szCs w:val="21"/>
+        </w:rPr>
+        <w:t xml:space="preserve">• </w:t>
+      </w:r>
+      <w:r>
+        <w:rPr>
+          <w:rFonts w:ascii="Times New Roman" w:cs="Times New Roman" w:eastAsia="Times New Roman" w:hAnsi="Times New Roman"/>
+          <w:b/>
+          <w:bCs/>
+          <w:color w:val="0F172A"/>
+          <w:sz w:val="21"/>
+          <w:szCs w:val="21"/>
+        </w:rPr>
+        <w:t xml:space="preserve">Phân quyền áp dụng: </w:t>
+      </w:r>
+      <w:r>
+        <w:rPr>
+          <w:rFonts w:ascii="Times New Roman" w:cs="Times New Roman" w:eastAsia="Times New Roman" w:hAnsi="Times New Roman"/>
+          <w:color w:val="334155"/>
+          <w:sz w:val="21"/>
+          <w:szCs w:val="21"/>
+        </w:rPr>
+        <w:t xml:space="preserve">Chỉ Cấp 1 - Admin và Cấp 2 - Manager.</w:t>
+      </w:r>
+    </w:p>
+    <w:p>
+      <w:pPr>
+        <w:spacing w:after="80" w:before="180"/>
+      </w:pPr>
+      <w:r>
+        <w:rPr>
+          <w:rFonts w:ascii="Times New Roman" w:cs="Times New Roman" w:eastAsia="Times New Roman" w:hAnsi="Times New Roman"/>
+          <w:b/>
+          <w:bCs/>
+          <w:color w:val="1E3A8A"/>
+          <w:sz w:val="21"/>
+          <w:szCs w:val="21"/>
+        </w:rPr>
+        <w:t xml:space="preserve">5. CHẤM CÔNG &amp; ĐIỂM DANH HÀNG NGÀY (/attendance)</w:t>
+      </w:r>
+    </w:p>
+    <w:p>
+      <w:pPr>
+        <w:spacing w:after="40" w:before="40"/>
+      </w:pPr>
+      <w:r>
+        <w:rPr>
+          <w:rFonts w:ascii="Times New Roman" w:cs="Times New Roman" w:eastAsia="Times New Roman" w:hAnsi="Times New Roman"/>
+          <w:b/>
+          <w:bCs/>
+          <w:color w:val="0284C7"/>
+          <w:sz w:val="21"/>
+          <w:szCs w:val="21"/>
+        </w:rPr>
+        <w:t xml:space="preserve">• </w:t>
+      </w:r>
+      <w:r>
+        <w:rPr>
+          <w:rFonts w:ascii="Times New Roman" w:cs="Times New Roman" w:eastAsia="Times New Roman" w:hAnsi="Times New Roman"/>
+          <w:b/>
+          <w:bCs/>
+          <w:color w:val="0F172A"/>
+          <w:sz w:val="21"/>
+          <w:szCs w:val="21"/>
+        </w:rPr>
+        <w:t xml:space="preserve">Điểm danh trực tuyến: </w:t>
+      </w:r>
+      <w:r>
+        <w:rPr>
+          <w:rFonts w:ascii="Times New Roman" w:cs="Times New Roman" w:eastAsia="Times New Roman" w:hAnsi="Times New Roman"/>
+          <w:color w:val="334155"/>
+          <w:sz w:val="21"/>
+          <w:szCs w:val="21"/>
+        </w:rPr>
+        <w:t xml:space="preserve">Nhân viên bấm Check-in / Check-out hàng ngày, hệ thống tự động ghi nhận giờ vào, giờ ra, số phút đi muộn / về sớm.</w:t>
       </w:r>
     </w:p>
     <w:p>
@@ -1006,7 +1457,7 @@
           <w:sz w:val="21"/>
           <w:szCs w:val="21"/>
         </w:rPr>
-        <w:t xml:space="preserve">Theo dõi dữ liệu 26 ngày công chuẩn theo từng tháng, tự động tính số ngày làm việc thực tế, số ngày nghỉ phép năm, nghỉ không lương, giờ đi muộn/về sớm.</w:t>
+        <w:t xml:space="preserve">Theo dõi dữ liệu 26 ngày công chuẩn theo từng tháng, tự động tính số ngày làm việc thực tế, số ngày nghỉ phép năm, nghỉ không lương.</w:t>
       </w:r>
     </w:p>
     <w:p>
@@ -1033,7 +1484,7 @@
           <w:sz w:val="21"/>
           <w:szCs w:val="21"/>
         </w:rPr>
-        <w:t xml:space="preserve">Phê duyệt đơn từ trực tuyến: </w:t>
+        <w:t xml:space="preserve">Theo dõi làm thêm giờ (OT): </w:t>
       </w:r>
       <w:r>
         <w:rPr>
@@ -1042,7 +1493,7 @@
           <w:sz w:val="21"/>
           <w:szCs w:val="21"/>
         </w:rPr>
-        <w:t xml:space="preserve">Vào tab 'Đơn xin nghỉ phép / Đi muộn / OT' -&gt; Quản lý hoặc HCNS bấm Duyệt (Approve) hoặc Từ chối (Reject) kèm lý do phản hồi cho nhân viên.</w:t>
+        <w:t xml:space="preserve">Ghi nhận chính xác số giờ tăng ca ngày thường (hệ số x1.5), tăng ca chủ nhật (x2.0) và ngày lễ (x3.0) để đồng bộ sang bảng lương.</w:t>
       </w:r>
     </w:p>
     <w:p>
@@ -1069,7 +1520,7 @@
           <w:sz w:val="21"/>
           <w:szCs w:val="21"/>
         </w:rPr>
-        <w:t xml:space="preserve">Chốt công tháng: </w:t>
+        <w:t xml:space="preserve">Phân quyền áp dụng: </w:t>
       </w:r>
       <w:r>
         <w:rPr>
@@ -1078,235 +1529,23 @@
           <w:sz w:val="21"/>
           <w:szCs w:val="21"/>
         </w:rPr>
-        <w:t xml:space="preserve">Bấm nút 'Đồng bộ bảng công' trước khi tính lương để tự động chuyển số ngày công thực tế và giờ OT sang phân hệ Tính lương.</w:t>
+        <w:t xml:space="preserve">Tất cả nhân sự (Admin xem toàn bộ; Manager xem &amp; chấm công phòng mình; Employee xem lịch sử cá nhân).</w:t>
       </w:r>
     </w:p>
     <w:p>
       <w:pPr>
-        <w:spacing w:after="80" w:before="160"/>
+        <w:spacing w:after="80" w:before="180"/>
       </w:pPr>
       <w:r>
         <w:rPr>
           <w:rFonts w:ascii="Times New Roman" w:cs="Times New Roman" w:eastAsia="Times New Roman" w:hAnsi="Times New Roman"/>
           <w:b/>
           <w:bCs/>
-          <w:color w:val="0284C7"/>
+          <w:color w:val="1E3A8A"/>
           <w:sz w:val="21"/>
           <w:szCs w:val="21"/>
         </w:rPr>
-        <w:t xml:space="preserve">3. QUẢN LÝ KPI &amp; ĐÁNH GIÁ THÁNG (/kpi)</w:t>
-      </w:r>
-    </w:p>
-    <w:p>
-      <w:pPr>
-        <w:spacing w:after="40" w:before="40"/>
-      </w:pPr>
-      <w:r>
-        <w:rPr>
-          <w:rFonts w:ascii="Times New Roman" w:cs="Times New Roman" w:eastAsia="Times New Roman" w:hAnsi="Times New Roman"/>
-          <w:b/>
-          <w:bCs/>
-          <w:color w:val="0284C7"/>
-          <w:sz w:val="21"/>
-          <w:szCs w:val="21"/>
-        </w:rPr>
-        <w:t xml:space="preserve">• </w:t>
-      </w:r>
-      <w:r>
-        <w:rPr>
-          <w:rFonts w:ascii="Times New Roman" w:cs="Times New Roman" w:eastAsia="Times New Roman" w:hAnsi="Times New Roman"/>
-          <w:b/>
-          <w:bCs/>
-          <w:color w:val="0F172A"/>
-          <w:sz w:val="21"/>
-          <w:szCs w:val="21"/>
-        </w:rPr>
-        <w:t xml:space="preserve">Thiết lập hạn mức KPI: </w:t>
-      </w:r>
-      <w:r>
-        <w:rPr>
-          <w:rFonts w:ascii="Times New Roman" w:cs="Times New Roman" w:eastAsia="Times New Roman" w:hAnsi="Times New Roman"/>
-          <w:color w:val="334155"/>
-          <w:sz w:val="21"/>
-          <w:szCs w:val="21"/>
-        </w:rPr>
-        <w:t xml:space="preserve">Chọn tháng/năm cần đánh giá (ví dụ: Tháng 08/2026), thiết lập mức thưởng trách nhiệm định mức theo chức danh (1.000.000đ, 2.000.000đ,...).</w:t>
-      </w:r>
-    </w:p>
-    <w:p>
-      <w:pPr>
-        <w:spacing w:after="40" w:before="40"/>
-      </w:pPr>
-      <w:r>
-        <w:rPr>
-          <w:rFonts w:ascii="Times New Roman" w:cs="Times New Roman" w:eastAsia="Times New Roman" w:hAnsi="Times New Roman"/>
-          <w:b/>
-          <w:bCs/>
-          <w:color w:val="0284C7"/>
-          <w:sz w:val="21"/>
-          <w:szCs w:val="21"/>
-        </w:rPr>
-        <w:t xml:space="preserve">• </w:t>
-      </w:r>
-      <w:r>
-        <w:rPr>
-          <w:rFonts w:ascii="Times New Roman" w:cs="Times New Roman" w:eastAsia="Times New Roman" w:hAnsi="Times New Roman"/>
-          <w:b/>
-          <w:bCs/>
-          <w:color w:val="0F172A"/>
-          <w:sz w:val="21"/>
-          <w:szCs w:val="21"/>
-        </w:rPr>
-        <w:t xml:space="preserve">Chấm điểm &amp; Tự động tính tiền: </w:t>
-      </w:r>
-      <w:r>
-        <w:rPr>
-          <w:rFonts w:ascii="Times New Roman" w:cs="Times New Roman" w:eastAsia="Times New Roman" w:hAnsi="Times New Roman"/>
-          <w:color w:val="334155"/>
-          <w:sz w:val="21"/>
-          <w:szCs w:val="21"/>
-        </w:rPr>
-        <w:t xml:space="preserve">Trưởng phòng hoặc HCNS chấm điểm theo tỷ lệ % hoàn thành (100%, 80%, 50%,...) -&gt; Hệ thống tự động tính tiền Thưởng trách nhiệm thực nhận và Thưởng hiệu suất (Performance Bonus).</w:t>
-      </w:r>
-    </w:p>
-    <w:p>
-      <w:pPr>
-        <w:spacing w:after="80" w:before="160"/>
-      </w:pPr>
-      <w:r>
-        <w:rPr>
-          <w:rFonts w:ascii="Times New Roman" w:cs="Times New Roman" w:eastAsia="Times New Roman" w:hAnsi="Times New Roman"/>
-          <w:b/>
-          <w:bCs/>
-          <w:color w:val="0284C7"/>
-          <w:sz w:val="21"/>
-          <w:szCs w:val="21"/>
-        </w:rPr>
-        <w:t xml:space="preserve">4. TÍNH TOÁN, DUYỆT &amp; XUẤT BẢNG LƯƠNG (/payroll)</w:t>
-      </w:r>
-    </w:p>
-    <w:p>
-      <w:pPr>
-        <w:spacing w:after="40" w:before="40"/>
-      </w:pPr>
-      <w:r>
-        <w:rPr>
-          <w:rFonts w:ascii="Times New Roman" w:cs="Times New Roman" w:eastAsia="Times New Roman" w:hAnsi="Times New Roman"/>
-          <w:b/>
-          <w:bCs/>
-          <w:color w:val="0284C7"/>
-          <w:sz w:val="21"/>
-          <w:szCs w:val="21"/>
-        </w:rPr>
-        <w:t xml:space="preserve">• </w:t>
-      </w:r>
-      <w:r>
-        <w:rPr>
-          <w:rFonts w:ascii="Times New Roman" w:cs="Times New Roman" w:eastAsia="Times New Roman" w:hAnsi="Times New Roman"/>
-          <w:b/>
-          <w:bCs/>
-          <w:color w:val="0F172A"/>
-          <w:sz w:val="21"/>
-          <w:szCs w:val="21"/>
-        </w:rPr>
-        <w:t xml:space="preserve">Bước 1 - Chọn kỳ lương: </w:t>
-      </w:r>
-      <w:r>
-        <w:rPr>
-          <w:rFonts w:ascii="Times New Roman" w:cs="Times New Roman" w:eastAsia="Times New Roman" w:hAnsi="Times New Roman"/>
-          <w:color w:val="334155"/>
-          <w:sz w:val="21"/>
-          <w:szCs w:val="21"/>
-        </w:rPr>
-        <w:t xml:space="preserve">Chọn Tháng và Năm cần lập bảng lương trên thanh công cụ.</w:t>
-      </w:r>
-    </w:p>
-    <w:p>
-      <w:pPr>
-        <w:spacing w:after="40" w:before="40"/>
-      </w:pPr>
-      <w:r>
-        <w:rPr>
-          <w:rFonts w:ascii="Times New Roman" w:cs="Times New Roman" w:eastAsia="Times New Roman" w:hAnsi="Times New Roman"/>
-          <w:b/>
-          <w:bCs/>
-          <w:color w:val="0284C7"/>
-          <w:sz w:val="21"/>
-          <w:szCs w:val="21"/>
-        </w:rPr>
-        <w:t xml:space="preserve">• </w:t>
-      </w:r>
-      <w:r>
-        <w:rPr>
-          <w:rFonts w:ascii="Times New Roman" w:cs="Times New Roman" w:eastAsia="Times New Roman" w:hAnsi="Times New Roman"/>
-          <w:b/>
-          <w:bCs/>
-          <w:color w:val="0F172A"/>
-          <w:sz w:val="21"/>
-          <w:szCs w:val="21"/>
-        </w:rPr>
-        <w:t xml:space="preserve">Bước 2 - Tính lương tự động: </w:t>
-      </w:r>
-      <w:r>
-        <w:rPr>
-          <w:rFonts w:ascii="Times New Roman" w:cs="Times New Roman" w:eastAsia="Times New Roman" w:hAnsi="Times New Roman"/>
-          <w:color w:val="334155"/>
-          <w:sz w:val="21"/>
-          <w:szCs w:val="21"/>
-        </w:rPr>
-        <w:t xml:space="preserve">Bấm 'Tính lương tự động' -&gt; Hệ thống lấy 100% dữ liệu gốc: Lương ngạch bậc theo ngày công + Tiền OT (x1.5) + Tiền KPI + Phụ cấp ăn/điện thoại - BHXH (10.5%) - Công đoàn (1%) - Tạm ứng/Giảm trừ.</w:t>
-      </w:r>
-    </w:p>
-    <w:p>
-      <w:pPr>
-        <w:spacing w:after="40" w:before="40"/>
-      </w:pPr>
-      <w:r>
-        <w:rPr>
-          <w:rFonts w:ascii="Times New Roman" w:cs="Times New Roman" w:eastAsia="Times New Roman" w:hAnsi="Times New Roman"/>
-          <w:b/>
-          <w:bCs/>
-          <w:color w:val="0284C7"/>
-          <w:sz w:val="21"/>
-          <w:szCs w:val="21"/>
-        </w:rPr>
-        <w:t xml:space="preserve">• </w:t>
-      </w:r>
-      <w:r>
-        <w:rPr>
-          <w:rFonts w:ascii="Times New Roman" w:cs="Times New Roman" w:eastAsia="Times New Roman" w:hAnsi="Times New Roman"/>
-          <w:b/>
-          <w:bCs/>
-          <w:color w:val="0F172A"/>
-          <w:sz w:val="21"/>
-          <w:szCs w:val="21"/>
-        </w:rPr>
-        <w:t xml:space="preserve">Bước 3 - Xuất Báo cáo: </w:t>
-      </w:r>
-      <w:r>
-        <w:rPr>
-          <w:rFonts w:ascii="Times New Roman" w:cs="Times New Roman" w:eastAsia="Times New Roman" w:hAnsi="Times New Roman"/>
-          <w:color w:val="334155"/>
-          <w:sz w:val="21"/>
-          <w:szCs w:val="21"/>
-        </w:rPr>
-        <w:t xml:space="preserve">Bấm 'Xuất Bảng Lương Excel' để lưu trữ hoặc trình Ban Giám Đốc phê duyệt; Bấm 'Gửi phiếu lương' để nhân viên tự tra cứu trên tài khoản cá nhân.</w:t>
-      </w:r>
-    </w:p>
-    <w:p>
-      <w:pPr>
-        <w:spacing w:after="80" w:before="160"/>
-      </w:pPr>
-      <w:r>
-        <w:rPr>
-          <w:rFonts w:ascii="Times New Roman" w:cs="Times New Roman" w:eastAsia="Times New Roman" w:hAnsi="Times New Roman"/>
-          <w:b/>
-          <w:bCs/>
-          <w:color w:val="0284C7"/>
-          <w:sz w:val="21"/>
-          <w:szCs w:val="21"/>
-        </w:rPr>
-        <w:t xml:space="preserve">5. 💡 HÒM THƯ &amp; SÁNG KIẾN CẢI TIẾN SẢN XUẤT (/innovations)</w:t>
+        <w:t xml:space="preserve">6. QUẢN LÝ ĐƠN TỪ CÁ NHÂN TRỰC TUYẾN (/attendance?tab=leaves)</w:t>
       </w:r>
     </w:p>
     <w:p>
@@ -1342,7 +1581,7 @@
           <w:sz w:val="21"/>
           <w:szCs w:val="21"/>
         </w:rPr>
-        <w:t xml:space="preserve">Khuyến khích công nhân viên tại các xưởng sản xuất, kho bãi và văn phòng đóng góp các ý tưởng cải tiến kỹ thuật, tiết kiệm nguyên vật liệu, tối ưu quy trình làm việc.</w:t>
+        <w:t xml:space="preserve">Giải quyết thủ tục hành chính liên quan đến ngày công làm việc của nhân viên.</w:t>
       </w:r>
     </w:p>
     <w:p>
@@ -1369,7 +1608,7 @@
           <w:sz w:val="21"/>
           <w:szCs w:val="21"/>
         </w:rPr>
-        <w:t xml:space="preserve">Nhân viên gửi sáng kiến: </w:t>
+        <w:t xml:space="preserve">Các loại đơn: </w:t>
       </w:r>
       <w:r>
         <w:rPr>
@@ -1378,7 +1617,7 @@
           <w:sz w:val="21"/>
           <w:szCs w:val="21"/>
         </w:rPr>
-        <w:t xml:space="preserve">Nhân viên gửi ý tưởng kèm mô tả hiệu quả dự kiến (tiết kiệm chi phí, tăng năng suất, an toàn lao động), có thể đính kèm tài liệu/hình ảnh và chọn chế độ Gửi ẩn danh hoặc Công khai.</w:t>
+        <w:t xml:space="preserve">Đơn xin nghỉ phép năm, Nghỉ không lương, Nghỉ ốm đau/thai sản, Đi muộn/về sớm, Đăng ký làm thêm giờ (OT), Giải trình quên chấm công.</w:t>
       </w:r>
     </w:p>
     <w:p>
@@ -1405,7 +1644,7 @@
           <w:sz w:val="21"/>
           <w:szCs w:val="21"/>
         </w:rPr>
-        <w:t xml:space="preserve">Thẩm định &amp; Duyệt thưởng: </w:t>
+        <w:t xml:space="preserve">Quy trình phê duyệt: </w:t>
       </w:r>
       <w:r>
         <w:rPr>
@@ -1414,23 +1653,7 @@
           <w:sz w:val="21"/>
           <w:szCs w:val="21"/>
         </w:rPr>
-        <w:t xml:space="preserve">Ban Giám Đốc và Phòng HCNS tiếp nhận đề xuất, đánh giá tính khả thi và duyệt mức Thưởng sáng kiến -&gt; Số tiền thưởng tự động được cộng vào kỳ lương của nhân viên.</w:t>
-      </w:r>
-    </w:p>
-    <w:p>
-      <w:pPr>
-        <w:spacing w:after="80" w:before="160"/>
-      </w:pPr>
-      <w:r>
-        <w:rPr>
-          <w:rFonts w:ascii="Times New Roman" w:cs="Times New Roman" w:eastAsia="Times New Roman" w:hAnsi="Times New Roman"/>
-          <w:b/>
-          <w:bCs/>
-          <w:color w:val="0284C7"/>
-          <w:sz w:val="21"/>
-          <w:szCs w:val="21"/>
-        </w:rPr>
-        <w:t xml:space="preserve">6. 📦 QUẢN LÝ TÀI SẢN &amp; CÔNG CỤ DỤNG CỤ (CCDC) (/assets)</w:t>
+        <w:t xml:space="preserve">Nhân viên gửi đơn -&gt; Trưởng phòng / HCNS nhận thông báo -&gt; Phê duyệt / Từ chối kèm lý do -&gt; Tự động cập nhật vào Bảng công và Lương.</w:t>
       </w:r>
     </w:p>
     <w:p>
@@ -1457,7 +1680,7 @@
           <w:sz w:val="21"/>
           <w:szCs w:val="21"/>
         </w:rPr>
-        <w:t xml:space="preserve">Quản lý danh mục tài sản: </w:t>
+        <w:t xml:space="preserve">Phân quyền áp dụng: </w:t>
       </w:r>
       <w:r>
         <w:rPr>
@@ -1466,7 +1689,23 @@
           <w:sz w:val="21"/>
           <w:szCs w:val="21"/>
         </w:rPr>
-        <w:t xml:space="preserve">Theo dõi danh mục máy móc xưởng nệm/gối, xe tải giao hàng kho Cần Thơ/Mỹ Tho, máy tính văn phòng, tình trạng sử dụng, thời gian khấu hao và giá trị còn lại.</w:t>
+        <w:t xml:space="preserve">Tất cả nhân sự đều được gửi đơn; Quản lý và Admin duyệt đơn.</w:t>
+      </w:r>
+    </w:p>
+    <w:p>
+      <w:pPr>
+        <w:spacing w:after="80" w:before="180"/>
+      </w:pPr>
+      <w:r>
+        <w:rPr>
+          <w:rFonts w:ascii="Times New Roman" w:cs="Times New Roman" w:eastAsia="Times New Roman" w:hAnsi="Times New Roman"/>
+          <w:b/>
+          <w:bCs/>
+          <w:color w:val="1E3A8A"/>
+          <w:sz w:val="21"/>
+          <w:szCs w:val="21"/>
+        </w:rPr>
+        <w:t xml:space="preserve">7. QUẢN LÝ KPI &amp; ĐÁNH GIÁ HIỆU SUẤT THÁNG (/kpi)</w:t>
       </w:r>
     </w:p>
     <w:p>
@@ -1493,7 +1732,7 @@
           <w:sz w:val="21"/>
           <w:szCs w:val="21"/>
         </w:rPr>
-        <w:t xml:space="preserve">Theo dõi cấp phát: </w:t>
+        <w:t xml:space="preserve">Thiết lập định mức KPI: </w:t>
       </w:r>
       <w:r>
         <w:rPr>
@@ -1502,7 +1741,7 @@
           <w:sz w:val="21"/>
           <w:szCs w:val="21"/>
         </w:rPr>
-        <w:t xml:space="preserve">Gán tài sản/công cụ cho từng nhân viên hoặc từng phòng ban phụ trách chịu trách nhiệm quản lý.</w:t>
+        <w:t xml:space="preserve">Chọn tháng cần đánh giá (ví dụ Tháng 08/2026), cấu hình mức thưởng trách nhiệm định mức theo chức danh (1.000.000đ, 2.000.000đ,...).</w:t>
       </w:r>
     </w:p>
     <w:p>
@@ -1529,7 +1768,7 @@
           <w:sz w:val="21"/>
           <w:szCs w:val="21"/>
         </w:rPr>
-        <w:t xml:space="preserve">Xử lý phiếu báo hỏng: </w:t>
+        <w:t xml:space="preserve">Chấm điểm &amp; Tự động tính thưởng: </w:t>
       </w:r>
       <w:r>
         <w:rPr>
@@ -1538,12 +1777,12 @@
           <w:sz w:val="21"/>
           <w:szCs w:val="21"/>
         </w:rPr>
-        <w:t xml:space="preserve">Nhân viên tạo phiếu báo hỏng tài sản trực tuyến khi gặp sự cố; Trưởng phòng và Bộ phận kỹ thuật tiếp nhận xử lý, cập nhật chi phí sửa chữa và thời gian hoàn thành.</w:t>
+        <w:t xml:space="preserve">Trưởng phòng chấm điểm theo tỷ lệ % hoàn thành (100%, 80%, 50%,...) -&gt; Tự động tính tiền Thưởng trách nhiệm và Thưởng hiệu suất.</w:t>
       </w:r>
     </w:p>
     <w:p>
       <w:pPr>
-        <w:spacing w:after="80" w:before="160"/>
+        <w:spacing w:after="40" w:before="40"/>
       </w:pPr>
       <w:r>
         <w:rPr>
@@ -1554,7 +1793,523 @@
           <w:sz w:val="21"/>
           <w:szCs w:val="21"/>
         </w:rPr>
-        <w:t xml:space="preserve">7. 🏆 KHEN THƯỞNG &amp; KỶ LUẬT ĐỒNG BỘ BẢNG LƯƠNG (/rewards)</w:t>
+        <w:t xml:space="preserve">• </w:t>
+      </w:r>
+      <w:r>
+        <w:rPr>
+          <w:rFonts w:ascii="Times New Roman" w:cs="Times New Roman" w:eastAsia="Times New Roman" w:hAnsi="Times New Roman"/>
+          <w:b/>
+          <w:bCs/>
+          <w:color w:val="0F172A"/>
+          <w:sz w:val="21"/>
+          <w:szCs w:val="21"/>
+        </w:rPr>
+        <w:t xml:space="preserve">🔒 Phân quyền bảo mật cao: </w:t>
+      </w:r>
+      <w:r>
+        <w:rPr>
+          <w:rFonts w:ascii="Times New Roman" w:cs="Times New Roman" w:eastAsia="Times New Roman" w:hAnsi="Times New Roman"/>
+          <w:color w:val="334155"/>
+          <w:sz w:val="21"/>
+          <w:szCs w:val="21"/>
+        </w:rPr>
+        <w:t xml:space="preserve">Chỉ Cấp 1 (Admin) và Cấp 2 (Manager xem phòng mình); Cấp 3 (Employee) BỊ KHÓA &amp; ẨN HOÀN TOÀN để tránh so bì nội bộ.</w:t>
+      </w:r>
+    </w:p>
+    <w:p>
+      <w:pPr>
+        <w:spacing w:after="80" w:before="180"/>
+      </w:pPr>
+      <w:r>
+        <w:rPr>
+          <w:rFonts w:ascii="Times New Roman" w:cs="Times New Roman" w:eastAsia="Times New Roman" w:hAnsi="Times New Roman"/>
+          <w:b/>
+          <w:bCs/>
+          <w:color w:val="1E3A8A"/>
+          <w:sz w:val="21"/>
+          <w:szCs w:val="21"/>
+        </w:rPr>
+        <w:t xml:space="preserve">8. TÍNH TOÁN, DUYỆT &amp; XUẤT BẢNG LƯƠNG TỰ ĐỘNG (/payroll)</w:t>
+      </w:r>
+    </w:p>
+    <w:p>
+      <w:pPr>
+        <w:spacing w:after="40" w:before="40"/>
+      </w:pPr>
+      <w:r>
+        <w:rPr>
+          <w:rFonts w:ascii="Times New Roman" w:cs="Times New Roman" w:eastAsia="Times New Roman" w:hAnsi="Times New Roman"/>
+          <w:b/>
+          <w:bCs/>
+          <w:color w:val="0284C7"/>
+          <w:sz w:val="21"/>
+          <w:szCs w:val="21"/>
+        </w:rPr>
+        <w:t xml:space="preserve">• </w:t>
+      </w:r>
+      <w:r>
+        <w:rPr>
+          <w:rFonts w:ascii="Times New Roman" w:cs="Times New Roman" w:eastAsia="Times New Roman" w:hAnsi="Times New Roman"/>
+          <w:b/>
+          <w:bCs/>
+          <w:color w:val="0F172A"/>
+          <w:sz w:val="21"/>
+          <w:szCs w:val="21"/>
+        </w:rPr>
+        <w:t xml:space="preserve">Công thức tính lương chuẩn 100% dữ liệu thực: </w:t>
+      </w:r>
+      <w:r>
+        <w:rPr>
+          <w:rFonts w:ascii="Times New Roman" w:cs="Times New Roman" w:eastAsia="Times New Roman" w:hAnsi="Times New Roman"/>
+          <w:color w:val="334155"/>
+          <w:sz w:val="21"/>
+          <w:szCs w:val="21"/>
+        </w:rPr>
+        <w:t xml:space="preserve">Lương ngạch bậc thực nhận = (Lương ngạch bậc / 26) * Ngày công thực tế + Tiền OT (x1.5) + Tiền KPI + Phụ cấp ăn/điện thoại - BHXH (10.5%) - Công đoàn (1%) - Tạm ứng/Kỷ luật.</w:t>
+      </w:r>
+    </w:p>
+    <w:p>
+      <w:pPr>
+        <w:spacing w:after="40" w:before="40"/>
+      </w:pPr>
+      <w:r>
+        <w:rPr>
+          <w:rFonts w:ascii="Times New Roman" w:cs="Times New Roman" w:eastAsia="Times New Roman" w:hAnsi="Times New Roman"/>
+          <w:b/>
+          <w:bCs/>
+          <w:color w:val="0284C7"/>
+          <w:sz w:val="21"/>
+          <w:szCs w:val="21"/>
+        </w:rPr>
+        <w:t xml:space="preserve">• </w:t>
+      </w:r>
+      <w:r>
+        <w:rPr>
+          <w:rFonts w:ascii="Times New Roman" w:cs="Times New Roman" w:eastAsia="Times New Roman" w:hAnsi="Times New Roman"/>
+          <w:b/>
+          <w:bCs/>
+          <w:color w:val="0F172A"/>
+          <w:sz w:val="21"/>
+          <w:szCs w:val="21"/>
+        </w:rPr>
+        <w:t xml:space="preserve">Xuất Bảng Lương Excel: </w:t>
+      </w:r>
+      <w:r>
+        <w:rPr>
+          <w:rFonts w:ascii="Times New Roman" w:cs="Times New Roman" w:eastAsia="Times New Roman" w:hAnsi="Times New Roman"/>
+          <w:color w:val="334155"/>
+          <w:sz w:val="21"/>
+          <w:szCs w:val="21"/>
+        </w:rPr>
+        <w:t xml:space="preserve">Xuất file Excel bảng lương tổng hợp 11 phòng ban đầy đủ công thức chuẩn bị trình ký Ban Giám Đốc.</w:t>
+      </w:r>
+    </w:p>
+    <w:p>
+      <w:pPr>
+        <w:spacing w:after="40" w:before="40"/>
+      </w:pPr>
+      <w:r>
+        <w:rPr>
+          <w:rFonts w:ascii="Times New Roman" w:cs="Times New Roman" w:eastAsia="Times New Roman" w:hAnsi="Times New Roman"/>
+          <w:b/>
+          <w:bCs/>
+          <w:color w:val="0284C7"/>
+          <w:sz w:val="21"/>
+          <w:szCs w:val="21"/>
+        </w:rPr>
+        <w:t xml:space="preserve">• </w:t>
+      </w:r>
+      <w:r>
+        <w:rPr>
+          <w:rFonts w:ascii="Times New Roman" w:cs="Times New Roman" w:eastAsia="Times New Roman" w:hAnsi="Times New Roman"/>
+          <w:b/>
+          <w:bCs/>
+          <w:color w:val="0F172A"/>
+          <w:sz w:val="21"/>
+          <w:szCs w:val="21"/>
+        </w:rPr>
+        <w:t xml:space="preserve">Phát hành Phiếu lương (Payslip): </w:t>
+      </w:r>
+      <w:r>
+        <w:rPr>
+          <w:rFonts w:ascii="Times New Roman" w:cs="Times New Roman" w:eastAsia="Times New Roman" w:hAnsi="Times New Roman"/>
+          <w:color w:val="334155"/>
+          <w:sz w:val="21"/>
+          <w:szCs w:val="21"/>
+        </w:rPr>
+        <w:t xml:space="preserve">Bấm 'Gửi phiếu lương' để từng nhân viên tự tra cứu trên tài khoản cá nhân. Nhân viên chỉ thấy duy nhất phiếu lương của mình, ẨN 100% lương người khác.</w:t>
+      </w:r>
+    </w:p>
+    <w:p>
+      <w:pPr>
+        <w:spacing w:after="40" w:before="40"/>
+      </w:pPr>
+      <w:r>
+        <w:rPr>
+          <w:rFonts w:ascii="Times New Roman" w:cs="Times New Roman" w:eastAsia="Times New Roman" w:hAnsi="Times New Roman"/>
+          <w:b/>
+          <w:bCs/>
+          <w:color w:val="0284C7"/>
+          <w:sz w:val="21"/>
+          <w:szCs w:val="21"/>
+        </w:rPr>
+        <w:t xml:space="preserve">• </w:t>
+      </w:r>
+      <w:r>
+        <w:rPr>
+          <w:rFonts w:ascii="Times New Roman" w:cs="Times New Roman" w:eastAsia="Times New Roman" w:hAnsi="Times New Roman"/>
+          <w:b/>
+          <w:bCs/>
+          <w:color w:val="0F172A"/>
+          <w:sz w:val="21"/>
+          <w:szCs w:val="21"/>
+        </w:rPr>
+        <w:t xml:space="preserve">Phân quyền xem lương: </w:t>
+      </w:r>
+      <w:r>
+        <w:rPr>
+          <w:rFonts w:ascii="Times New Roman" w:cs="Times New Roman" w:eastAsia="Times New Roman" w:hAnsi="Times New Roman"/>
+          <w:color w:val="334155"/>
+          <w:sz w:val="21"/>
+          <w:szCs w:val="21"/>
+        </w:rPr>
+        <w:t xml:space="preserve">Admin xem toàn cty; Manager xem phòng mình và phiếu cá nhân; Employee chỉ xem phiếu cá nhân.</w:t>
+      </w:r>
+    </w:p>
+    <w:p>
+      <w:pPr>
+        <w:spacing w:after="80" w:before="180"/>
+      </w:pPr>
+      <w:r>
+        <w:rPr>
+          <w:rFonts w:ascii="Times New Roman" w:cs="Times New Roman" w:eastAsia="Times New Roman" w:hAnsi="Times New Roman"/>
+          <w:b/>
+          <w:bCs/>
+          <w:color w:val="1E3A8A"/>
+          <w:sz w:val="21"/>
+          <w:szCs w:val="21"/>
+        </w:rPr>
+        <w:t xml:space="preserve">9. 💡 HÒM THƯ &amp; SÁNG KIẾN CẢI TIẾN SẢN XUẤT (/innovations)</w:t>
+      </w:r>
+    </w:p>
+    <w:p>
+      <w:pPr>
+        <w:spacing w:after="40" w:before="40"/>
+      </w:pPr>
+      <w:r>
+        <w:rPr>
+          <w:rFonts w:ascii="Times New Roman" w:cs="Times New Roman" w:eastAsia="Times New Roman" w:hAnsi="Times New Roman"/>
+          <w:b/>
+          <w:bCs/>
+          <w:color w:val="0284C7"/>
+          <w:sz w:val="21"/>
+          <w:szCs w:val="21"/>
+        </w:rPr>
+        <w:t xml:space="preserve">• </w:t>
+      </w:r>
+      <w:r>
+        <w:rPr>
+          <w:rFonts w:ascii="Times New Roman" w:cs="Times New Roman" w:eastAsia="Times New Roman" w:hAnsi="Times New Roman"/>
+          <w:b/>
+          <w:bCs/>
+          <w:color w:val="0F172A"/>
+          <w:sz w:val="21"/>
+          <w:szCs w:val="21"/>
+        </w:rPr>
+        <w:t xml:space="preserve">Mục đích phát triển: </w:t>
+      </w:r>
+      <w:r>
+        <w:rPr>
+          <w:rFonts w:ascii="Times New Roman" w:cs="Times New Roman" w:eastAsia="Times New Roman" w:hAnsi="Times New Roman"/>
+          <w:color w:val="334155"/>
+          <w:sz w:val="21"/>
+          <w:szCs w:val="21"/>
+        </w:rPr>
+        <w:t xml:space="preserve">Khuyến khích cán bộ công nhân viên tại các xưởng sản xuất, kho bãi và văn phòng hiến kế cải tiến kỹ thuật, tiết kiệm nguyên vật liệu, nâng cao chất lượng nệm.</w:t>
+      </w:r>
+    </w:p>
+    <w:p>
+      <w:pPr>
+        <w:spacing w:after="40" w:before="40"/>
+      </w:pPr>
+      <w:r>
+        <w:rPr>
+          <w:rFonts w:ascii="Times New Roman" w:cs="Times New Roman" w:eastAsia="Times New Roman" w:hAnsi="Times New Roman"/>
+          <w:b/>
+          <w:bCs/>
+          <w:color w:val="0284C7"/>
+          <w:sz w:val="21"/>
+          <w:szCs w:val="21"/>
+        </w:rPr>
+        <w:t xml:space="preserve">• </w:t>
+      </w:r>
+      <w:r>
+        <w:rPr>
+          <w:rFonts w:ascii="Times New Roman" w:cs="Times New Roman" w:eastAsia="Times New Roman" w:hAnsi="Times New Roman"/>
+          <w:b/>
+          <w:bCs/>
+          <w:color w:val="0F172A"/>
+          <w:sz w:val="21"/>
+          <w:szCs w:val="21"/>
+        </w:rPr>
+        <w:t xml:space="preserve">3 Nhóm chủ đề đóng góp: </w:t>
+      </w:r>
+      <w:r>
+        <w:rPr>
+          <w:rFonts w:ascii="Times New Roman" w:cs="Times New Roman" w:eastAsia="Times New Roman" w:hAnsi="Times New Roman"/>
+          <w:color w:val="334155"/>
+          <w:sz w:val="21"/>
+          <w:szCs w:val="21"/>
+        </w:rPr>
+        <w:t xml:space="preserve">1) Ý tưởng cải tiến sáng tạo; 2) Góp ý môi trường &amp; phúc lợi; 3) Phản ánh khiếu nại kiến nghị nội bộ.</w:t>
+      </w:r>
+    </w:p>
+    <w:p>
+      <w:pPr>
+        <w:spacing w:after="40" w:before="40"/>
+      </w:pPr>
+      <w:r>
+        <w:rPr>
+          <w:rFonts w:ascii="Times New Roman" w:cs="Times New Roman" w:eastAsia="Times New Roman" w:hAnsi="Times New Roman"/>
+          <w:b/>
+          <w:bCs/>
+          <w:color w:val="0284C7"/>
+          <w:sz w:val="21"/>
+          <w:szCs w:val="21"/>
+        </w:rPr>
+        <w:t xml:space="preserve">• </w:t>
+      </w:r>
+      <w:r>
+        <w:rPr>
+          <w:rFonts w:ascii="Times New Roman" w:cs="Times New Roman" w:eastAsia="Times New Roman" w:hAnsi="Times New Roman"/>
+          <w:b/>
+          <w:bCs/>
+          <w:color w:val="0F172A"/>
+          <w:sz w:val="21"/>
+          <w:szCs w:val="21"/>
+        </w:rPr>
+        <w:t xml:space="preserve">Chế độ Bảo mật danh tính: </w:t>
+      </w:r>
+      <w:r>
+        <w:rPr>
+          <w:rFonts w:ascii="Times New Roman" w:cs="Times New Roman" w:eastAsia="Times New Roman" w:hAnsi="Times New Roman"/>
+          <w:color w:val="334155"/>
+          <w:sz w:val="21"/>
+          <w:szCs w:val="21"/>
+        </w:rPr>
+        <w:t xml:space="preserve">Nhân viên có thể tùy chọn: Hiện tên công khai HOẶC Gửi ẨN DANH (bảo mật 100% thông tin người gửi).</w:t>
+      </w:r>
+    </w:p>
+    <w:p>
+      <w:pPr>
+        <w:spacing w:after="40" w:before="40"/>
+      </w:pPr>
+      <w:r>
+        <w:rPr>
+          <w:rFonts w:ascii="Times New Roman" w:cs="Times New Roman" w:eastAsia="Times New Roman" w:hAnsi="Times New Roman"/>
+          <w:b/>
+          <w:bCs/>
+          <w:color w:val="0284C7"/>
+          <w:sz w:val="21"/>
+          <w:szCs w:val="21"/>
+        </w:rPr>
+        <w:t xml:space="preserve">• </w:t>
+      </w:r>
+      <w:r>
+        <w:rPr>
+          <w:rFonts w:ascii="Times New Roman" w:cs="Times New Roman" w:eastAsia="Times New Roman" w:hAnsi="Times New Roman"/>
+          <w:b/>
+          <w:bCs/>
+          <w:color w:val="0F172A"/>
+          <w:sz w:val="21"/>
+          <w:szCs w:val="21"/>
+        </w:rPr>
+        <w:t xml:space="preserve">Thẩm định &amp; Thưởng nóng: </w:t>
+      </w:r>
+      <w:r>
+        <w:rPr>
+          <w:rFonts w:ascii="Times New Roman" w:cs="Times New Roman" w:eastAsia="Times New Roman" w:hAnsi="Times New Roman"/>
+          <w:color w:val="334155"/>
+          <w:sz w:val="21"/>
+          <w:szCs w:val="21"/>
+        </w:rPr>
+        <w:t xml:space="preserve">Ban Giám Đốc &amp; HCNS phê duyệt thưởng nóng (tiền mặt/quà) -&gt; Số tiền thưởng tự động đồng bộ sang Bảng lương.</w:t>
+      </w:r>
+    </w:p>
+    <w:p>
+      <w:pPr>
+        <w:spacing w:after="40" w:before="40"/>
+      </w:pPr>
+      <w:r>
+        <w:rPr>
+          <w:rFonts w:ascii="Times New Roman" w:cs="Times New Roman" w:eastAsia="Times New Roman" w:hAnsi="Times New Roman"/>
+          <w:b/>
+          <w:bCs/>
+          <w:color w:val="0284C7"/>
+          <w:sz w:val="21"/>
+          <w:szCs w:val="21"/>
+        </w:rPr>
+        <w:t xml:space="preserve">• </w:t>
+      </w:r>
+      <w:r>
+        <w:rPr>
+          <w:rFonts w:ascii="Times New Roman" w:cs="Times New Roman" w:eastAsia="Times New Roman" w:hAnsi="Times New Roman"/>
+          <w:b/>
+          <w:bCs/>
+          <w:color w:val="0F172A"/>
+          <w:sz w:val="21"/>
+          <w:szCs w:val="21"/>
+        </w:rPr>
+        <w:t xml:space="preserve">Phân quyền áp dụng: </w:t>
+      </w:r>
+      <w:r>
+        <w:rPr>
+          <w:rFonts w:ascii="Times New Roman" w:cs="Times New Roman" w:eastAsia="Times New Roman" w:hAnsi="Times New Roman"/>
+          <w:color w:val="334155"/>
+          <w:sz w:val="21"/>
+          <w:szCs w:val="21"/>
+        </w:rPr>
+        <w:t xml:space="preserve">Tất cả nhân sự (Admin, Manager, Employee) đều có quyền gửi sáng kiến và tương tác thả tim.</w:t>
+      </w:r>
+    </w:p>
+    <w:p>
+      <w:pPr>
+        <w:spacing w:after="80" w:before="180"/>
+      </w:pPr>
+      <w:r>
+        <w:rPr>
+          <w:rFonts w:ascii="Times New Roman" w:cs="Times New Roman" w:eastAsia="Times New Roman" w:hAnsi="Times New Roman"/>
+          <w:b/>
+          <w:bCs/>
+          <w:color w:val="1E3A8A"/>
+          <w:sz w:val="21"/>
+          <w:szCs w:val="21"/>
+        </w:rPr>
+        <w:t xml:space="preserve">10. 📦 QUẢN LÝ TÀI SẢN &amp; CÔNG CỤ DỤNG CỤ (CCDC) (/assets)</w:t>
+      </w:r>
+    </w:p>
+    <w:p>
+      <w:pPr>
+        <w:spacing w:after="40" w:before="40"/>
+      </w:pPr>
+      <w:r>
+        <w:rPr>
+          <w:rFonts w:ascii="Times New Roman" w:cs="Times New Roman" w:eastAsia="Times New Roman" w:hAnsi="Times New Roman"/>
+          <w:b/>
+          <w:bCs/>
+          <w:color w:val="0284C7"/>
+          <w:sz w:val="21"/>
+          <w:szCs w:val="21"/>
+        </w:rPr>
+        <w:t xml:space="preserve">• </w:t>
+      </w:r>
+      <w:r>
+        <w:rPr>
+          <w:rFonts w:ascii="Times New Roman" w:cs="Times New Roman" w:eastAsia="Times New Roman" w:hAnsi="Times New Roman"/>
+          <w:b/>
+          <w:bCs/>
+          <w:color w:val="0F172A"/>
+          <w:sz w:val="21"/>
+          <w:szCs w:val="21"/>
+        </w:rPr>
+        <w:t xml:space="preserve">Danh mục tài sản máy móc: </w:t>
+      </w:r>
+      <w:r>
+        <w:rPr>
+          <w:rFonts w:ascii="Times New Roman" w:cs="Times New Roman" w:eastAsia="Times New Roman" w:hAnsi="Times New Roman"/>
+          <w:color w:val="334155"/>
+          <w:sz w:val="21"/>
+          <w:szCs w:val="21"/>
+        </w:rPr>
+        <w:t xml:space="preserve">Theo dõi máy móc xưởng nệm (máy may, máy cắt), xe tải giao hàng kho Cần Thơ/Mỹ Tho, máy tính thiết bị văn phòng, tình trạng và thời gian khấu hao.</w:t>
+      </w:r>
+    </w:p>
+    <w:p>
+      <w:pPr>
+        <w:spacing w:after="40" w:before="40"/>
+      </w:pPr>
+      <w:r>
+        <w:rPr>
+          <w:rFonts w:ascii="Times New Roman" w:cs="Times New Roman" w:eastAsia="Times New Roman" w:hAnsi="Times New Roman"/>
+          <w:b/>
+          <w:bCs/>
+          <w:color w:val="0284C7"/>
+          <w:sz w:val="21"/>
+          <w:szCs w:val="21"/>
+        </w:rPr>
+        <w:t xml:space="preserve">• </w:t>
+      </w:r>
+      <w:r>
+        <w:rPr>
+          <w:rFonts w:ascii="Times New Roman" w:cs="Times New Roman" w:eastAsia="Times New Roman" w:hAnsi="Times New Roman"/>
+          <w:b/>
+          <w:bCs/>
+          <w:color w:val="0F172A"/>
+          <w:sz w:val="21"/>
+          <w:szCs w:val="21"/>
+        </w:rPr>
+        <w:t xml:space="preserve">Cấp phát &amp; Báo hỏng trực tuyến: </w:t>
+      </w:r>
+      <w:r>
+        <w:rPr>
+          <w:rFonts w:ascii="Times New Roman" w:cs="Times New Roman" w:eastAsia="Times New Roman" w:hAnsi="Times New Roman"/>
+          <w:color w:val="334155"/>
+          <w:sz w:val="21"/>
+          <w:szCs w:val="21"/>
+        </w:rPr>
+        <w:t xml:space="preserve">Theo dõi nhân sự đang giữ tài sản; Nhân viên tạo phiếu báo hỏng khi có sự cố; Bộ phận kỹ thuật tiếp nhận xử lý và cập nhật chi phí.</w:t>
+      </w:r>
+    </w:p>
+    <w:p>
+      <w:pPr>
+        <w:spacing w:after="40" w:before="40"/>
+      </w:pPr>
+      <w:r>
+        <w:rPr>
+          <w:rFonts w:ascii="Times New Roman" w:cs="Times New Roman" w:eastAsia="Times New Roman" w:hAnsi="Times New Roman"/>
+          <w:b/>
+          <w:bCs/>
+          <w:color w:val="0284C7"/>
+          <w:sz w:val="21"/>
+          <w:szCs w:val="21"/>
+        </w:rPr>
+        <w:t xml:space="preserve">• </w:t>
+      </w:r>
+      <w:r>
+        <w:rPr>
+          <w:rFonts w:ascii="Times New Roman" w:cs="Times New Roman" w:eastAsia="Times New Roman" w:hAnsi="Times New Roman"/>
+          <w:b/>
+          <w:bCs/>
+          <w:color w:val="0F172A"/>
+          <w:sz w:val="21"/>
+          <w:szCs w:val="21"/>
+        </w:rPr>
+        <w:t xml:space="preserve">Phân quyền áp dụng: </w:t>
+      </w:r>
+      <w:r>
+        <w:rPr>
+          <w:rFonts w:ascii="Times New Roman" w:cs="Times New Roman" w:eastAsia="Times New Roman" w:hAnsi="Times New Roman"/>
+          <w:color w:val="334155"/>
+          <w:sz w:val="21"/>
+          <w:szCs w:val="21"/>
+        </w:rPr>
+        <w:t xml:space="preserve">Tất cả 3 cấp bậc (Admin/Manager quản trị &amp; điều phối, Employee xem tài sản được cấp &amp; báo hỏng).</w:t>
+      </w:r>
+    </w:p>
+    <w:p>
+      <w:pPr>
+        <w:spacing w:after="80" w:before="180"/>
+      </w:pPr>
+      <w:r>
+        <w:rPr>
+          <w:rFonts w:ascii="Times New Roman" w:cs="Times New Roman" w:eastAsia="Times New Roman" w:hAnsi="Times New Roman"/>
+          <w:b/>
+          <w:bCs/>
+          <w:color w:val="1E3A8A"/>
+          <w:sz w:val="21"/>
+          <w:szCs w:val="21"/>
+        </w:rPr>
+        <w:t xml:space="preserve">11. 🏆 KHEN THƯỞNG &amp; KỶ LUẬT ĐỒNG BỘ BẢNG LƯƠNG (/rewards)</w:t>
       </w:r>
     </w:p>
     <w:p>
@@ -1590,7 +2345,7 @@
           <w:sz w:val="21"/>
           <w:szCs w:val="21"/>
         </w:rPr>
-        <w:t xml:space="preserve">Lập quyết định khen thưởng cá nhân/tập thể xuất sắc, khen thưởng đột xuất kèm số tiền thưởng -&gt; Tự động cộng vào cột Thưởng khác trên Bảng lương.</w:t>
+        <w:t xml:space="preserve">Lập quyết định vinh danh cá nhân/tập thể xuất sắc kèm số tiền thưởng -&gt; Tự động cộng vào cột Thưởng khác trên Bảng lương.</w:t>
       </w:r>
     </w:p>
     <w:p>
@@ -1626,23 +2381,7 @@
           <w:sz w:val="21"/>
           <w:szCs w:val="21"/>
         </w:rPr>
-        <w:t xml:space="preserve">Ghi nhận các biên bản vi phạm nội quy, đi muộn, vi phạm an toàn lao động kèm số tiền phạt -&gt; Tự động trừ vào cột Giảm trừ kỷ luật trên Bảng lương.</w:t>
-      </w:r>
-    </w:p>
-    <w:p>
-      <w:pPr>
-        <w:spacing w:after="80" w:before="160"/>
-      </w:pPr>
-      <w:r>
-        <w:rPr>
-          <w:rFonts w:ascii="Times New Roman" w:cs="Times New Roman" w:eastAsia="Times New Roman" w:hAnsi="Times New Roman"/>
-          <w:b/>
-          <w:bCs/>
-          <w:color w:val="0284C7"/>
-          <w:sz w:val="21"/>
-          <w:szCs w:val="21"/>
-        </w:rPr>
-        <w:t xml:space="preserve">8. 🌳 SƠ ĐỒ TỔ CHỨC ĐỘNG &amp; DANH BẠ CÔNG TY (/settings/departments-positions, /employees)</w:t>
+        <w:t xml:space="preserve">Lập biên bản xử lý vi phạm nội quy, đi muộn, vi phạm an toàn kèm mức phạt -&gt; Tự động trừ vào cột Giảm trừ kỷ luật trên Bảng lương.</w:t>
       </w:r>
     </w:p>
     <w:p>
@@ -1669,7 +2408,7 @@
           <w:sz w:val="21"/>
           <w:szCs w:val="21"/>
         </w:rPr>
-        <w:t xml:space="preserve">Trực quan hóa bộ máy: </w:t>
+        <w:t xml:space="preserve">Phân quyền áp dụng: </w:t>
       </w:r>
       <w:r>
         <w:rPr>
@@ -1678,7 +2417,23 @@
           <w:sz w:val="21"/>
           <w:szCs w:val="21"/>
         </w:rPr>
-        <w:t xml:space="preserve">Hiển thị cây phả hệ tổ chức toàn diện từ Ban Giám Đốc -&gt; Khối Văn phòng, Kho Cần Thơ, Kho Mỹ Tho, Xưởng Nệm, Xưởng Gối, Phòng Kinh doanh, Phòng Marketing.</w:t>
+        <w:t xml:space="preserve">Admin ban hành; Toàn bộ nhân viên xem được các quyết định khen thưởng công khai.</w:t>
+      </w:r>
+    </w:p>
+    <w:p>
+      <w:pPr>
+        <w:spacing w:after="80" w:before="180"/>
+      </w:pPr>
+      <w:r>
+        <w:rPr>
+          <w:rFonts w:ascii="Times New Roman" w:cs="Times New Roman" w:eastAsia="Times New Roman" w:hAnsi="Times New Roman"/>
+          <w:b/>
+          <w:bCs/>
+          <w:color w:val="1E3A8A"/>
+          <w:sz w:val="21"/>
+          <w:szCs w:val="21"/>
+        </w:rPr>
+        <w:t xml:space="preserve">12. VĂN BẢN, QUY ĐỊNH &amp; CHÍNH SÁCH DOANH NGHIỆP (/documents)</w:t>
       </w:r>
     </w:p>
     <w:p>
@@ -1705,7 +2460,7 @@
           <w:sz w:val="21"/>
           <w:szCs w:val="21"/>
         </w:rPr>
-        <w:t xml:space="preserve">Cơ cấu nhân sự: </w:t>
+        <w:t xml:space="preserve">Thư viện quy chế số: </w:t>
       </w:r>
       <w:r>
         <w:rPr>
@@ -1714,12 +2469,544 @@
           <w:sz w:val="21"/>
           <w:szCs w:val="21"/>
         </w:rPr>
-        <w:t xml:space="preserve">Xem nhanh số lượng nhân sự, danh sách chức danh và nhân viên trực thuộc từng phòng ban theo thời gian thực.</w:t>
+        <w:t xml:space="preserve">Lưu trữ Nội quy lao động 2026, Chính sách phúc lợi, Thông báo xử lý vi phạm nội bộ cấp Quản lý &amp; Nhân viên, Quy trình an toàn lao động.</w:t>
       </w:r>
     </w:p>
     <w:p>
       <w:pPr>
-        <w:spacing w:after="120" w:before="260"/>
+        <w:spacing w:after="40" w:before="40"/>
+      </w:pPr>
+      <w:r>
+        <w:rPr>
+          <w:rFonts w:ascii="Times New Roman" w:cs="Times New Roman" w:eastAsia="Times New Roman" w:hAnsi="Times New Roman"/>
+          <w:b/>
+          <w:bCs/>
+          <w:color w:val="0284C7"/>
+          <w:sz w:val="21"/>
+          <w:szCs w:val="21"/>
+        </w:rPr>
+        <w:t xml:space="preserve">• </w:t>
+      </w:r>
+      <w:r>
+        <w:rPr>
+          <w:rFonts w:ascii="Times New Roman" w:cs="Times New Roman" w:eastAsia="Times New Roman" w:hAnsi="Times New Roman"/>
+          <w:b/>
+          <w:bCs/>
+          <w:color w:val="0F172A"/>
+          <w:sz w:val="21"/>
+          <w:szCs w:val="21"/>
+        </w:rPr>
+        <w:t xml:space="preserve">Tra cứu &amp; Tải về: </w:t>
+      </w:r>
+      <w:r>
+        <w:rPr>
+          <w:rFonts w:ascii="Times New Roman" w:cs="Times New Roman" w:eastAsia="Times New Roman" w:hAnsi="Times New Roman"/>
+          <w:color w:val="334155"/>
+          <w:sz w:val="21"/>
+          <w:szCs w:val="21"/>
+        </w:rPr>
+        <w:t xml:space="preserve">Nhân viên tra cứu trực tiếp mọi lúc mọi nơi trên điện thoại hoặc máy tính, tải về các biểu mẫu hành chính chuẩn.</w:t>
+      </w:r>
+    </w:p>
+    <w:p>
+      <w:pPr>
+        <w:spacing w:after="40" w:before="40"/>
+      </w:pPr>
+      <w:r>
+        <w:rPr>
+          <w:rFonts w:ascii="Times New Roman" w:cs="Times New Roman" w:eastAsia="Times New Roman" w:hAnsi="Times New Roman"/>
+          <w:b/>
+          <w:bCs/>
+          <w:color w:val="0284C7"/>
+          <w:sz w:val="21"/>
+          <w:szCs w:val="21"/>
+        </w:rPr>
+        <w:t xml:space="preserve">• </w:t>
+      </w:r>
+      <w:r>
+        <w:rPr>
+          <w:rFonts w:ascii="Times New Roman" w:cs="Times New Roman" w:eastAsia="Times New Roman" w:hAnsi="Times New Roman"/>
+          <w:b/>
+          <w:bCs/>
+          <w:color w:val="0F172A"/>
+          <w:sz w:val="21"/>
+          <w:szCs w:val="21"/>
+        </w:rPr>
+        <w:t xml:space="preserve">Phân quyền áp dụng: </w:t>
+      </w:r>
+      <w:r>
+        <w:rPr>
+          <w:rFonts w:ascii="Times New Roman" w:cs="Times New Roman" w:eastAsia="Times New Roman" w:hAnsi="Times New Roman"/>
+          <w:color w:val="334155"/>
+          <w:sz w:val="21"/>
+          <w:szCs w:val="21"/>
+        </w:rPr>
+        <w:t xml:space="preserve">Tất cả 3 cấp bậc (Admin quản trị thư viện; Manager và Employee tra cứu tải về).</w:t>
+      </w:r>
+    </w:p>
+    <w:p>
+      <w:pPr>
+        <w:spacing w:after="80" w:before="180"/>
+      </w:pPr>
+      <w:r>
+        <w:rPr>
+          <w:rFonts w:ascii="Times New Roman" w:cs="Times New Roman" w:eastAsia="Times New Roman" w:hAnsi="Times New Roman"/>
+          <w:b/>
+          <w:bCs/>
+          <w:color w:val="1E3A8A"/>
+          <w:sz w:val="21"/>
+          <w:szCs w:val="21"/>
+        </w:rPr>
+        <w:t xml:space="preserve">13. ĐÀO TẠO &amp; HỘI NHẬP NHÂN VIÊN MỚI (/training)</w:t>
+      </w:r>
+    </w:p>
+    <w:p>
+      <w:pPr>
+        <w:spacing w:after="40" w:before="40"/>
+      </w:pPr>
+      <w:r>
+        <w:rPr>
+          <w:rFonts w:ascii="Times New Roman" w:cs="Times New Roman" w:eastAsia="Times New Roman" w:hAnsi="Times New Roman"/>
+          <w:b/>
+          <w:bCs/>
+          <w:color w:val="0284C7"/>
+          <w:sz w:val="21"/>
+          <w:szCs w:val="21"/>
+        </w:rPr>
+        <w:t xml:space="preserve">• </w:t>
+      </w:r>
+      <w:r>
+        <w:rPr>
+          <w:rFonts w:ascii="Times New Roman" w:cs="Times New Roman" w:eastAsia="Times New Roman" w:hAnsi="Times New Roman"/>
+          <w:b/>
+          <w:bCs/>
+          <w:color w:val="0F172A"/>
+          <w:sz w:val="21"/>
+          <w:szCs w:val="21"/>
+        </w:rPr>
+        <w:t xml:space="preserve">Giáo trình hội nhập: </w:t>
+      </w:r>
+      <w:r>
+        <w:rPr>
+          <w:rFonts w:ascii="Times New Roman" w:cs="Times New Roman" w:eastAsia="Times New Roman" w:hAnsi="Times New Roman"/>
+          <w:color w:val="334155"/>
+          <w:sz w:val="21"/>
+          <w:szCs w:val="21"/>
+        </w:rPr>
+        <w:t xml:space="preserve">Tích hợp Bộ đào tạo hội nhập Công ty Nệm Việt Á, cẩm nang văn hóa ứng xử, hướng dẫn kỹ thuật xưởng may nệm, xưởng gối và quy trình bán hàng.</w:t>
+      </w:r>
+    </w:p>
+    <w:p>
+      <w:pPr>
+        <w:spacing w:after="40" w:before="40"/>
+      </w:pPr>
+      <w:r>
+        <w:rPr>
+          <w:rFonts w:ascii="Times New Roman" w:cs="Times New Roman" w:eastAsia="Times New Roman" w:hAnsi="Times New Roman"/>
+          <w:b/>
+          <w:bCs/>
+          <w:color w:val="0284C7"/>
+          <w:sz w:val="21"/>
+          <w:szCs w:val="21"/>
+        </w:rPr>
+        <w:t xml:space="preserve">• </w:t>
+      </w:r>
+      <w:r>
+        <w:rPr>
+          <w:rFonts w:ascii="Times New Roman" w:cs="Times New Roman" w:eastAsia="Times New Roman" w:hAnsi="Times New Roman"/>
+          <w:b/>
+          <w:bCs/>
+          <w:color w:val="0F172A"/>
+          <w:sz w:val="21"/>
+          <w:szCs w:val="21"/>
+        </w:rPr>
+        <w:t xml:space="preserve">Theo dõi tiến độ học tập: </w:t>
+      </w:r>
+      <w:r>
+        <w:rPr>
+          <w:rFonts w:ascii="Times New Roman" w:cs="Times New Roman" w:eastAsia="Times New Roman" w:hAnsi="Times New Roman"/>
+          <w:color w:val="334155"/>
+          <w:sz w:val="21"/>
+          <w:szCs w:val="21"/>
+        </w:rPr>
+        <w:t xml:space="preserve">Giúp nhân sự mới nhanh chóng nắm bắt công việc và vượt qua thời gian thử việc thành công.</w:t>
+      </w:r>
+    </w:p>
+    <w:p>
+      <w:pPr>
+        <w:spacing w:after="40" w:before="40"/>
+      </w:pPr>
+      <w:r>
+        <w:rPr>
+          <w:rFonts w:ascii="Times New Roman" w:cs="Times New Roman" w:eastAsia="Times New Roman" w:hAnsi="Times New Roman"/>
+          <w:b/>
+          <w:bCs/>
+          <w:color w:val="0284C7"/>
+          <w:sz w:val="21"/>
+          <w:szCs w:val="21"/>
+        </w:rPr>
+        <w:t xml:space="preserve">• </w:t>
+      </w:r>
+      <w:r>
+        <w:rPr>
+          <w:rFonts w:ascii="Times New Roman" w:cs="Times New Roman" w:eastAsia="Times New Roman" w:hAnsi="Times New Roman"/>
+          <w:b/>
+          <w:bCs/>
+          <w:color w:val="0F172A"/>
+          <w:sz w:val="21"/>
+          <w:szCs w:val="21"/>
+        </w:rPr>
+        <w:t xml:space="preserve">Phân quyền áp dụng: </w:t>
+      </w:r>
+      <w:r>
+        <w:rPr>
+          <w:rFonts w:ascii="Times New Roman" w:cs="Times New Roman" w:eastAsia="Times New Roman" w:hAnsi="Times New Roman"/>
+          <w:color w:val="334155"/>
+          <w:sz w:val="21"/>
+          <w:szCs w:val="21"/>
+        </w:rPr>
+        <w:t xml:space="preserve">Tất cả nhân sự trong công ty.</w:t>
+      </w:r>
+    </w:p>
+    <w:p>
+      <w:pPr>
+        <w:spacing w:after="80" w:before="180"/>
+      </w:pPr>
+      <w:r>
+        <w:rPr>
+          <w:rFonts w:ascii="Times New Roman" w:cs="Times New Roman" w:eastAsia="Times New Roman" w:hAnsi="Times New Roman"/>
+          <w:b/>
+          <w:bCs/>
+          <w:color w:val="1E3A8A"/>
+          <w:sz w:val="21"/>
+          <w:szCs w:val="21"/>
+        </w:rPr>
+        <w:t xml:space="preserve">14. BÁO CÁO THỐNG KÊ QUẢN TRỊ CAO CẤP (/reports)</w:t>
+      </w:r>
+    </w:p>
+    <w:p>
+      <w:pPr>
+        <w:spacing w:after="40" w:before="40"/>
+      </w:pPr>
+      <w:r>
+        <w:rPr>
+          <w:rFonts w:ascii="Times New Roman" w:cs="Times New Roman" w:eastAsia="Times New Roman" w:hAnsi="Times New Roman"/>
+          <w:b/>
+          <w:bCs/>
+          <w:color w:val="0284C7"/>
+          <w:sz w:val="21"/>
+          <w:szCs w:val="21"/>
+        </w:rPr>
+        <w:t xml:space="preserve">• </w:t>
+      </w:r>
+      <w:r>
+        <w:rPr>
+          <w:rFonts w:ascii="Times New Roman" w:cs="Times New Roman" w:eastAsia="Times New Roman" w:hAnsi="Times New Roman"/>
+          <w:b/>
+          <w:bCs/>
+          <w:color w:val="0F172A"/>
+          <w:sz w:val="21"/>
+          <w:szCs w:val="21"/>
+        </w:rPr>
+        <w:t xml:space="preserve">Thống kê nhân lực: </w:t>
+      </w:r>
+      <w:r>
+        <w:rPr>
+          <w:rFonts w:ascii="Times New Roman" w:cs="Times New Roman" w:eastAsia="Times New Roman" w:hAnsi="Times New Roman"/>
+          <w:color w:val="334155"/>
+          <w:sz w:val="21"/>
+          <w:szCs w:val="21"/>
+        </w:rPr>
+        <w:t xml:space="preserve">Phân tích cơ cấu nhân sự theo giới tính, độ tuổi, thâm niên công tác, trình độ và biến động nhân sự vào/ra.</w:t>
+      </w:r>
+    </w:p>
+    <w:p>
+      <w:pPr>
+        <w:spacing w:after="40" w:before="40"/>
+      </w:pPr>
+      <w:r>
+        <w:rPr>
+          <w:rFonts w:ascii="Times New Roman" w:cs="Times New Roman" w:eastAsia="Times New Roman" w:hAnsi="Times New Roman"/>
+          <w:b/>
+          <w:bCs/>
+          <w:color w:val="0284C7"/>
+          <w:sz w:val="21"/>
+          <w:szCs w:val="21"/>
+        </w:rPr>
+        <w:t xml:space="preserve">• </w:t>
+      </w:r>
+      <w:r>
+        <w:rPr>
+          <w:rFonts w:ascii="Times New Roman" w:cs="Times New Roman" w:eastAsia="Times New Roman" w:hAnsi="Times New Roman"/>
+          <w:b/>
+          <w:bCs/>
+          <w:color w:val="0F172A"/>
+          <w:sz w:val="21"/>
+          <w:szCs w:val="21"/>
+        </w:rPr>
+        <w:t xml:space="preserve">Phân tích tài chính nhân sự: </w:t>
+      </w:r>
+      <w:r>
+        <w:rPr>
+          <w:rFonts w:ascii="Times New Roman" w:cs="Times New Roman" w:eastAsia="Times New Roman" w:hAnsi="Times New Roman"/>
+          <w:color w:val="334155"/>
+          <w:sz w:val="21"/>
+          <w:szCs w:val="21"/>
+        </w:rPr>
+        <w:t xml:space="preserve">Báo cáo tổng chi phí quỹ lương theo từng phòng ban, chi phí tăng ca OT, chi phí BHXH và biến động qua các tháng.</w:t>
+      </w:r>
+    </w:p>
+    <w:p>
+      <w:pPr>
+        <w:spacing w:after="40" w:before="40"/>
+      </w:pPr>
+      <w:r>
+        <w:rPr>
+          <w:rFonts w:ascii="Times New Roman" w:cs="Times New Roman" w:eastAsia="Times New Roman" w:hAnsi="Times New Roman"/>
+          <w:b/>
+          <w:bCs/>
+          <w:color w:val="0284C7"/>
+          <w:sz w:val="21"/>
+          <w:szCs w:val="21"/>
+        </w:rPr>
+        <w:t xml:space="preserve">• </w:t>
+      </w:r>
+      <w:r>
+        <w:rPr>
+          <w:rFonts w:ascii="Times New Roman" w:cs="Times New Roman" w:eastAsia="Times New Roman" w:hAnsi="Times New Roman"/>
+          <w:b/>
+          <w:bCs/>
+          <w:color w:val="0F172A"/>
+          <w:sz w:val="21"/>
+          <w:szCs w:val="21"/>
+        </w:rPr>
+        <w:t xml:space="preserve">Phân quyền áp dụng: </w:t>
+      </w:r>
+      <w:r>
+        <w:rPr>
+          <w:rFonts w:ascii="Times New Roman" w:cs="Times New Roman" w:eastAsia="Times New Roman" w:hAnsi="Times New Roman"/>
+          <w:color w:val="334155"/>
+          <w:sz w:val="21"/>
+          <w:szCs w:val="21"/>
+        </w:rPr>
+        <w:t xml:space="preserve">Chỉ Cấp 1 - Admin và Cấp 2 - Manager.</w:t>
+      </w:r>
+    </w:p>
+    <w:p>
+      <w:pPr>
+        <w:spacing w:after="80" w:before="180"/>
+      </w:pPr>
+      <w:r>
+        <w:rPr>
+          <w:rFonts w:ascii="Times New Roman" w:cs="Times New Roman" w:eastAsia="Times New Roman" w:hAnsi="Times New Roman"/>
+          <w:b/>
+          <w:bCs/>
+          <w:color w:val="1E3A8A"/>
+          <w:sz w:val="21"/>
+          <w:szCs w:val="21"/>
+        </w:rPr>
+        <w:t xml:space="preserve">15. PHÂN QUYỀN &amp; QUẢN TRỊ TÀI KHOẢN NGƯỜI DÙNG (/users)</w:t>
+      </w:r>
+    </w:p>
+    <w:p>
+      <w:pPr>
+        <w:spacing w:after="40" w:before="40"/>
+      </w:pPr>
+      <w:r>
+        <w:rPr>
+          <w:rFonts w:ascii="Times New Roman" w:cs="Times New Roman" w:eastAsia="Times New Roman" w:hAnsi="Times New Roman"/>
+          <w:b/>
+          <w:bCs/>
+          <w:color w:val="0284C7"/>
+          <w:sz w:val="21"/>
+          <w:szCs w:val="21"/>
+        </w:rPr>
+        <w:t xml:space="preserve">• </w:t>
+      </w:r>
+      <w:r>
+        <w:rPr>
+          <w:rFonts w:ascii="Times New Roman" w:cs="Times New Roman" w:eastAsia="Times New Roman" w:hAnsi="Times New Roman"/>
+          <w:b/>
+          <w:bCs/>
+          <w:color w:val="0F172A"/>
+          <w:sz w:val="21"/>
+          <w:szCs w:val="21"/>
+        </w:rPr>
+        <w:t xml:space="preserve">Quản lý 57 tài khoản: </w:t>
+      </w:r>
+      <w:r>
+        <w:rPr>
+          <w:rFonts w:ascii="Times New Roman" w:cs="Times New Roman" w:eastAsia="Times New Roman" w:hAnsi="Times New Roman"/>
+          <w:color w:val="334155"/>
+          <w:sz w:val="21"/>
+          <w:szCs w:val="21"/>
+        </w:rPr>
+        <w:t xml:space="preserve">Gán quyền 3 Cấp độ chuẩn (Admin, Manager, Employee), khóa tài khoản khi nhân viên nghỉ việc, cấp lại mật khẩu bảo mật cao.</w:t>
+      </w:r>
+    </w:p>
+    <w:p>
+      <w:pPr>
+        <w:spacing w:after="40" w:before="40"/>
+      </w:pPr>
+      <w:r>
+        <w:rPr>
+          <w:rFonts w:ascii="Times New Roman" w:cs="Times New Roman" w:eastAsia="Times New Roman" w:hAnsi="Times New Roman"/>
+          <w:b/>
+          <w:bCs/>
+          <w:color w:val="0284C7"/>
+          <w:sz w:val="21"/>
+          <w:szCs w:val="21"/>
+        </w:rPr>
+        <w:t xml:space="preserve">• </w:t>
+      </w:r>
+      <w:r>
+        <w:rPr>
+          <w:rFonts w:ascii="Times New Roman" w:cs="Times New Roman" w:eastAsia="Times New Roman" w:hAnsi="Times New Roman"/>
+          <w:b/>
+          <w:bCs/>
+          <w:color w:val="0F172A"/>
+          <w:sz w:val="21"/>
+          <w:szCs w:val="21"/>
+        </w:rPr>
+        <w:t xml:space="preserve">Phân quyền áp dụng: </w:t>
+      </w:r>
+      <w:r>
+        <w:rPr>
+          <w:rFonts w:ascii="Times New Roman" w:cs="Times New Roman" w:eastAsia="Times New Roman" w:hAnsi="Times New Roman"/>
+          <w:color w:val="334155"/>
+          <w:sz w:val="21"/>
+          <w:szCs w:val="21"/>
+        </w:rPr>
+        <w:t xml:space="preserve">Chỉ Cấp 1 - Admin (Phòng HCNS &amp; IT).</w:t>
+      </w:r>
+    </w:p>
+    <w:p>
+      <w:pPr>
+        <w:spacing w:after="80" w:before="180"/>
+      </w:pPr>
+      <w:r>
+        <w:rPr>
+          <w:rFonts w:ascii="Times New Roman" w:cs="Times New Roman" w:eastAsia="Times New Roman" w:hAnsi="Times New Roman"/>
+          <w:b/>
+          <w:bCs/>
+          <w:color w:val="1E3A8A"/>
+          <w:sz w:val="21"/>
+          <w:szCs w:val="21"/>
+        </w:rPr>
+        <w:t xml:space="preserve">16. NHẬT KÝ HỆ THỐNG &amp; SAO LƯU DỮ LIỆU (/audit-logs, /backup)</w:t>
+      </w:r>
+    </w:p>
+    <w:p>
+      <w:pPr>
+        <w:spacing w:after="40" w:before="40"/>
+      </w:pPr>
+      <w:r>
+        <w:rPr>
+          <w:rFonts w:ascii="Times New Roman" w:cs="Times New Roman" w:eastAsia="Times New Roman" w:hAnsi="Times New Roman"/>
+          <w:b/>
+          <w:bCs/>
+          <w:color w:val="0284C7"/>
+          <w:sz w:val="21"/>
+          <w:szCs w:val="21"/>
+        </w:rPr>
+        <w:t xml:space="preserve">• </w:t>
+      </w:r>
+      <w:r>
+        <w:rPr>
+          <w:rFonts w:ascii="Times New Roman" w:cs="Times New Roman" w:eastAsia="Times New Roman" w:hAnsi="Times New Roman"/>
+          <w:b/>
+          <w:bCs/>
+          <w:color w:val="0F172A"/>
+          <w:sz w:val="21"/>
+          <w:szCs w:val="21"/>
+        </w:rPr>
+        <w:t xml:space="preserve">Nhật ký Audit Log: </w:t>
+      </w:r>
+      <w:r>
+        <w:rPr>
+          <w:rFonts w:ascii="Times New Roman" w:cs="Times New Roman" w:eastAsia="Times New Roman" w:hAnsi="Times New Roman"/>
+          <w:color w:val="334155"/>
+          <w:sz w:val="21"/>
+          <w:szCs w:val="21"/>
+        </w:rPr>
+        <w:t xml:space="preserve">Ghi nhận 100% thao tác nhạy cảm (thêm/sửa nhân viên, tính lương, đổi mật khẩu, phê duyệt đơn từ) phục vụ tra cứu bảo mật.</w:t>
+      </w:r>
+    </w:p>
+    <w:p>
+      <w:pPr>
+        <w:spacing w:after="40" w:before="40"/>
+      </w:pPr>
+      <w:r>
+        <w:rPr>
+          <w:rFonts w:ascii="Times New Roman" w:cs="Times New Roman" w:eastAsia="Times New Roman" w:hAnsi="Times New Roman"/>
+          <w:b/>
+          <w:bCs/>
+          <w:color w:val="0284C7"/>
+          <w:sz w:val="21"/>
+          <w:szCs w:val="21"/>
+        </w:rPr>
+        <w:t xml:space="preserve">• </w:t>
+      </w:r>
+      <w:r>
+        <w:rPr>
+          <w:rFonts w:ascii="Times New Roman" w:cs="Times New Roman" w:eastAsia="Times New Roman" w:hAnsi="Times New Roman"/>
+          <w:b/>
+          <w:bCs/>
+          <w:color w:val="0F172A"/>
+          <w:sz w:val="21"/>
+          <w:szCs w:val="21"/>
+        </w:rPr>
+        <w:t xml:space="preserve">Sao lưu &amp; Khôi phục (Backup): </w:t>
+      </w:r>
+      <w:r>
+        <w:rPr>
+          <w:rFonts w:ascii="Times New Roman" w:cs="Times New Roman" w:eastAsia="Times New Roman" w:hAnsi="Times New Roman"/>
+          <w:color w:val="334155"/>
+          <w:sz w:val="21"/>
+          <w:szCs w:val="21"/>
+        </w:rPr>
+        <w:t xml:space="preserve">Tải bản backup Database SQLite định kỳ về máy tính lưu trữ an toàn, khôi phục dữ liệu 1-click khi cần thiết.</w:t>
+      </w:r>
+    </w:p>
+    <w:p>
+      <w:pPr>
+        <w:spacing w:after="40" w:before="40"/>
+      </w:pPr>
+      <w:r>
+        <w:rPr>
+          <w:rFonts w:ascii="Times New Roman" w:cs="Times New Roman" w:eastAsia="Times New Roman" w:hAnsi="Times New Roman"/>
+          <w:b/>
+          <w:bCs/>
+          <w:color w:val="0284C7"/>
+          <w:sz w:val="21"/>
+          <w:szCs w:val="21"/>
+        </w:rPr>
+        <w:t xml:space="preserve">• </w:t>
+      </w:r>
+      <w:r>
+        <w:rPr>
+          <w:rFonts w:ascii="Times New Roman" w:cs="Times New Roman" w:eastAsia="Times New Roman" w:hAnsi="Times New Roman"/>
+          <w:b/>
+          <w:bCs/>
+          <w:color w:val="0F172A"/>
+          <w:sz w:val="21"/>
+          <w:szCs w:val="21"/>
+        </w:rPr>
+        <w:t xml:space="preserve">Phân quyền áp dụng: </w:t>
+      </w:r>
+      <w:r>
+        <w:rPr>
+          <w:rFonts w:ascii="Times New Roman" w:cs="Times New Roman" w:eastAsia="Times New Roman" w:hAnsi="Times New Roman"/>
+          <w:color w:val="334155"/>
+          <w:sz w:val="21"/>
+          <w:szCs w:val="21"/>
+        </w:rPr>
+        <w:t xml:space="preserve">Chỉ Cấp 1 - Admin.</w:t>
+      </w:r>
+    </w:p>
+    <w:p>
+      <w:pPr>
+        <w:spacing w:after="120" w:before="280"/>
       </w:pPr>
       <w:r>
         <w:rPr>
@@ -1735,7 +3022,7 @@
     </w:p>
     <w:p>
       <w:pPr>
-        <w:spacing w:after="80" w:before="160"/>
+        <w:spacing w:after="80" w:before="180"/>
       </w:pPr>
       <w:r>
         <w:rPr>
@@ -2596,7 +3883,7 @@
     </w:tbl>
     <w:p>
       <w:pPr>
-        <w:spacing w:after="80" w:before="160"/>
+        <w:spacing w:after="80" w:before="180"/>
       </w:pPr>
       <w:r>
         <w:rPr>
@@ -4482,7 +5769,7 @@
     </w:tbl>
     <w:p>
       <w:pPr>
-        <w:spacing w:after="80" w:before="160"/>
+        <w:spacing w:after="80" w:before="180"/>
       </w:pPr>
       <w:r>
         <w:rPr>
@@ -14158,7 +15445,7 @@
     </w:tbl>
     <w:p>
       <w:pPr>
-        <w:spacing w:after="80" w:before="160"/>
+        <w:spacing w:after="80" w:before="180"/>
       </w:pPr>
       <w:r>
         <w:rPr>
@@ -26089,7 +27376,7 @@
     </w:tbl>
     <w:p>
       <w:pPr>
-        <w:spacing w:after="120" w:before="260"/>
+        <w:spacing w:after="120" w:before="280"/>
       </w:pPr>
       <w:r>
         <w:rPr>
@@ -26403,7 +27690,8 @@
               </w:rPr>
               <w:t xml:space="preserve">1. Vào /payroll kiểm tra bảng lương
 2. Vào /employees xem danh sách
-3. Vào /attendance duyệt đơn</w:t>
+3. Vào /attendance duyệt đơn
+4. Vào /kpi chốt điểm tháng</w:t>
             </w:r>
           </w:p>
         </w:tc>
@@ -26432,9 +27720,10 @@
                 <w:sz w:val="19"/>
                 <w:szCs w:val="19"/>
               </w:rPr>
-              <w:t xml:space="preserve">✓ Thấy 100% 57 nhân sự &amp; toàn bộ 11 phòng ban
-✓ Tính được bảng lương toàn công ty
-✓ Duyệt được tất cả đơn từ</w:t>
+              <w:t xml:space="preserve">✓ Thấy 100% 57 nhân sự &amp; 11 phòng ban
+✓ Tính toán và xuất Excel lương toàn cty
+✓ Duyệt đơn phép toàn bộ nhân viên
+✓ Toàn quyền thiết lập &amp; chốt KPI</w:t>
             </w:r>
           </w:p>
         </w:tc>
@@ -26554,9 +27843,10 @@
                 <w:sz w:val="19"/>
                 <w:szCs w:val="19"/>
               </w:rPr>
-              <w:t xml:space="preserve">1. Vào /payroll xem lương phòng ban
+              <w:t xml:space="preserve">1. Vào /payroll xem lương phòng KD
 2. Vào /payroll xem phiếu cá nhân
-3. Thử xem lương phòng khác hoặc BGĐ</w:t>
+3. Thử xem lương phòng khác/BGĐ
+4. Vào /kpi chấm điểm phòng KD</w:t>
             </w:r>
           </w:p>
         </w:tc>
@@ -26587,7 +27877,8 @@
               </w:rPr>
               <w:t xml:space="preserve">✓ Thấy 7 nhân sự Phòng Kinh doanh
 ✓ Xem được phiếu lương của chính mình
-🔒 Ẩn hoàn toàn lương Ban Giám Đốc và phòng khác</w:t>
+🔒 Ẩn hoàn toàn lương Ban Giám Đốc &amp; phòng khác
+✓ Chấm điểm đúng 7 nhân sự kinh doanh</w:t>
             </w:r>
           </w:p>
         </w:tc>
@@ -26707,9 +27998,9 @@
                 <w:sz w:val="19"/>
                 <w:szCs w:val="19"/>
               </w:rPr>
-              <w:t xml:space="preserve">1. Vào /attendance chấm công
+              <w:t xml:space="preserve">1. Vào /attendance chấm công kho
 2. Vào /kpi chấm điểm tháng
-3. Vào /payroll kiểm tra</w:t>
+3. Vào /payroll kiểm tra lương</w:t>
             </w:r>
           </w:p>
         </w:tc>
@@ -26862,7 +28153,8 @@
               </w:rPr>
               <w:t xml:space="preserve">1. Vào /payroll xem bảng lương
 2. Vào /attendance gửi đơn phép
-3. Vào /employees xem danh bạ</w:t>
+3. Thử tìm menu /kpi và /employees
+4. Vào /innovations gửi sáng kiến</w:t>
             </w:r>
           </w:p>
         </w:tc>
@@ -26891,9 +28183,10 @@
                 <w:sz w:val="19"/>
                 <w:szCs w:val="19"/>
               </w:rPr>
-              <w:t xml:space="preserve">✓ Chỉ xuất hiện duy nhất 1 phiếu lương của mình
+              <w:t xml:space="preserve">✓ Chỉ thấy duy nhất 1 phiếu lương của mình
 ✓ Gửi đơn phép thành công về Trưởng phòng
-🔒 Ẩn 100% mức lương người khác</w:t>
+🔒 Ẩn hoàn toàn menu KPI &amp; menu Hồ sơ nhân viên
+✓ Gửi được sáng kiến ẩn danh/hiện danh</w:t>
             </w:r>
           </w:p>
         </w:tc>
@@ -26901,7 +28194,7 @@
     </w:tbl>
     <w:p>
       <w:pPr>
-        <w:spacing w:after="120" w:before="260"/>
+        <w:spacing w:after="120" w:before="280"/>
       </w:pPr>
       <w:r>
         <w:rPr>

</xml_diff>

<commit_message>
chore: update Tran Thi Bao Chau to Level 3 Employee role and sync handover docs
</commit_message>
<xml_diff>
--- a/HO_SO_BAN_GIAO_VA_HUONG_DAN_SU_DUNG_HRM_VIET_A.docx
+++ b/HO_SO_BAN_GIAO_VA_HUONG_DAN_SU_DUNG_HRM_VIET_A.docx
@@ -5561,211 +5561,6 @@
           </w:p>
         </w:tc>
       </w:tr>
-      <w:tr>
-        <w:tc>
-          <w:tcPr>
-            <w:tcW w:type="pct" w:w="5%"/>
-            <w:tcBorders>
-              <w:top w:val="single" w:color="CBD5E1" w:sz="4"/>
-              <w:left w:val="single" w:color="CBD5E1" w:sz="4"/>
-              <w:bottom w:val="single" w:color="CBD5E1" w:sz="4"/>
-              <w:right w:val="single" w:color="CBD5E1" w:sz="4"/>
-            </w:tcBorders>
-            <w:shd w:fill="F8FAFC" w:val="clear"/>
-          </w:tcPr>
-          <w:p>
-            <w:pPr>
-              <w:spacing w:after="70" w:before="70"/>
-              <w:jc w:val="center"/>
-            </w:pPr>
-            <w:r>
-              <w:rPr>
-                <w:rFonts w:ascii="Times New Roman" w:cs="Times New Roman" w:eastAsia="Times New Roman" w:hAnsi="Times New Roman"/>
-                <w:b w:val="false"/>
-                <w:bCs w:val="false"/>
-                <w:color w:val="333333"/>
-                <w:sz w:val="19"/>
-                <w:szCs w:val="19"/>
-              </w:rPr>
-              <w:t xml:space="preserve">8</w:t>
-            </w:r>
-          </w:p>
-        </w:tc>
-        <w:tc>
-          <w:tcPr>
-            <w:tcW w:type="pct" w:w="12%"/>
-            <w:tcBorders>
-              <w:top w:val="single" w:color="CBD5E1" w:sz="4"/>
-              <w:left w:val="single" w:color="CBD5E1" w:sz="4"/>
-              <w:bottom w:val="single" w:color="CBD5E1" w:sz="4"/>
-              <w:right w:val="single" w:color="CBD5E1" w:sz="4"/>
-            </w:tcBorders>
-            <w:shd w:fill="F8FAFC" w:val="clear"/>
-          </w:tcPr>
-          <w:p>
-            <w:pPr>
-              <w:spacing w:after="70" w:before="70"/>
-              <w:jc w:val="center"/>
-            </w:pPr>
-            <w:r>
-              <w:rPr>
-                <w:rFonts w:ascii="Times New Roman" w:cs="Times New Roman" w:eastAsia="Times New Roman" w:hAnsi="Times New Roman"/>
-                <w:b w:val="false"/>
-                <w:bCs w:val="false"/>
-                <w:color w:val="475569"/>
-                <w:sz w:val="19"/>
-                <w:szCs w:val="19"/>
-              </w:rPr>
-              <w:t xml:space="preserve">VietA 056</w:t>
-            </w:r>
-          </w:p>
-        </w:tc>
-        <w:tc>
-          <w:tcPr>
-            <w:tcW w:type="pct" w:w="14%"/>
-            <w:tcBorders>
-              <w:top w:val="single" w:color="CBD5E1" w:sz="4"/>
-              <w:left w:val="single" w:color="CBD5E1" w:sz="4"/>
-              <w:bottom w:val="single" w:color="CBD5E1" w:sz="4"/>
-              <w:right w:val="single" w:color="CBD5E1" w:sz="4"/>
-            </w:tcBorders>
-            <w:shd w:fill="F8FAFC" w:val="clear"/>
-          </w:tcPr>
-          <w:p>
-            <w:pPr>
-              <w:spacing w:after="70" w:before="70"/>
-              <w:jc w:val="left"/>
-            </w:pPr>
-            <w:r>
-              <w:rPr>
-                <w:rFonts w:ascii="Times New Roman" w:cs="Times New Roman" w:eastAsia="Times New Roman" w:hAnsi="Times New Roman"/>
-                <w:b/>
-                <w:bCs/>
-                <w:color w:val="0F172A"/>
-                <w:sz w:val="19"/>
-                <w:szCs w:val="19"/>
-              </w:rPr>
-              <w:t xml:space="preserve">vieta056</w:t>
-            </w:r>
-          </w:p>
-        </w:tc>
-        <w:tc>
-          <w:tcPr>
-            <w:tcW w:type="pct" w:w="18%"/>
-            <w:tcBorders>
-              <w:top w:val="single" w:color="CBD5E1" w:sz="4"/>
-              <w:left w:val="single" w:color="CBD5E1" w:sz="4"/>
-              <w:bottom w:val="single" w:color="CBD5E1" w:sz="4"/>
-              <w:right w:val="single" w:color="CBD5E1" w:sz="4"/>
-            </w:tcBorders>
-            <w:shd w:fill="F8FAFC" w:val="clear"/>
-          </w:tcPr>
-          <w:p>
-            <w:pPr>
-              <w:spacing w:after="70" w:before="70"/>
-              <w:jc w:val="left"/>
-            </w:pPr>
-            <w:r>
-              <w:rPr>
-                <w:rFonts w:ascii="Times New Roman" w:cs="Times New Roman" w:eastAsia="Times New Roman" w:hAnsi="Times New Roman"/>
-                <w:b/>
-                <w:bCs/>
-                <w:color w:val="1E293B"/>
-                <w:sz w:val="19"/>
-                <w:szCs w:val="19"/>
-              </w:rPr>
-              <w:t xml:space="preserve">Trần Thị Bảo Châu</w:t>
-            </w:r>
-          </w:p>
-        </w:tc>
-        <w:tc>
-          <w:tcPr>
-            <w:tcW w:type="pct" w:w="17%"/>
-            <w:tcBorders>
-              <w:top w:val="single" w:color="CBD5E1" w:sz="4"/>
-              <w:left w:val="single" w:color="CBD5E1" w:sz="4"/>
-              <w:bottom w:val="single" w:color="CBD5E1" w:sz="4"/>
-              <w:right w:val="single" w:color="CBD5E1" w:sz="4"/>
-            </w:tcBorders>
-            <w:shd w:fill="F8FAFC" w:val="clear"/>
-          </w:tcPr>
-          <w:p>
-            <w:pPr>
-              <w:spacing w:after="70" w:before="70"/>
-              <w:jc w:val="left"/>
-            </w:pPr>
-            <w:r>
-              <w:rPr>
-                <w:rFonts w:ascii="Times New Roman" w:cs="Times New Roman" w:eastAsia="Times New Roman" w:hAnsi="Times New Roman"/>
-                <w:b w:val="false"/>
-                <w:bCs w:val="false"/>
-                <w:color w:val="334155"/>
-                <w:sz w:val="19"/>
-                <w:szCs w:val="19"/>
-              </w:rPr>
-              <w:t xml:space="preserve">Xưởng sản xuất nệm</w:t>
-            </w:r>
-          </w:p>
-        </w:tc>
-        <w:tc>
-          <w:tcPr>
-            <w:tcW w:type="pct" w:w="16%"/>
-            <w:tcBorders>
-              <w:top w:val="single" w:color="CBD5E1" w:sz="4"/>
-              <w:left w:val="single" w:color="CBD5E1" w:sz="4"/>
-              <w:bottom w:val="single" w:color="CBD5E1" w:sz="4"/>
-              <w:right w:val="single" w:color="CBD5E1" w:sz="4"/>
-            </w:tcBorders>
-            <w:shd w:fill="F8FAFC" w:val="clear"/>
-          </w:tcPr>
-          <w:p>
-            <w:pPr>
-              <w:spacing w:after="70" w:before="70"/>
-              <w:jc w:val="left"/>
-            </w:pPr>
-            <w:r>
-              <w:rPr>
-                <w:rFonts w:ascii="Times New Roman" w:cs="Times New Roman" w:eastAsia="Times New Roman" w:hAnsi="Times New Roman"/>
-                <w:b w:val="false"/>
-                <w:bCs w:val="false"/>
-                <w:color w:val="475569"/>
-                <w:sz w:val="19"/>
-                <w:szCs w:val="19"/>
-              </w:rPr>
-              <w:t xml:space="preserve">Kế toán xưởng sản xuất</w:t>
-            </w:r>
-          </w:p>
-        </w:tc>
-        <w:tc>
-          <w:tcPr>
-            <w:tcW w:type="pct" w:w="18%"/>
-            <w:tcBorders>
-              <w:top w:val="single" w:color="CBD5E1" w:sz="4"/>
-              <w:left w:val="single" w:color="CBD5E1" w:sz="4"/>
-              <w:bottom w:val="single" w:color="CBD5E1" w:sz="4"/>
-              <w:right w:val="single" w:color="CBD5E1" w:sz="4"/>
-            </w:tcBorders>
-            <w:shd w:fill="F8FAFC" w:val="clear"/>
-          </w:tcPr>
-          <w:p>
-            <w:pPr>
-              <w:spacing w:after="70" w:before="70"/>
-              <w:jc w:val="center"/>
-            </w:pPr>
-            <w:r>
-              <w:rPr>
-                <w:rFonts w:ascii="Times New Roman" w:cs="Times New Roman" w:eastAsia="Times New Roman" w:hAnsi="Times New Roman"/>
-                <w:b/>
-                <w:bCs/>
-                <w:color w:val="059669"/>
-                <w:sz w:val="19"/>
-                <w:szCs w:val="19"/>
-              </w:rPr>
-              <w:t xml:space="preserve">VietA#Mgr@056$9Q</w:t>
-            </w:r>
-          </w:p>
-        </w:tc>
-      </w:tr>
     </w:tbl>
     <w:p>
       <w:pPr>
@@ -12832,7 +12627,7 @@
                 <w:sz w:val="19"/>
                 <w:szCs w:val="19"/>
               </w:rPr>
-              <w:t xml:space="preserve">VietA 058</w:t>
+              <w:t xml:space="preserve">VietA 056</w:t>
             </w:r>
           </w:p>
         </w:tc>
@@ -12861,7 +12656,7 @@
                 <w:sz w:val="19"/>
                 <w:szCs w:val="19"/>
               </w:rPr>
-              <w:t xml:space="preserve">vieta058</w:t>
+              <w:t xml:space="preserve">vieta056</w:t>
             </w:r>
           </w:p>
         </w:tc>
@@ -12890,7 +12685,7 @@
                 <w:sz w:val="19"/>
                 <w:szCs w:val="19"/>
               </w:rPr>
-              <w:t xml:space="preserve">Nguyễn Thị Kim Hòa</w:t>
+              <w:t xml:space="preserve">Trần Thị Bảo Châu</w:t>
             </w:r>
           </w:p>
         </w:tc>
@@ -12948,7 +12743,7 @@
                 <w:sz w:val="19"/>
                 <w:szCs w:val="19"/>
               </w:rPr>
-              <w:t xml:space="preserve">Nhân viên may tay</w:t>
+              <w:t xml:space="preserve">Kế toán xưởng sản xuất</w:t>
             </w:r>
           </w:p>
         </w:tc>
@@ -12977,7 +12772,7 @@
                 <w:sz w:val="19"/>
                 <w:szCs w:val="19"/>
               </w:rPr>
-              <w:t xml:space="preserve">VietA#Emp@058*7W</w:t>
+              <w:t xml:space="preserve">VietA#Emp@056*7W</w:t>
             </w:r>
           </w:p>
         </w:tc>
@@ -13037,7 +12832,7 @@
                 <w:sz w:val="19"/>
                 <w:szCs w:val="19"/>
               </w:rPr>
-              <w:t xml:space="preserve">VietA 060</w:t>
+              <w:t xml:space="preserve">VietA 058</w:t>
             </w:r>
           </w:p>
         </w:tc>
@@ -13066,7 +12861,7 @@
                 <w:sz w:val="19"/>
                 <w:szCs w:val="19"/>
               </w:rPr>
-              <w:t xml:space="preserve">vieta060</w:t>
+              <w:t xml:space="preserve">vieta058</w:t>
             </w:r>
           </w:p>
         </w:tc>
@@ -13095,7 +12890,7 @@
                 <w:sz w:val="19"/>
                 <w:szCs w:val="19"/>
               </w:rPr>
-              <w:t xml:space="preserve">Trần Thị Kim Quyên</w:t>
+              <w:t xml:space="preserve">Nguyễn Thị Kim Hòa</w:t>
             </w:r>
           </w:p>
         </w:tc>
@@ -13153,7 +12948,7 @@
                 <w:sz w:val="19"/>
                 <w:szCs w:val="19"/>
               </w:rPr>
-              <w:t xml:space="preserve">Nhân viên may một kim</w:t>
+              <w:t xml:space="preserve">Nhân viên may tay</w:t>
             </w:r>
           </w:p>
         </w:tc>
@@ -13182,7 +12977,7 @@
                 <w:sz w:val="19"/>
                 <w:szCs w:val="19"/>
               </w:rPr>
-              <w:t xml:space="preserve">VietA#Emp@060*7W</w:t>
+              <w:t xml:space="preserve">VietA#Emp@058*7W</w:t>
             </w:r>
           </w:p>
         </w:tc>
@@ -13242,7 +13037,7 @@
                 <w:sz w:val="19"/>
                 <w:szCs w:val="19"/>
               </w:rPr>
-              <w:t xml:space="preserve">VietA 061</w:t>
+              <w:t xml:space="preserve">VietA 060</w:t>
             </w:r>
           </w:p>
         </w:tc>
@@ -13271,7 +13066,7 @@
                 <w:sz w:val="19"/>
                 <w:szCs w:val="19"/>
               </w:rPr>
-              <w:t xml:space="preserve">vieta061</w:t>
+              <w:t xml:space="preserve">vieta060</w:t>
             </w:r>
           </w:p>
         </w:tc>
@@ -13300,7 +13095,7 @@
                 <w:sz w:val="19"/>
                 <w:szCs w:val="19"/>
               </w:rPr>
-              <w:t xml:space="preserve">Lê Thanh Hồng</w:t>
+              <w:t xml:space="preserve">Trần Thị Kim Quyên</w:t>
             </w:r>
           </w:p>
         </w:tc>
@@ -13387,7 +13182,7 @@
                 <w:sz w:val="19"/>
                 <w:szCs w:val="19"/>
               </w:rPr>
-              <w:t xml:space="preserve">VietA#Emp@061*7W</w:t>
+              <w:t xml:space="preserve">VietA#Emp@060*7W</w:t>
             </w:r>
           </w:p>
         </w:tc>
@@ -13447,7 +13242,7 @@
                 <w:sz w:val="19"/>
                 <w:szCs w:val="19"/>
               </w:rPr>
-              <w:t xml:space="preserve">VietA 063</w:t>
+              <w:t xml:space="preserve">VietA 061</w:t>
             </w:r>
           </w:p>
         </w:tc>
@@ -13476,7 +13271,7 @@
                 <w:sz w:val="19"/>
                 <w:szCs w:val="19"/>
               </w:rPr>
-              <w:t xml:space="preserve">vieta063</w:t>
+              <w:t xml:space="preserve">vieta061</w:t>
             </w:r>
           </w:p>
         </w:tc>
@@ -13505,7 +13300,7 @@
                 <w:sz w:val="19"/>
                 <w:szCs w:val="19"/>
               </w:rPr>
-              <w:t xml:space="preserve">Lê Ngọc Tuấn</w:t>
+              <w:t xml:space="preserve">Lê Thanh Hồng</w:t>
             </w:r>
           </w:p>
         </w:tc>
@@ -13563,7 +13358,7 @@
                 <w:sz w:val="19"/>
                 <w:szCs w:val="19"/>
               </w:rPr>
-              <w:t xml:space="preserve">Nhân viên vô vali</w:t>
+              <w:t xml:space="preserve">Nhân viên may một kim</w:t>
             </w:r>
           </w:p>
         </w:tc>
@@ -13592,7 +13387,7 @@
                 <w:sz w:val="19"/>
                 <w:szCs w:val="19"/>
               </w:rPr>
-              <w:t xml:space="preserve">VietA#Emp@063*7W</w:t>
+              <w:t xml:space="preserve">VietA#Emp@061*7W</w:t>
             </w:r>
           </w:p>
         </w:tc>
@@ -13652,7 +13447,7 @@
                 <w:sz w:val="19"/>
                 <w:szCs w:val="19"/>
               </w:rPr>
-              <w:t xml:space="preserve">VietA 066</w:t>
+              <w:t xml:space="preserve">VietA 063</w:t>
             </w:r>
           </w:p>
         </w:tc>
@@ -13681,7 +13476,7 @@
                 <w:sz w:val="19"/>
                 <w:szCs w:val="19"/>
               </w:rPr>
-              <w:t xml:space="preserve">vieta066</w:t>
+              <w:t xml:space="preserve">vieta063</w:t>
             </w:r>
           </w:p>
         </w:tc>
@@ -13710,7 +13505,7 @@
                 <w:sz w:val="19"/>
                 <w:szCs w:val="19"/>
               </w:rPr>
-              <w:t xml:space="preserve">Nguyễn Thị Thùy Trang</w:t>
+              <w:t xml:space="preserve">Lê Ngọc Tuấn</w:t>
             </w:r>
           </w:p>
         </w:tc>
@@ -13768,7 +13563,7 @@
                 <w:sz w:val="19"/>
                 <w:szCs w:val="19"/>
               </w:rPr>
-              <w:t xml:space="preserve">Kế toán xưởng sản xuất</w:t>
+              <w:t xml:space="preserve">Nhân viên vô vali</w:t>
             </w:r>
           </w:p>
         </w:tc>
@@ -13797,7 +13592,7 @@
                 <w:sz w:val="19"/>
                 <w:szCs w:val="19"/>
               </w:rPr>
-              <w:t xml:space="preserve">VietA#Emp@066*7W</w:t>
+              <w:t xml:space="preserve">VietA#Emp@063*7W</w:t>
             </w:r>
           </w:p>
         </w:tc>
@@ -13857,7 +13652,7 @@
                 <w:sz w:val="19"/>
                 <w:szCs w:val="19"/>
               </w:rPr>
-              <w:t xml:space="preserve">VietA 069</w:t>
+              <w:t xml:space="preserve">VietA 066</w:t>
             </w:r>
           </w:p>
         </w:tc>
@@ -13886,7 +13681,7 @@
                 <w:sz w:val="19"/>
                 <w:szCs w:val="19"/>
               </w:rPr>
-              <w:t xml:space="preserve">vieta069</w:t>
+              <w:t xml:space="preserve">vieta066</w:t>
             </w:r>
           </w:p>
         </w:tc>
@@ -13915,7 +13710,7 @@
                 <w:sz w:val="19"/>
                 <w:szCs w:val="19"/>
               </w:rPr>
-              <w:t xml:space="preserve">Trương Hồng Quân</w:t>
+              <w:t xml:space="preserve">Nguyễn Thị Thùy Trang</w:t>
             </w:r>
           </w:p>
         </w:tc>
@@ -13944,7 +13739,7 @@
                 <w:sz w:val="19"/>
                 <w:szCs w:val="19"/>
               </w:rPr>
-              <w:t xml:space="preserve">Kho Mỹ Tho</w:t>
+              <w:t xml:space="preserve">Xưởng sản xuất nệm</w:t>
             </w:r>
           </w:p>
         </w:tc>
@@ -13973,7 +13768,7 @@
                 <w:sz w:val="19"/>
                 <w:szCs w:val="19"/>
               </w:rPr>
-              <w:t xml:space="preserve">Tài xế Mỹ Tho</w:t>
+              <w:t xml:space="preserve">Kế toán xưởng sản xuất</w:t>
             </w:r>
           </w:p>
         </w:tc>
@@ -14002,7 +13797,7 @@
                 <w:sz w:val="19"/>
                 <w:szCs w:val="19"/>
               </w:rPr>
-              <w:t xml:space="preserve">VietA#Emp@069*7W</w:t>
+              <w:t xml:space="preserve">VietA#Emp@066*7W</w:t>
             </w:r>
           </w:p>
         </w:tc>
@@ -14062,7 +13857,7 @@
                 <w:sz w:val="19"/>
                 <w:szCs w:val="19"/>
               </w:rPr>
-              <w:t xml:space="preserve">VietA 070</w:t>
+              <w:t xml:space="preserve">VietA 069</w:t>
             </w:r>
           </w:p>
         </w:tc>
@@ -14091,7 +13886,7 @@
                 <w:sz w:val="19"/>
                 <w:szCs w:val="19"/>
               </w:rPr>
-              <w:t xml:space="preserve">vieta070</w:t>
+              <w:t xml:space="preserve">vieta069</w:t>
             </w:r>
           </w:p>
         </w:tc>
@@ -14120,7 +13915,7 @@
                 <w:sz w:val="19"/>
                 <w:szCs w:val="19"/>
               </w:rPr>
-              <w:t xml:space="preserve">Nguyễn Thanh Hải</w:t>
+              <w:t xml:space="preserve">Trương Hồng Quân</w:t>
             </w:r>
           </w:p>
         </w:tc>
@@ -14149,7 +13944,7 @@
                 <w:sz w:val="19"/>
                 <w:szCs w:val="19"/>
               </w:rPr>
-              <w:t xml:space="preserve">Xưởng sản xuất nệm</w:t>
+              <w:t xml:space="preserve">Kho Mỹ Tho</w:t>
             </w:r>
           </w:p>
         </w:tc>
@@ -14178,7 +13973,7 @@
                 <w:sz w:val="19"/>
                 <w:szCs w:val="19"/>
               </w:rPr>
-              <w:t xml:space="preserve">Nhân viên phun keo</w:t>
+              <w:t xml:space="preserve">Tài xế Mỹ Tho</w:t>
             </w:r>
           </w:p>
         </w:tc>
@@ -14207,7 +14002,7 @@
                 <w:sz w:val="19"/>
                 <w:szCs w:val="19"/>
               </w:rPr>
-              <w:t xml:space="preserve">VietA#Emp@070*7W</w:t>
+              <w:t xml:space="preserve">VietA#Emp@069*7W</w:t>
             </w:r>
           </w:p>
         </w:tc>
@@ -14267,7 +14062,7 @@
                 <w:sz w:val="19"/>
                 <w:szCs w:val="19"/>
               </w:rPr>
-              <w:t xml:space="preserve">VietA 071</w:t>
+              <w:t xml:space="preserve">VietA 070</w:t>
             </w:r>
           </w:p>
         </w:tc>
@@ -14296,7 +14091,7 @@
                 <w:sz w:val="19"/>
                 <w:szCs w:val="19"/>
               </w:rPr>
-              <w:t xml:space="preserve">vieta071</w:t>
+              <w:t xml:space="preserve">vieta070</w:t>
             </w:r>
           </w:p>
         </w:tc>
@@ -14325,7 +14120,7 @@
                 <w:sz w:val="19"/>
                 <w:szCs w:val="19"/>
               </w:rPr>
-              <w:t xml:space="preserve">Nguyễn Dương Tiển</w:t>
+              <w:t xml:space="preserve">Nguyễn Thanh Hải</w:t>
             </w:r>
           </w:p>
         </w:tc>
@@ -14383,7 +14178,7 @@
                 <w:sz w:val="19"/>
                 <w:szCs w:val="19"/>
               </w:rPr>
-              <w:t xml:space="preserve">Nhân viên vô áo</w:t>
+              <w:t xml:space="preserve">Nhân viên phun keo</w:t>
             </w:r>
           </w:p>
         </w:tc>
@@ -14412,7 +14207,7 @@
                 <w:sz w:val="19"/>
                 <w:szCs w:val="19"/>
               </w:rPr>
-              <w:t xml:space="preserve">VietA#Emp@071*7W</w:t>
+              <w:t xml:space="preserve">VietA#Emp@070*7W</w:t>
             </w:r>
           </w:p>
         </w:tc>
@@ -14472,7 +14267,7 @@
                 <w:sz w:val="19"/>
                 <w:szCs w:val="19"/>
               </w:rPr>
-              <w:t xml:space="preserve">VietA 074</w:t>
+              <w:t xml:space="preserve">VietA 071</w:t>
             </w:r>
           </w:p>
         </w:tc>
@@ -14501,7 +14296,7 @@
                 <w:sz w:val="19"/>
                 <w:szCs w:val="19"/>
               </w:rPr>
-              <w:t xml:space="preserve">vieta074</w:t>
+              <w:t xml:space="preserve">vieta071</w:t>
             </w:r>
           </w:p>
         </w:tc>
@@ -14530,7 +14325,7 @@
                 <w:sz w:val="19"/>
                 <w:szCs w:val="19"/>
               </w:rPr>
-              <w:t xml:space="preserve">Nguyễn Thị Ngọc Huệ</w:t>
+              <w:t xml:space="preserve">Nguyễn Dương Tiển</w:t>
             </w:r>
           </w:p>
         </w:tc>
@@ -14588,7 +14383,7 @@
                 <w:sz w:val="19"/>
                 <w:szCs w:val="19"/>
               </w:rPr>
-              <w:t xml:space="preserve">Nhân viên cắt vải</w:t>
+              <w:t xml:space="preserve">Nhân viên vô áo</w:t>
             </w:r>
           </w:p>
         </w:tc>
@@ -14617,7 +14412,7 @@
                 <w:sz w:val="19"/>
                 <w:szCs w:val="19"/>
               </w:rPr>
-              <w:t xml:space="preserve">VietA#Emp@074*7W</w:t>
+              <w:t xml:space="preserve">VietA#Emp@071*7W</w:t>
             </w:r>
           </w:p>
         </w:tc>
@@ -14677,7 +14472,7 @@
                 <w:sz w:val="19"/>
                 <w:szCs w:val="19"/>
               </w:rPr>
-              <w:t xml:space="preserve">VietA 078</w:t>
+              <w:t xml:space="preserve">VietA 074</w:t>
             </w:r>
           </w:p>
         </w:tc>
@@ -14706,7 +14501,7 @@
                 <w:sz w:val="19"/>
                 <w:szCs w:val="19"/>
               </w:rPr>
-              <w:t xml:space="preserve">vieta078</w:t>
+              <w:t xml:space="preserve">vieta074</w:t>
             </w:r>
           </w:p>
         </w:tc>
@@ -14735,7 +14530,7 @@
                 <w:sz w:val="19"/>
                 <w:szCs w:val="19"/>
               </w:rPr>
-              <w:t xml:space="preserve">Cổ Hoàn Lâm</w:t>
+              <w:t xml:space="preserve">Nguyễn Thị Ngọc Huệ</w:t>
             </w:r>
           </w:p>
         </w:tc>
@@ -14764,7 +14559,7 @@
                 <w:sz w:val="19"/>
                 <w:szCs w:val="19"/>
               </w:rPr>
-              <w:t xml:space="preserve">Khối văn phòng</w:t>
+              <w:t xml:space="preserve">Xưởng sản xuất nệm</w:t>
             </w:r>
           </w:p>
         </w:tc>
@@ -14793,7 +14588,7 @@
                 <w:sz w:val="19"/>
                 <w:szCs w:val="19"/>
               </w:rPr>
-              <w:t xml:space="preserve">Nhân viên phòng tổ chức</w:t>
+              <w:t xml:space="preserve">Nhân viên cắt vải</w:t>
             </w:r>
           </w:p>
         </w:tc>
@@ -14822,7 +14617,7 @@
                 <w:sz w:val="19"/>
                 <w:szCs w:val="19"/>
               </w:rPr>
-              <w:t xml:space="preserve">VietA#Emp@078*7W</w:t>
+              <w:t xml:space="preserve">VietA#Emp@074*7W</w:t>
             </w:r>
           </w:p>
         </w:tc>
@@ -14882,7 +14677,7 @@
                 <w:sz w:val="19"/>
                 <w:szCs w:val="19"/>
               </w:rPr>
-              <w:t xml:space="preserve">VietA 080</w:t>
+              <w:t xml:space="preserve">VietA 078</w:t>
             </w:r>
           </w:p>
         </w:tc>
@@ -14911,7 +14706,7 @@
                 <w:sz w:val="19"/>
                 <w:szCs w:val="19"/>
               </w:rPr>
-              <w:t xml:space="preserve">vieta080</w:t>
+              <w:t xml:space="preserve">vieta078</w:t>
             </w:r>
           </w:p>
         </w:tc>
@@ -14940,7 +14735,7 @@
                 <w:sz w:val="19"/>
                 <w:szCs w:val="19"/>
               </w:rPr>
-              <w:t xml:space="preserve">Nguyễn Minh Tấn Phát</w:t>
+              <w:t xml:space="preserve">Cổ Hoàn Lâm</w:t>
             </w:r>
           </w:p>
         </w:tc>
@@ -14969,7 +14764,7 @@
                 <w:sz w:val="19"/>
                 <w:szCs w:val="19"/>
               </w:rPr>
-              <w:t xml:space="preserve">Xưởng sản xuất nệm</w:t>
+              <w:t xml:space="preserve">Khối văn phòng</w:t>
             </w:r>
           </w:p>
         </w:tc>
@@ -14998,7 +14793,7 @@
                 <w:sz w:val="19"/>
                 <w:szCs w:val="19"/>
               </w:rPr>
-              <w:t xml:space="preserve">Nhân viên phun keo</w:t>
+              <w:t xml:space="preserve">Nhân viên phòng tổ chức</w:t>
             </w:r>
           </w:p>
         </w:tc>
@@ -15027,7 +14822,7 @@
                 <w:sz w:val="19"/>
                 <w:szCs w:val="19"/>
               </w:rPr>
-              <w:t xml:space="preserve">VietA#Emp@080*7W</w:t>
+              <w:t xml:space="preserve">VietA#Emp@078*7W</w:t>
             </w:r>
           </w:p>
         </w:tc>
@@ -15087,7 +14882,7 @@
                 <w:sz w:val="19"/>
                 <w:szCs w:val="19"/>
               </w:rPr>
-              <w:t xml:space="preserve">VietA 081</w:t>
+              <w:t xml:space="preserve">VietA 080</w:t>
             </w:r>
           </w:p>
         </w:tc>
@@ -15116,7 +14911,7 @@
                 <w:sz w:val="19"/>
                 <w:szCs w:val="19"/>
               </w:rPr>
-              <w:t xml:space="preserve">vieta081</w:t>
+              <w:t xml:space="preserve">vieta080</w:t>
             </w:r>
           </w:p>
         </w:tc>
@@ -15145,7 +14940,7 @@
                 <w:sz w:val="19"/>
                 <w:szCs w:val="19"/>
               </w:rPr>
-              <w:t xml:space="preserve">Trần Gia Khải</w:t>
+              <w:t xml:space="preserve">Nguyễn Minh Tấn Phát</w:t>
             </w:r>
           </w:p>
         </w:tc>
@@ -15174,7 +14969,7 @@
                 <w:sz w:val="19"/>
                 <w:szCs w:val="19"/>
               </w:rPr>
-              <w:t xml:space="preserve">Kho Mỹ Tho</w:t>
+              <w:t xml:space="preserve">Xưởng sản xuất nệm</w:t>
             </w:r>
           </w:p>
         </w:tc>
@@ -15203,7 +14998,7 @@
                 <w:sz w:val="19"/>
                 <w:szCs w:val="19"/>
               </w:rPr>
-              <w:t xml:space="preserve">Nhân viên giao hàng Mỹ Tho</w:t>
+              <w:t xml:space="preserve">Nhân viên phun keo</w:t>
             </w:r>
           </w:p>
         </w:tc>
@@ -15232,7 +15027,7 @@
                 <w:sz w:val="19"/>
                 <w:szCs w:val="19"/>
               </w:rPr>
-              <w:t xml:space="preserve">VietA#Emp@081*7W</w:t>
+              <w:t xml:space="preserve">VietA#Emp@080*7W</w:t>
             </w:r>
           </w:p>
         </w:tc>
@@ -15292,6 +15087,211 @@
                 <w:sz w:val="19"/>
                 <w:szCs w:val="19"/>
               </w:rPr>
+              <w:t xml:space="preserve">VietA 081</w:t>
+            </w:r>
+          </w:p>
+        </w:tc>
+        <w:tc>
+          <w:tcPr>
+            <w:tcW w:type="pct" w:w="14%"/>
+            <w:tcBorders>
+              <w:top w:val="single" w:color="CBD5E1" w:sz="4"/>
+              <w:left w:val="single" w:color="CBD5E1" w:sz="4"/>
+              <w:bottom w:val="single" w:color="CBD5E1" w:sz="4"/>
+              <w:right w:val="single" w:color="CBD5E1" w:sz="4"/>
+            </w:tcBorders>
+            <w:shd w:fill="F8FAFC" w:val="clear"/>
+          </w:tcPr>
+          <w:p>
+            <w:pPr>
+              <w:spacing w:after="70" w:before="70"/>
+              <w:jc w:val="left"/>
+            </w:pPr>
+            <w:r>
+              <w:rPr>
+                <w:rFonts w:ascii="Times New Roman" w:cs="Times New Roman" w:eastAsia="Times New Roman" w:hAnsi="Times New Roman"/>
+                <w:b/>
+                <w:bCs/>
+                <w:color w:val="0F172A"/>
+                <w:sz w:val="19"/>
+                <w:szCs w:val="19"/>
+              </w:rPr>
+              <w:t xml:space="preserve">vieta081</w:t>
+            </w:r>
+          </w:p>
+        </w:tc>
+        <w:tc>
+          <w:tcPr>
+            <w:tcW w:type="pct" w:w="18%"/>
+            <w:tcBorders>
+              <w:top w:val="single" w:color="CBD5E1" w:sz="4"/>
+              <w:left w:val="single" w:color="CBD5E1" w:sz="4"/>
+              <w:bottom w:val="single" w:color="CBD5E1" w:sz="4"/>
+              <w:right w:val="single" w:color="CBD5E1" w:sz="4"/>
+            </w:tcBorders>
+            <w:shd w:fill="F8FAFC" w:val="clear"/>
+          </w:tcPr>
+          <w:p>
+            <w:pPr>
+              <w:spacing w:after="70" w:before="70"/>
+              <w:jc w:val="left"/>
+            </w:pPr>
+            <w:r>
+              <w:rPr>
+                <w:rFonts w:ascii="Times New Roman" w:cs="Times New Roman" w:eastAsia="Times New Roman" w:hAnsi="Times New Roman"/>
+                <w:b/>
+                <w:bCs/>
+                <w:color w:val="1E293B"/>
+                <w:sz w:val="19"/>
+                <w:szCs w:val="19"/>
+              </w:rPr>
+              <w:t xml:space="preserve">Trần Gia Khải</w:t>
+            </w:r>
+          </w:p>
+        </w:tc>
+        <w:tc>
+          <w:tcPr>
+            <w:tcW w:type="pct" w:w="17%"/>
+            <w:tcBorders>
+              <w:top w:val="single" w:color="CBD5E1" w:sz="4"/>
+              <w:left w:val="single" w:color="CBD5E1" w:sz="4"/>
+              <w:bottom w:val="single" w:color="CBD5E1" w:sz="4"/>
+              <w:right w:val="single" w:color="CBD5E1" w:sz="4"/>
+            </w:tcBorders>
+            <w:shd w:fill="F8FAFC" w:val="clear"/>
+          </w:tcPr>
+          <w:p>
+            <w:pPr>
+              <w:spacing w:after="70" w:before="70"/>
+              <w:jc w:val="left"/>
+            </w:pPr>
+            <w:r>
+              <w:rPr>
+                <w:rFonts w:ascii="Times New Roman" w:cs="Times New Roman" w:eastAsia="Times New Roman" w:hAnsi="Times New Roman"/>
+                <w:b w:val="false"/>
+                <w:bCs w:val="false"/>
+                <w:color w:val="334155"/>
+                <w:sz w:val="19"/>
+                <w:szCs w:val="19"/>
+              </w:rPr>
+              <w:t xml:space="preserve">Kho Mỹ Tho</w:t>
+            </w:r>
+          </w:p>
+        </w:tc>
+        <w:tc>
+          <w:tcPr>
+            <w:tcW w:type="pct" w:w="16%"/>
+            <w:tcBorders>
+              <w:top w:val="single" w:color="CBD5E1" w:sz="4"/>
+              <w:left w:val="single" w:color="CBD5E1" w:sz="4"/>
+              <w:bottom w:val="single" w:color="CBD5E1" w:sz="4"/>
+              <w:right w:val="single" w:color="CBD5E1" w:sz="4"/>
+            </w:tcBorders>
+            <w:shd w:fill="F8FAFC" w:val="clear"/>
+          </w:tcPr>
+          <w:p>
+            <w:pPr>
+              <w:spacing w:after="70" w:before="70"/>
+              <w:jc w:val="left"/>
+            </w:pPr>
+            <w:r>
+              <w:rPr>
+                <w:rFonts w:ascii="Times New Roman" w:cs="Times New Roman" w:eastAsia="Times New Roman" w:hAnsi="Times New Roman"/>
+                <w:b w:val="false"/>
+                <w:bCs w:val="false"/>
+                <w:color w:val="475569"/>
+                <w:sz w:val="19"/>
+                <w:szCs w:val="19"/>
+              </w:rPr>
+              <w:t xml:space="preserve">Nhân viên giao hàng Mỹ Tho</w:t>
+            </w:r>
+          </w:p>
+        </w:tc>
+        <w:tc>
+          <w:tcPr>
+            <w:tcW w:type="pct" w:w="18%"/>
+            <w:tcBorders>
+              <w:top w:val="single" w:color="CBD5E1" w:sz="4"/>
+              <w:left w:val="single" w:color="CBD5E1" w:sz="4"/>
+              <w:bottom w:val="single" w:color="CBD5E1" w:sz="4"/>
+              <w:right w:val="single" w:color="CBD5E1" w:sz="4"/>
+            </w:tcBorders>
+            <w:shd w:fill="F8FAFC" w:val="clear"/>
+          </w:tcPr>
+          <w:p>
+            <w:pPr>
+              <w:spacing w:after="70" w:before="70"/>
+              <w:jc w:val="center"/>
+            </w:pPr>
+            <w:r>
+              <w:rPr>
+                <w:rFonts w:ascii="Times New Roman" w:cs="Times New Roman" w:eastAsia="Times New Roman" w:hAnsi="Times New Roman"/>
+                <w:b/>
+                <w:bCs/>
+                <w:color w:val="059669"/>
+                <w:sz w:val="19"/>
+                <w:szCs w:val="19"/>
+              </w:rPr>
+              <w:t xml:space="preserve">VietA#Emp@081*7W</w:t>
+            </w:r>
+          </w:p>
+        </w:tc>
+      </w:tr>
+      <w:tr>
+        <w:tc>
+          <w:tcPr>
+            <w:tcW w:type="pct" w:w="5%"/>
+            <w:tcBorders>
+              <w:top w:val="single" w:color="CBD5E1" w:sz="4"/>
+              <w:left w:val="single" w:color="CBD5E1" w:sz="4"/>
+              <w:bottom w:val="single" w:color="CBD5E1" w:sz="4"/>
+              <w:right w:val="single" w:color="CBD5E1" w:sz="4"/>
+            </w:tcBorders>
+            <w:shd w:fill="FFFFFF" w:val="clear"/>
+          </w:tcPr>
+          <w:p>
+            <w:pPr>
+              <w:spacing w:after="70" w:before="70"/>
+              <w:jc w:val="center"/>
+            </w:pPr>
+            <w:r>
+              <w:rPr>
+                <w:rFonts w:ascii="Times New Roman" w:cs="Times New Roman" w:eastAsia="Times New Roman" w:hAnsi="Times New Roman"/>
+                <w:b w:val="false"/>
+                <w:bCs w:val="false"/>
+                <w:color w:val="333333"/>
+                <w:sz w:val="19"/>
+                <w:szCs w:val="19"/>
+              </w:rPr>
+              <w:t xml:space="preserve">47</w:t>
+            </w:r>
+          </w:p>
+        </w:tc>
+        <w:tc>
+          <w:tcPr>
+            <w:tcW w:type="pct" w:w="12%"/>
+            <w:tcBorders>
+              <w:top w:val="single" w:color="CBD5E1" w:sz="4"/>
+              <w:left w:val="single" w:color="CBD5E1" w:sz="4"/>
+              <w:bottom w:val="single" w:color="CBD5E1" w:sz="4"/>
+              <w:right w:val="single" w:color="CBD5E1" w:sz="4"/>
+            </w:tcBorders>
+            <w:shd w:fill="FFFFFF" w:val="clear"/>
+          </w:tcPr>
+          <w:p>
+            <w:pPr>
+              <w:spacing w:after="70" w:before="70"/>
+              <w:jc w:val="center"/>
+            </w:pPr>
+            <w:r>
+              <w:rPr>
+                <w:rFonts w:ascii="Times New Roman" w:cs="Times New Roman" w:eastAsia="Times New Roman" w:hAnsi="Times New Roman"/>
+                <w:b w:val="false"/>
+                <w:bCs w:val="false"/>
+                <w:color w:val="475569"/>
+                <w:sz w:val="19"/>
+                <w:szCs w:val="19"/>
+              </w:rPr>
               <w:t xml:space="preserve">VietA 082</w:t>
             </w:r>
           </w:p>
@@ -15305,7 +15305,7 @@
               <w:bottom w:val="single" w:color="CBD5E1" w:sz="4"/>
               <w:right w:val="single" w:color="CBD5E1" w:sz="4"/>
             </w:tcBorders>
-            <w:shd w:fill="F8FAFC" w:val="clear"/>
+            <w:shd w:fill="FFFFFF" w:val="clear"/>
           </w:tcPr>
           <w:p>
             <w:pPr>
@@ -15334,7 +15334,7 @@
               <w:bottom w:val="single" w:color="CBD5E1" w:sz="4"/>
               <w:right w:val="single" w:color="CBD5E1" w:sz="4"/>
             </w:tcBorders>
-            <w:shd w:fill="F8FAFC" w:val="clear"/>
+            <w:shd w:fill="FFFFFF" w:val="clear"/>
           </w:tcPr>
           <w:p>
             <w:pPr>
@@ -15363,7 +15363,7 @@
               <w:bottom w:val="single" w:color="CBD5E1" w:sz="4"/>
               <w:right w:val="single" w:color="CBD5E1" w:sz="4"/>
             </w:tcBorders>
-            <w:shd w:fill="F8FAFC" w:val="clear"/>
+            <w:shd w:fill="FFFFFF" w:val="clear"/>
           </w:tcPr>
           <w:p>
             <w:pPr>
@@ -15392,7 +15392,7 @@
               <w:bottom w:val="single" w:color="CBD5E1" w:sz="4"/>
               <w:right w:val="single" w:color="CBD5E1" w:sz="4"/>
             </w:tcBorders>
-            <w:shd w:fill="F8FAFC" w:val="clear"/>
+            <w:shd w:fill="FFFFFF" w:val="clear"/>
           </w:tcPr>
           <w:p>
             <w:pPr>
@@ -15421,7 +15421,7 @@
               <w:bottom w:val="single" w:color="CBD5E1" w:sz="4"/>
               <w:right w:val="single" w:color="CBD5E1" w:sz="4"/>
             </w:tcBorders>
-            <w:shd w:fill="F8FAFC" w:val="clear"/>
+            <w:shd w:fill="FFFFFF" w:val="clear"/>
           </w:tcPr>
           <w:p>
             <w:pPr>
@@ -17793,7 +17793,7 @@
                 <w:sz w:val="19"/>
                 <w:szCs w:val="19"/>
               </w:rPr>
-              <w:t xml:space="preserve">VietA 056</w:t>
+              <w:t xml:space="preserve">VietA 004</w:t>
             </w:r>
           </w:p>
         </w:tc>
@@ -17822,7 +17822,7 @@
                 <w:sz w:val="19"/>
                 <w:szCs w:val="19"/>
               </w:rPr>
-              <w:t xml:space="preserve">vieta056</w:t>
+              <w:t xml:space="preserve">vieta004</w:t>
             </w:r>
           </w:p>
         </w:tc>
@@ -17851,7 +17851,7 @@
                 <w:sz w:val="19"/>
                 <w:szCs w:val="19"/>
               </w:rPr>
-              <w:t xml:space="preserve">Trần Thị Bảo Châu</w:t>
+              <w:t xml:space="preserve">Nguyễn Thị Thúy Vy</w:t>
             </w:r>
           </w:p>
         </w:tc>
@@ -17880,7 +17880,7 @@
                 <w:sz w:val="19"/>
                 <w:szCs w:val="19"/>
               </w:rPr>
-              <w:t xml:space="preserve">Xưởng sản xuất nệm</w:t>
+              <w:t xml:space="preserve">Khối văn phòng</w:t>
             </w:r>
           </w:p>
         </w:tc>
@@ -17909,7 +17909,7 @@
                 <w:sz w:val="19"/>
                 <w:szCs w:val="19"/>
               </w:rPr>
-              <w:t xml:space="preserve">Kế toán xưởng sản xuất</w:t>
+              <w:t xml:space="preserve">Kế toán thu mua</w:t>
             </w:r>
           </w:p>
         </w:tc>
@@ -17938,7 +17938,7 @@
                 <w:sz w:val="19"/>
                 <w:szCs w:val="19"/>
               </w:rPr>
-              <w:t xml:space="preserve">VietA#Mgr@056$9Q</w:t>
+              <w:t xml:space="preserve">VietA#Emp@004*7W</w:t>
             </w:r>
           </w:p>
         </w:tc>
@@ -17998,7 +17998,7 @@
                 <w:sz w:val="19"/>
                 <w:szCs w:val="19"/>
               </w:rPr>
-              <w:t xml:space="preserve">VietA 004</w:t>
+              <w:t xml:space="preserve">VietA 006</w:t>
             </w:r>
           </w:p>
         </w:tc>
@@ -18027,7 +18027,7 @@
                 <w:sz w:val="19"/>
                 <w:szCs w:val="19"/>
               </w:rPr>
-              <w:t xml:space="preserve">vieta004</w:t>
+              <w:t xml:space="preserve">vieta006</w:t>
             </w:r>
           </w:p>
         </w:tc>
@@ -18056,7 +18056,7 @@
                 <w:sz w:val="19"/>
                 <w:szCs w:val="19"/>
               </w:rPr>
-              <w:t xml:space="preserve">Nguyễn Thị Thúy Vy</w:t>
+              <w:t xml:space="preserve">Phạm Thanh Phong</w:t>
             </w:r>
           </w:p>
         </w:tc>
@@ -18085,7 +18085,7 @@
                 <w:sz w:val="19"/>
                 <w:szCs w:val="19"/>
               </w:rPr>
-              <w:t xml:space="preserve">Khối văn phòng</w:t>
+              <w:t xml:space="preserve">Kho Cần Thơ</w:t>
             </w:r>
           </w:p>
         </w:tc>
@@ -18114,7 +18114,7 @@
                 <w:sz w:val="19"/>
                 <w:szCs w:val="19"/>
               </w:rPr>
-              <w:t xml:space="preserve">Kế toán thu mua</w:t>
+              <w:t xml:space="preserve">Kế toán kho Cần Thơ</w:t>
             </w:r>
           </w:p>
         </w:tc>
@@ -18143,7 +18143,7 @@
                 <w:sz w:val="19"/>
                 <w:szCs w:val="19"/>
               </w:rPr>
-              <w:t xml:space="preserve">VietA#Emp@004*7W</w:t>
+              <w:t xml:space="preserve">VietA#Emp@006*7W</w:t>
             </w:r>
           </w:p>
         </w:tc>
@@ -18203,7 +18203,7 @@
                 <w:sz w:val="19"/>
                 <w:szCs w:val="19"/>
               </w:rPr>
-              <w:t xml:space="preserve">VietA 006</w:t>
+              <w:t xml:space="preserve">VietA 007</w:t>
             </w:r>
           </w:p>
         </w:tc>
@@ -18232,7 +18232,7 @@
                 <w:sz w:val="19"/>
                 <w:szCs w:val="19"/>
               </w:rPr>
-              <w:t xml:space="preserve">vieta006</w:t>
+              <w:t xml:space="preserve">vieta007</w:t>
             </w:r>
           </w:p>
         </w:tc>
@@ -18261,7 +18261,7 @@
                 <w:sz w:val="19"/>
                 <w:szCs w:val="19"/>
               </w:rPr>
-              <w:t xml:space="preserve">Phạm Thanh Phong</w:t>
+              <w:t xml:space="preserve">Trần Thanh Hoài</w:t>
             </w:r>
           </w:p>
         </w:tc>
@@ -18319,7 +18319,7 @@
                 <w:sz w:val="19"/>
                 <w:szCs w:val="19"/>
               </w:rPr>
-              <w:t xml:space="preserve">Kế toán kho Cần Thơ</w:t>
+              <w:t xml:space="preserve">Tài xế Cần Thơ</w:t>
             </w:r>
           </w:p>
         </w:tc>
@@ -18348,7 +18348,7 @@
                 <w:sz w:val="19"/>
                 <w:szCs w:val="19"/>
               </w:rPr>
-              <w:t xml:space="preserve">VietA#Emp@006*7W</w:t>
+              <w:t xml:space="preserve">VietA#Emp@007*7W</w:t>
             </w:r>
           </w:p>
         </w:tc>
@@ -18408,7 +18408,7 @@
                 <w:sz w:val="19"/>
                 <w:szCs w:val="19"/>
               </w:rPr>
-              <w:t xml:space="preserve">VietA 007</w:t>
+              <w:t xml:space="preserve">VietA 009</w:t>
             </w:r>
           </w:p>
         </w:tc>
@@ -18437,7 +18437,7 @@
                 <w:sz w:val="19"/>
                 <w:szCs w:val="19"/>
               </w:rPr>
-              <w:t xml:space="preserve">vieta007</w:t>
+              <w:t xml:space="preserve">vieta009</w:t>
             </w:r>
           </w:p>
         </w:tc>
@@ -18466,7 +18466,7 @@
                 <w:sz w:val="19"/>
                 <w:szCs w:val="19"/>
               </w:rPr>
-              <w:t xml:space="preserve">Trần Thanh Hoài</w:t>
+              <w:t xml:space="preserve">Huỳnh Ngọc Dư</w:t>
             </w:r>
           </w:p>
         </w:tc>
@@ -18524,7 +18524,7 @@
                 <w:sz w:val="19"/>
                 <w:szCs w:val="19"/>
               </w:rPr>
-              <w:t xml:space="preserve">Tài xế Cần Thơ</w:t>
+              <w:t xml:space="preserve">Nhân viên kho Cần Thơ</w:t>
             </w:r>
           </w:p>
         </w:tc>
@@ -18553,7 +18553,7 @@
                 <w:sz w:val="19"/>
                 <w:szCs w:val="19"/>
               </w:rPr>
-              <w:t xml:space="preserve">VietA#Emp@007*7W</w:t>
+              <w:t xml:space="preserve">VietA#Emp@009*7W</w:t>
             </w:r>
           </w:p>
         </w:tc>
@@ -18613,7 +18613,7 @@
                 <w:sz w:val="19"/>
                 <w:szCs w:val="19"/>
               </w:rPr>
-              <w:t xml:space="preserve">VietA 009</w:t>
+              <w:t xml:space="preserve">VietA 010</w:t>
             </w:r>
           </w:p>
         </w:tc>
@@ -18642,7 +18642,7 @@
                 <w:sz w:val="19"/>
                 <w:szCs w:val="19"/>
               </w:rPr>
-              <w:t xml:space="preserve">vieta009</w:t>
+              <w:t xml:space="preserve">vieta010</w:t>
             </w:r>
           </w:p>
         </w:tc>
@@ -18671,7 +18671,7 @@
                 <w:sz w:val="19"/>
                 <w:szCs w:val="19"/>
               </w:rPr>
-              <w:t xml:space="preserve">Huỳnh Ngọc Dư</w:t>
+              <w:t xml:space="preserve">Nguyễn Hải Duy</w:t>
             </w:r>
           </w:p>
         </w:tc>
@@ -18729,7 +18729,7 @@
                 <w:sz w:val="19"/>
                 <w:szCs w:val="19"/>
               </w:rPr>
-              <w:t xml:space="preserve">Nhân viên kho Cần Thơ</w:t>
+              <w:t xml:space="preserve">Nhân viên giao hàng Cần Thơ</w:t>
             </w:r>
           </w:p>
         </w:tc>
@@ -18758,7 +18758,7 @@
                 <w:sz w:val="19"/>
                 <w:szCs w:val="19"/>
               </w:rPr>
-              <w:t xml:space="preserve">VietA#Emp@009*7W</w:t>
+              <w:t xml:space="preserve">VietA#Emp@010*7W</w:t>
             </w:r>
           </w:p>
         </w:tc>
@@ -18818,7 +18818,7 @@
                 <w:sz w:val="19"/>
                 <w:szCs w:val="19"/>
               </w:rPr>
-              <w:t xml:space="preserve">VietA 010</w:t>
+              <w:t xml:space="preserve">VietA 011</w:t>
             </w:r>
           </w:p>
         </w:tc>
@@ -18847,7 +18847,7 @@
                 <w:sz w:val="19"/>
                 <w:szCs w:val="19"/>
               </w:rPr>
-              <w:t xml:space="preserve">vieta010</w:t>
+              <w:t xml:space="preserve">vieta011</w:t>
             </w:r>
           </w:p>
         </w:tc>
@@ -18876,7 +18876,7 @@
                 <w:sz w:val="19"/>
                 <w:szCs w:val="19"/>
               </w:rPr>
-              <w:t xml:space="preserve">Nguyễn Hải Duy</w:t>
+              <w:t xml:space="preserve">Lý Minh Trung</w:t>
             </w:r>
           </w:p>
         </w:tc>
@@ -18934,7 +18934,7 @@
                 <w:sz w:val="19"/>
                 <w:szCs w:val="19"/>
               </w:rPr>
-              <w:t xml:space="preserve">Nhân viên giao hàng Cần Thơ</w:t>
+              <w:t xml:space="preserve">Nhân viên kho Cần Thơ</w:t>
             </w:r>
           </w:p>
         </w:tc>
@@ -18963,7 +18963,7 @@
                 <w:sz w:val="19"/>
                 <w:szCs w:val="19"/>
               </w:rPr>
-              <w:t xml:space="preserve">VietA#Emp@010*7W</w:t>
+              <w:t xml:space="preserve">VietA#Emp@011*7W</w:t>
             </w:r>
           </w:p>
         </w:tc>
@@ -19023,7 +19023,7 @@
                 <w:sz w:val="19"/>
                 <w:szCs w:val="19"/>
               </w:rPr>
-              <w:t xml:space="preserve">VietA 011</w:t>
+              <w:t xml:space="preserve">VietA 012</w:t>
             </w:r>
           </w:p>
         </w:tc>
@@ -19052,7 +19052,7 @@
                 <w:sz w:val="19"/>
                 <w:szCs w:val="19"/>
               </w:rPr>
-              <w:t xml:space="preserve">vieta011</w:t>
+              <w:t xml:space="preserve">vieta012</w:t>
             </w:r>
           </w:p>
         </w:tc>
@@ -19081,7 +19081,7 @@
                 <w:sz w:val="19"/>
                 <w:szCs w:val="19"/>
               </w:rPr>
-              <w:t xml:space="preserve">Lý Minh Trung</w:t>
+              <w:t xml:space="preserve">Võ Huỳnh Đông Nghi</w:t>
             </w:r>
           </w:p>
         </w:tc>
@@ -19110,7 +19110,7 @@
                 <w:sz w:val="19"/>
                 <w:szCs w:val="19"/>
               </w:rPr>
-              <w:t xml:space="preserve">Kho Cần Thơ</w:t>
+              <w:t xml:space="preserve">Xưởng sản xuất nệm</w:t>
             </w:r>
           </w:p>
         </w:tc>
@@ -19139,7 +19139,7 @@
                 <w:sz w:val="19"/>
                 <w:szCs w:val="19"/>
               </w:rPr>
-              <w:t xml:space="preserve">Nhân viên kho Cần Thơ</w:t>
+              <w:t xml:space="preserve">Phó quản lý xưởng</w:t>
             </w:r>
           </w:p>
         </w:tc>
@@ -19168,7 +19168,7 @@
                 <w:sz w:val="19"/>
                 <w:szCs w:val="19"/>
               </w:rPr>
-              <w:t xml:space="preserve">VietA#Emp@011*7W</w:t>
+              <w:t xml:space="preserve">VietA#Emp@012*7W</w:t>
             </w:r>
           </w:p>
         </w:tc>
@@ -19228,7 +19228,7 @@
                 <w:sz w:val="19"/>
                 <w:szCs w:val="19"/>
               </w:rPr>
-              <w:t xml:space="preserve">VietA 012</w:t>
+              <w:t xml:space="preserve">VietA 013</w:t>
             </w:r>
           </w:p>
         </w:tc>
@@ -19257,7 +19257,7 @@
                 <w:sz w:val="19"/>
                 <w:szCs w:val="19"/>
               </w:rPr>
-              <w:t xml:space="preserve">vieta012</w:t>
+              <w:t xml:space="preserve">vieta013</w:t>
             </w:r>
           </w:p>
         </w:tc>
@@ -19286,7 +19286,7 @@
                 <w:sz w:val="19"/>
                 <w:szCs w:val="19"/>
               </w:rPr>
-              <w:t xml:space="preserve">Võ Huỳnh Đông Nghi</w:t>
+              <w:t xml:space="preserve">Hồ Minh Thuận</w:t>
             </w:r>
           </w:p>
         </w:tc>
@@ -19315,7 +19315,7 @@
                 <w:sz w:val="19"/>
                 <w:szCs w:val="19"/>
               </w:rPr>
-              <w:t xml:space="preserve">Xưởng sản xuất nệm</w:t>
+              <w:t xml:space="preserve">Kho Cần Thơ</w:t>
             </w:r>
           </w:p>
         </w:tc>
@@ -19344,7 +19344,7 @@
                 <w:sz w:val="19"/>
                 <w:szCs w:val="19"/>
               </w:rPr>
-              <w:t xml:space="preserve">Phó quản lý xưởng</w:t>
+              <w:t xml:space="preserve">Nhân viên giao hàng Cần Thơ</w:t>
             </w:r>
           </w:p>
         </w:tc>
@@ -19373,7 +19373,7 @@
                 <w:sz w:val="19"/>
                 <w:szCs w:val="19"/>
               </w:rPr>
-              <w:t xml:space="preserve">VietA#Emp@012*7W</w:t>
+              <w:t xml:space="preserve">VietA#Emp@013*7W</w:t>
             </w:r>
           </w:p>
         </w:tc>
@@ -19433,7 +19433,7 @@
                 <w:sz w:val="19"/>
                 <w:szCs w:val="19"/>
               </w:rPr>
-              <w:t xml:space="preserve">VietA 013</w:t>
+              <w:t xml:space="preserve">VietA 016</w:t>
             </w:r>
           </w:p>
         </w:tc>
@@ -19462,7 +19462,7 @@
                 <w:sz w:val="19"/>
                 <w:szCs w:val="19"/>
               </w:rPr>
-              <w:t xml:space="preserve">vieta013</w:t>
+              <w:t xml:space="preserve">vieta016</w:t>
             </w:r>
           </w:p>
         </w:tc>
@@ -19491,7 +19491,7 @@
                 <w:sz w:val="19"/>
                 <w:szCs w:val="19"/>
               </w:rPr>
-              <w:t xml:space="preserve">Hồ Minh Thuận</w:t>
+              <w:t xml:space="preserve">Nguyễn Thị Huỳnh Như</w:t>
             </w:r>
           </w:p>
         </w:tc>
@@ -19520,7 +19520,7 @@
                 <w:sz w:val="19"/>
                 <w:szCs w:val="19"/>
               </w:rPr>
-              <w:t xml:space="preserve">Kho Cần Thơ</w:t>
+              <w:t xml:space="preserve">Kho Mỹ Tho</w:t>
             </w:r>
           </w:p>
         </w:tc>
@@ -19549,7 +19549,7 @@
                 <w:sz w:val="19"/>
                 <w:szCs w:val="19"/>
               </w:rPr>
-              <w:t xml:space="preserve">Nhân viên giao hàng Cần Thơ</w:t>
+              <w:t xml:space="preserve">Phó quản lý kho Mỹ Tho</w:t>
             </w:r>
           </w:p>
         </w:tc>
@@ -19578,7 +19578,7 @@
                 <w:sz w:val="19"/>
                 <w:szCs w:val="19"/>
               </w:rPr>
-              <w:t xml:space="preserve">VietA#Emp@013*7W</w:t>
+              <w:t xml:space="preserve">VietA#Emp@016*7W</w:t>
             </w:r>
           </w:p>
         </w:tc>
@@ -19638,7 +19638,7 @@
                 <w:sz w:val="19"/>
                 <w:szCs w:val="19"/>
               </w:rPr>
-              <w:t xml:space="preserve">VietA 016</w:t>
+              <w:t xml:space="preserve">VietA 017</w:t>
             </w:r>
           </w:p>
         </w:tc>
@@ -19667,7 +19667,7 @@
                 <w:sz w:val="19"/>
                 <w:szCs w:val="19"/>
               </w:rPr>
-              <w:t xml:space="preserve">vieta016</w:t>
+              <w:t xml:space="preserve">vieta017</w:t>
             </w:r>
           </w:p>
         </w:tc>
@@ -19696,7 +19696,7 @@
                 <w:sz w:val="19"/>
                 <w:szCs w:val="19"/>
               </w:rPr>
-              <w:t xml:space="preserve">Nguyễn Thị Huỳnh Như</w:t>
+              <w:t xml:space="preserve">Trần Lương Ngọc Khánh</w:t>
             </w:r>
           </w:p>
         </w:tc>
@@ -19754,7 +19754,7 @@
                 <w:sz w:val="19"/>
                 <w:szCs w:val="19"/>
               </w:rPr>
-              <w:t xml:space="preserve">Phó quản lý kho Mỹ Tho</w:t>
+              <w:t xml:space="preserve">Kế toán kho Mỹ Tho</w:t>
             </w:r>
           </w:p>
         </w:tc>
@@ -19783,7 +19783,7 @@
                 <w:sz w:val="19"/>
                 <w:szCs w:val="19"/>
               </w:rPr>
-              <w:t xml:space="preserve">VietA#Emp@016*7W</w:t>
+              <w:t xml:space="preserve">VietA#Emp@017*7W</w:t>
             </w:r>
           </w:p>
         </w:tc>
@@ -19843,7 +19843,7 @@
                 <w:sz w:val="19"/>
                 <w:szCs w:val="19"/>
               </w:rPr>
-              <w:t xml:space="preserve">VietA 017</w:t>
+              <w:t xml:space="preserve">VietA 018</w:t>
             </w:r>
           </w:p>
         </w:tc>
@@ -19872,7 +19872,7 @@
                 <w:sz w:val="19"/>
                 <w:szCs w:val="19"/>
               </w:rPr>
-              <w:t xml:space="preserve">vieta017</w:t>
+              <w:t xml:space="preserve">vieta018</w:t>
             </w:r>
           </w:p>
         </w:tc>
@@ -19901,7 +19901,7 @@
                 <w:sz w:val="19"/>
                 <w:szCs w:val="19"/>
               </w:rPr>
-              <w:t xml:space="preserve">Trần Lương Ngọc Khánh</w:t>
+              <w:t xml:space="preserve">Tạ Thị Ngọc Trâm</w:t>
             </w:r>
           </w:p>
         </w:tc>
@@ -19988,7 +19988,7 @@
                 <w:sz w:val="19"/>
                 <w:szCs w:val="19"/>
               </w:rPr>
-              <w:t xml:space="preserve">VietA#Emp@017*7W</w:t>
+              <w:t xml:space="preserve">VietA#Emp@018*7W</w:t>
             </w:r>
           </w:p>
         </w:tc>
@@ -20048,7 +20048,7 @@
                 <w:sz w:val="19"/>
                 <w:szCs w:val="19"/>
               </w:rPr>
-              <w:t xml:space="preserve">VietA 018</w:t>
+              <w:t xml:space="preserve">VietA 019</w:t>
             </w:r>
           </w:p>
         </w:tc>
@@ -20077,7 +20077,7 @@
                 <w:sz w:val="19"/>
                 <w:szCs w:val="19"/>
               </w:rPr>
-              <w:t xml:space="preserve">vieta018</w:t>
+              <w:t xml:space="preserve">vieta019</w:t>
             </w:r>
           </w:p>
         </w:tc>
@@ -20106,7 +20106,7 @@
                 <w:sz w:val="19"/>
                 <w:szCs w:val="19"/>
               </w:rPr>
-              <w:t xml:space="preserve">Tạ Thị Ngọc Trâm</w:t>
+              <w:t xml:space="preserve">Đoàn Hoài Linh</w:t>
             </w:r>
           </w:p>
         </w:tc>
@@ -20164,7 +20164,7 @@
                 <w:sz w:val="19"/>
                 <w:szCs w:val="19"/>
               </w:rPr>
-              <w:t xml:space="preserve">Kế toán kho Mỹ Tho</w:t>
+              <w:t xml:space="preserve">Đội trưởng đội tài xế</w:t>
             </w:r>
           </w:p>
         </w:tc>
@@ -20193,7 +20193,7 @@
                 <w:sz w:val="19"/>
                 <w:szCs w:val="19"/>
               </w:rPr>
-              <w:t xml:space="preserve">VietA#Emp@018*7W</w:t>
+              <w:t xml:space="preserve">VietA#Emp@019*7W</w:t>
             </w:r>
           </w:p>
         </w:tc>
@@ -20253,7 +20253,7 @@
                 <w:sz w:val="19"/>
                 <w:szCs w:val="19"/>
               </w:rPr>
-              <w:t xml:space="preserve">VietA 019</w:t>
+              <w:t xml:space="preserve">VietA 020</w:t>
             </w:r>
           </w:p>
         </w:tc>
@@ -20282,7 +20282,7 @@
                 <w:sz w:val="19"/>
                 <w:szCs w:val="19"/>
               </w:rPr>
-              <w:t xml:space="preserve">vieta019</w:t>
+              <w:t xml:space="preserve">vieta020</w:t>
             </w:r>
           </w:p>
         </w:tc>
@@ -20311,7 +20311,7 @@
                 <w:sz w:val="19"/>
                 <w:szCs w:val="19"/>
               </w:rPr>
-              <w:t xml:space="preserve">Đoàn Hoài Linh</w:t>
+              <w:t xml:space="preserve">Đặng Hoàng Tuấn</w:t>
             </w:r>
           </w:p>
         </w:tc>
@@ -20369,7 +20369,7 @@
                 <w:sz w:val="19"/>
                 <w:szCs w:val="19"/>
               </w:rPr>
-              <w:t xml:space="preserve">Đội trưởng đội tài xế</w:t>
+              <w:t xml:space="preserve">Tài xế Mỹ Tho</w:t>
             </w:r>
           </w:p>
         </w:tc>
@@ -20398,7 +20398,7 @@
                 <w:sz w:val="19"/>
                 <w:szCs w:val="19"/>
               </w:rPr>
-              <w:t xml:space="preserve">VietA#Emp@019*7W</w:t>
+              <w:t xml:space="preserve">VietA#Emp@020*7W</w:t>
             </w:r>
           </w:p>
         </w:tc>
@@ -20458,7 +20458,7 @@
                 <w:sz w:val="19"/>
                 <w:szCs w:val="19"/>
               </w:rPr>
-              <w:t xml:space="preserve">VietA 020</w:t>
+              <w:t xml:space="preserve">VietA 022</w:t>
             </w:r>
           </w:p>
         </w:tc>
@@ -20487,7 +20487,7 @@
                 <w:sz w:val="19"/>
                 <w:szCs w:val="19"/>
               </w:rPr>
-              <w:t xml:space="preserve">vieta020</w:t>
+              <w:t xml:space="preserve">vieta022</w:t>
             </w:r>
           </w:p>
         </w:tc>
@@ -20516,7 +20516,7 @@
                 <w:sz w:val="19"/>
                 <w:szCs w:val="19"/>
               </w:rPr>
-              <w:t xml:space="preserve">Đặng Hoàng Tuấn</w:t>
+              <w:t xml:space="preserve">Nguyễn Tuấn Kiệt</w:t>
             </w:r>
           </w:p>
         </w:tc>
@@ -20574,7 +20574,7 @@
                 <w:sz w:val="19"/>
                 <w:szCs w:val="19"/>
               </w:rPr>
-              <w:t xml:space="preserve">Tài xế Mỹ Tho</w:t>
+              <w:t xml:space="preserve">Nhân viên giao hàng Mỹ Tho</w:t>
             </w:r>
           </w:p>
         </w:tc>
@@ -20603,7 +20603,7 @@
                 <w:sz w:val="19"/>
                 <w:szCs w:val="19"/>
               </w:rPr>
-              <w:t xml:space="preserve">VietA#Emp@020*7W</w:t>
+              <w:t xml:space="preserve">VietA#Emp@022*7W</w:t>
             </w:r>
           </w:p>
         </w:tc>
@@ -20663,7 +20663,7 @@
                 <w:sz w:val="19"/>
                 <w:szCs w:val="19"/>
               </w:rPr>
-              <w:t xml:space="preserve">VietA 022</w:t>
+              <w:t xml:space="preserve">VietA 023</w:t>
             </w:r>
           </w:p>
         </w:tc>
@@ -20692,7 +20692,7 @@
                 <w:sz w:val="19"/>
                 <w:szCs w:val="19"/>
               </w:rPr>
-              <w:t xml:space="preserve">vieta022</w:t>
+              <w:t xml:space="preserve">vieta023</w:t>
             </w:r>
           </w:p>
         </w:tc>
@@ -20721,7 +20721,7 @@
                 <w:sz w:val="19"/>
                 <w:szCs w:val="19"/>
               </w:rPr>
-              <w:t xml:space="preserve">Nguyễn Tuấn Kiệt</w:t>
+              <w:t xml:space="preserve">Nguyễn Hoàng Quân</w:t>
             </w:r>
           </w:p>
         </w:tc>
@@ -20808,7 +20808,7 @@
                 <w:sz w:val="19"/>
                 <w:szCs w:val="19"/>
               </w:rPr>
-              <w:t xml:space="preserve">VietA#Emp@022*7W</w:t>
+              <w:t xml:space="preserve">VietA#Emp@023*7W</w:t>
             </w:r>
           </w:p>
         </w:tc>
@@ -20868,7 +20868,7 @@
                 <w:sz w:val="19"/>
                 <w:szCs w:val="19"/>
               </w:rPr>
-              <w:t xml:space="preserve">VietA 023</w:t>
+              <w:t xml:space="preserve">VietA 024</w:t>
             </w:r>
           </w:p>
         </w:tc>
@@ -20897,7 +20897,7 @@
                 <w:sz w:val="19"/>
                 <w:szCs w:val="19"/>
               </w:rPr>
-              <w:t xml:space="preserve">vieta023</w:t>
+              <w:t xml:space="preserve">vieta024</w:t>
             </w:r>
           </w:p>
         </w:tc>
@@ -20926,7 +20926,7 @@
                 <w:sz w:val="19"/>
                 <w:szCs w:val="19"/>
               </w:rPr>
-              <w:t xml:space="preserve">Nguyễn Hoàng Quân</w:t>
+              <w:t xml:space="preserve">Nguyễn Hữu Tài</w:t>
             </w:r>
           </w:p>
         </w:tc>
@@ -20955,7 +20955,7 @@
                 <w:sz w:val="19"/>
                 <w:szCs w:val="19"/>
               </w:rPr>
-              <w:t xml:space="preserve">Kho Mỹ Tho</w:t>
+              <w:t xml:space="preserve">Phòng kinh doanh</w:t>
             </w:r>
           </w:p>
         </w:tc>
@@ -20984,7 +20984,7 @@
                 <w:sz w:val="19"/>
                 <w:szCs w:val="19"/>
               </w:rPr>
-              <w:t xml:space="preserve">Nhân viên giao hàng Mỹ Tho</w:t>
+              <w:t xml:space="preserve">Nhân viên kinh doanh</w:t>
             </w:r>
           </w:p>
         </w:tc>
@@ -21013,7 +21013,7 @@
                 <w:sz w:val="19"/>
                 <w:szCs w:val="19"/>
               </w:rPr>
-              <w:t xml:space="preserve">VietA#Emp@023*7W</w:t>
+              <w:t xml:space="preserve">VietA#Emp@024*7W</w:t>
             </w:r>
           </w:p>
         </w:tc>
@@ -21073,7 +21073,7 @@
                 <w:sz w:val="19"/>
                 <w:szCs w:val="19"/>
               </w:rPr>
-              <w:t xml:space="preserve">VietA 024</w:t>
+              <w:t xml:space="preserve">VietA 026</w:t>
             </w:r>
           </w:p>
         </w:tc>
@@ -21102,7 +21102,7 @@
                 <w:sz w:val="19"/>
                 <w:szCs w:val="19"/>
               </w:rPr>
-              <w:t xml:space="preserve">vieta024</w:t>
+              <w:t xml:space="preserve">vieta026</w:t>
             </w:r>
           </w:p>
         </w:tc>
@@ -21131,7 +21131,7 @@
                 <w:sz w:val="19"/>
                 <w:szCs w:val="19"/>
               </w:rPr>
-              <w:t xml:space="preserve">Nguyễn Hữu Tài</w:t>
+              <w:t xml:space="preserve">Phạm Minh Phúc</w:t>
             </w:r>
           </w:p>
         </w:tc>
@@ -21160,7 +21160,7 @@
                 <w:sz w:val="19"/>
                 <w:szCs w:val="19"/>
               </w:rPr>
-              <w:t xml:space="preserve">Phòng kinh doanh</w:t>
+              <w:t xml:space="preserve">Kho Mỹ Tho</w:t>
             </w:r>
           </w:p>
         </w:tc>
@@ -21189,7 +21189,7 @@
                 <w:sz w:val="19"/>
                 <w:szCs w:val="19"/>
               </w:rPr>
-              <w:t xml:space="preserve">Nhân viên kinh doanh</w:t>
+              <w:t xml:space="preserve">Nhân viên kho Mỹ Tho</w:t>
             </w:r>
           </w:p>
         </w:tc>
@@ -21218,7 +21218,7 @@
                 <w:sz w:val="19"/>
                 <w:szCs w:val="19"/>
               </w:rPr>
-              <w:t xml:space="preserve">VietA#Emp@024*7W</w:t>
+              <w:t xml:space="preserve">VietA#Emp@026*7W</w:t>
             </w:r>
           </w:p>
         </w:tc>
@@ -21278,7 +21278,7 @@
                 <w:sz w:val="19"/>
                 <w:szCs w:val="19"/>
               </w:rPr>
-              <w:t xml:space="preserve">VietA 026</w:t>
+              <w:t xml:space="preserve">VietA 027</w:t>
             </w:r>
           </w:p>
         </w:tc>
@@ -21307,7 +21307,7 @@
                 <w:sz w:val="19"/>
                 <w:szCs w:val="19"/>
               </w:rPr>
-              <w:t xml:space="preserve">vieta026</w:t>
+              <w:t xml:space="preserve">vieta027</w:t>
             </w:r>
           </w:p>
         </w:tc>
@@ -21336,7 +21336,7 @@
                 <w:sz w:val="19"/>
                 <w:szCs w:val="19"/>
               </w:rPr>
-              <w:t xml:space="preserve">Phạm Minh Phúc</w:t>
+              <w:t xml:space="preserve">Phạm Ngọc Hiển</w:t>
             </w:r>
           </w:p>
         </w:tc>
@@ -21423,7 +21423,7 @@
                 <w:sz w:val="19"/>
                 <w:szCs w:val="19"/>
               </w:rPr>
-              <w:t xml:space="preserve">VietA#Emp@026*7W</w:t>
+              <w:t xml:space="preserve">VietA#Emp@027*7W</w:t>
             </w:r>
           </w:p>
         </w:tc>
@@ -21483,7 +21483,7 @@
                 <w:sz w:val="19"/>
                 <w:szCs w:val="19"/>
               </w:rPr>
-              <w:t xml:space="preserve">VietA 027</w:t>
+              <w:t xml:space="preserve">VietA 028</w:t>
             </w:r>
           </w:p>
         </w:tc>
@@ -21512,7 +21512,7 @@
                 <w:sz w:val="19"/>
                 <w:szCs w:val="19"/>
               </w:rPr>
-              <w:t xml:space="preserve">vieta027</w:t>
+              <w:t xml:space="preserve">vieta028</w:t>
             </w:r>
           </w:p>
         </w:tc>
@@ -21541,7 +21541,7 @@
                 <w:sz w:val="19"/>
                 <w:szCs w:val="19"/>
               </w:rPr>
-              <w:t xml:space="preserve">Phạm Ngọc Hiển</w:t>
+              <w:t xml:space="preserve">Trần Hữu Lộc</w:t>
             </w:r>
           </w:p>
         </w:tc>
@@ -21628,7 +21628,7 @@
                 <w:sz w:val="19"/>
                 <w:szCs w:val="19"/>
               </w:rPr>
-              <w:t xml:space="preserve">VietA#Emp@027*7W</w:t>
+              <w:t xml:space="preserve">VietA#Emp@028*7W</w:t>
             </w:r>
           </w:p>
         </w:tc>
@@ -21688,7 +21688,7 @@
                 <w:sz w:val="19"/>
                 <w:szCs w:val="19"/>
               </w:rPr>
-              <w:t xml:space="preserve">VietA 028</w:t>
+              <w:t xml:space="preserve">VietA 029</w:t>
             </w:r>
           </w:p>
         </w:tc>
@@ -21717,7 +21717,7 @@
                 <w:sz w:val="19"/>
                 <w:szCs w:val="19"/>
               </w:rPr>
-              <w:t xml:space="preserve">vieta028</w:t>
+              <w:t xml:space="preserve">vieta029</w:t>
             </w:r>
           </w:p>
         </w:tc>
@@ -21746,7 +21746,7 @@
                 <w:sz w:val="19"/>
                 <w:szCs w:val="19"/>
               </w:rPr>
-              <w:t xml:space="preserve">Trần Hữu Lộc</w:t>
+              <w:t xml:space="preserve">Nguyễn Thị Thanh Tú</w:t>
             </w:r>
           </w:p>
         </w:tc>
@@ -21804,7 +21804,7 @@
                 <w:sz w:val="19"/>
                 <w:szCs w:val="19"/>
               </w:rPr>
-              <w:t xml:space="preserve">Nhân viên kho Mỹ Tho</w:t>
+              <w:t xml:space="preserve">Kế toán kho Mỹ Tho</w:t>
             </w:r>
           </w:p>
         </w:tc>
@@ -21833,7 +21833,7 @@
                 <w:sz w:val="19"/>
                 <w:szCs w:val="19"/>
               </w:rPr>
-              <w:t xml:space="preserve">VietA#Emp@028*7W</w:t>
+              <w:t xml:space="preserve">VietA#Emp@029*7W</w:t>
             </w:r>
           </w:p>
         </w:tc>
@@ -21893,7 +21893,7 @@
                 <w:sz w:val="19"/>
                 <w:szCs w:val="19"/>
               </w:rPr>
-              <w:t xml:space="preserve">VietA 029</w:t>
+              <w:t xml:space="preserve">VietA 033</w:t>
             </w:r>
           </w:p>
         </w:tc>
@@ -21922,7 +21922,7 @@
                 <w:sz w:val="19"/>
                 <w:szCs w:val="19"/>
               </w:rPr>
-              <w:t xml:space="preserve">vieta029</w:t>
+              <w:t xml:space="preserve">vieta033</w:t>
             </w:r>
           </w:p>
         </w:tc>
@@ -21951,7 +21951,7 @@
                 <w:sz w:val="19"/>
                 <w:szCs w:val="19"/>
               </w:rPr>
-              <w:t xml:space="preserve">Nguyễn Thị Thanh Tú</w:t>
+              <w:t xml:space="preserve">Nguyễn Quốc Huy</w:t>
             </w:r>
           </w:p>
         </w:tc>
@@ -21980,7 +21980,7 @@
                 <w:sz w:val="19"/>
                 <w:szCs w:val="19"/>
               </w:rPr>
-              <w:t xml:space="preserve">Kho Mỹ Tho</w:t>
+              <w:t xml:space="preserve">Khối văn phòng</w:t>
             </w:r>
           </w:p>
         </w:tc>
@@ -22009,7 +22009,7 @@
                 <w:sz w:val="19"/>
                 <w:szCs w:val="19"/>
               </w:rPr>
-              <w:t xml:space="preserve">Kế toán kho Mỹ Tho</w:t>
+              <w:t xml:space="preserve">Trợ lý Giám đốc</w:t>
             </w:r>
           </w:p>
         </w:tc>
@@ -22038,7 +22038,7 @@
                 <w:sz w:val="19"/>
                 <w:szCs w:val="19"/>
               </w:rPr>
-              <w:t xml:space="preserve">VietA#Emp@029*7W</w:t>
+              <w:t xml:space="preserve">VietA#Emp@033*7W</w:t>
             </w:r>
           </w:p>
         </w:tc>
@@ -22098,7 +22098,7 @@
                 <w:sz w:val="19"/>
                 <w:szCs w:val="19"/>
               </w:rPr>
-              <w:t xml:space="preserve">VietA 033</w:t>
+              <w:t xml:space="preserve">VietA 034</w:t>
             </w:r>
           </w:p>
         </w:tc>
@@ -22127,7 +22127,7 @@
                 <w:sz w:val="19"/>
                 <w:szCs w:val="19"/>
               </w:rPr>
-              <w:t xml:space="preserve">vieta033</w:t>
+              <w:t xml:space="preserve">vieta034</w:t>
             </w:r>
           </w:p>
         </w:tc>
@@ -22156,7 +22156,7 @@
                 <w:sz w:val="19"/>
                 <w:szCs w:val="19"/>
               </w:rPr>
-              <w:t xml:space="preserve">Nguyễn Quốc Huy</w:t>
+              <w:t xml:space="preserve">Lê Thị Mỹ Phúc</w:t>
             </w:r>
           </w:p>
         </w:tc>
@@ -22214,7 +22214,7 @@
                 <w:sz w:val="19"/>
                 <w:szCs w:val="19"/>
               </w:rPr>
-              <w:t xml:space="preserve">Trợ lý Giám đốc</w:t>
+              <w:t xml:space="preserve">Kế toán viên</w:t>
             </w:r>
           </w:p>
         </w:tc>
@@ -22243,7 +22243,7 @@
                 <w:sz w:val="19"/>
                 <w:szCs w:val="19"/>
               </w:rPr>
-              <w:t xml:space="preserve">VietA#Emp@033*7W</w:t>
+              <w:t xml:space="preserve">VietA#Emp@034*7W</w:t>
             </w:r>
           </w:p>
         </w:tc>
@@ -22303,7 +22303,7 @@
                 <w:sz w:val="19"/>
                 <w:szCs w:val="19"/>
               </w:rPr>
-              <w:t xml:space="preserve">VietA 034</w:t>
+              <w:t xml:space="preserve">VietA 037</w:t>
             </w:r>
           </w:p>
         </w:tc>
@@ -22332,7 +22332,7 @@
                 <w:sz w:val="19"/>
                 <w:szCs w:val="19"/>
               </w:rPr>
-              <w:t xml:space="preserve">vieta034</w:t>
+              <w:t xml:space="preserve">vieta037</w:t>
             </w:r>
           </w:p>
         </w:tc>
@@ -22361,7 +22361,7 @@
                 <w:sz w:val="19"/>
                 <w:szCs w:val="19"/>
               </w:rPr>
-              <w:t xml:space="preserve">Lê Thị Mỹ Phúc</w:t>
+              <w:t xml:space="preserve">Nguyễn Thị Kim Hoàng</w:t>
             </w:r>
           </w:p>
         </w:tc>
@@ -22390,7 +22390,7 @@
                 <w:sz w:val="19"/>
                 <w:szCs w:val="19"/>
               </w:rPr>
-              <w:t xml:space="preserve">Khối văn phòng</w:t>
+              <w:t xml:space="preserve">Phòng kinh doanh</w:t>
             </w:r>
           </w:p>
         </w:tc>
@@ -22419,7 +22419,7 @@
                 <w:sz w:val="19"/>
                 <w:szCs w:val="19"/>
               </w:rPr>
-              <w:t xml:space="preserve">Kế toán viên</w:t>
+              <w:t xml:space="preserve">Kế toán kinh doanh</w:t>
             </w:r>
           </w:p>
         </w:tc>
@@ -22448,7 +22448,7 @@
                 <w:sz w:val="19"/>
                 <w:szCs w:val="19"/>
               </w:rPr>
-              <w:t xml:space="preserve">VietA#Emp@034*7W</w:t>
+              <w:t xml:space="preserve">VietA#Emp@037*7W</w:t>
             </w:r>
           </w:p>
         </w:tc>
@@ -22508,7 +22508,7 @@
                 <w:sz w:val="19"/>
                 <w:szCs w:val="19"/>
               </w:rPr>
-              <w:t xml:space="preserve">VietA 037</w:t>
+              <w:t xml:space="preserve">VietA 038</w:t>
             </w:r>
           </w:p>
         </w:tc>
@@ -22537,7 +22537,7 @@
                 <w:sz w:val="19"/>
                 <w:szCs w:val="19"/>
               </w:rPr>
-              <w:t xml:space="preserve">vieta037</w:t>
+              <w:t xml:space="preserve">vieta038</w:t>
             </w:r>
           </w:p>
         </w:tc>
@@ -22566,7 +22566,7 @@
                 <w:sz w:val="19"/>
                 <w:szCs w:val="19"/>
               </w:rPr>
-              <w:t xml:space="preserve">Nguyễn Thị Kim Hoàng</w:t>
+              <w:t xml:space="preserve">Phạm Thị Xuân Khoa</w:t>
             </w:r>
           </w:p>
         </w:tc>
@@ -22624,7 +22624,7 @@
                 <w:sz w:val="19"/>
                 <w:szCs w:val="19"/>
               </w:rPr>
-              <w:t xml:space="preserve">Kế toán kinh doanh</w:t>
+              <w:t xml:space="preserve">Nhân viên kinh doanh</w:t>
             </w:r>
           </w:p>
         </w:tc>
@@ -22653,7 +22653,7 @@
                 <w:sz w:val="19"/>
                 <w:szCs w:val="19"/>
               </w:rPr>
-              <w:t xml:space="preserve">VietA#Emp@037*7W</w:t>
+              <w:t xml:space="preserve">VietA#Emp@038*7W</w:t>
             </w:r>
           </w:p>
         </w:tc>
@@ -22713,7 +22713,7 @@
                 <w:sz w:val="19"/>
                 <w:szCs w:val="19"/>
               </w:rPr>
-              <w:t xml:space="preserve">VietA 038</w:t>
+              <w:t xml:space="preserve">VietA 040</w:t>
             </w:r>
           </w:p>
         </w:tc>
@@ -22742,7 +22742,7 @@
                 <w:sz w:val="19"/>
                 <w:szCs w:val="19"/>
               </w:rPr>
-              <w:t xml:space="preserve">vieta038</w:t>
+              <w:t xml:space="preserve">vieta040</w:t>
             </w:r>
           </w:p>
         </w:tc>
@@ -22771,7 +22771,7 @@
                 <w:sz w:val="19"/>
                 <w:szCs w:val="19"/>
               </w:rPr>
-              <w:t xml:space="preserve">Phạm Thị Xuân Khoa</w:t>
+              <w:t xml:space="preserve">Võ Thanh Sơn</w:t>
             </w:r>
           </w:p>
         </w:tc>
@@ -22858,7 +22858,7 @@
                 <w:sz w:val="19"/>
                 <w:szCs w:val="19"/>
               </w:rPr>
-              <w:t xml:space="preserve">VietA#Emp@038*7W</w:t>
+              <w:t xml:space="preserve">VietA#Emp@040*7W</w:t>
             </w:r>
           </w:p>
         </w:tc>
@@ -22918,7 +22918,7 @@
                 <w:sz w:val="19"/>
                 <w:szCs w:val="19"/>
               </w:rPr>
-              <w:t xml:space="preserve">VietA 040</w:t>
+              <w:t xml:space="preserve">VietA 041</w:t>
             </w:r>
           </w:p>
         </w:tc>
@@ -22947,7 +22947,7 @@
                 <w:sz w:val="19"/>
                 <w:szCs w:val="19"/>
               </w:rPr>
-              <w:t xml:space="preserve">vieta040</w:t>
+              <w:t xml:space="preserve">vieta041</w:t>
             </w:r>
           </w:p>
         </w:tc>
@@ -22976,7 +22976,7 @@
                 <w:sz w:val="19"/>
                 <w:szCs w:val="19"/>
               </w:rPr>
-              <w:t xml:space="preserve">Võ Thanh Sơn</w:t>
+              <w:t xml:space="preserve">Phạm Phước Lành</w:t>
             </w:r>
           </w:p>
         </w:tc>
@@ -23063,7 +23063,7 @@
                 <w:sz w:val="19"/>
                 <w:szCs w:val="19"/>
               </w:rPr>
-              <w:t xml:space="preserve">VietA#Emp@040*7W</w:t>
+              <w:t xml:space="preserve">VietA#Emp@041*7W</w:t>
             </w:r>
           </w:p>
         </w:tc>
@@ -23123,7 +23123,7 @@
                 <w:sz w:val="19"/>
                 <w:szCs w:val="19"/>
               </w:rPr>
-              <w:t xml:space="preserve">VietA 041</w:t>
+              <w:t xml:space="preserve">VietA 042</w:t>
             </w:r>
           </w:p>
         </w:tc>
@@ -23152,7 +23152,7 @@
                 <w:sz w:val="19"/>
                 <w:szCs w:val="19"/>
               </w:rPr>
-              <w:t xml:space="preserve">vieta041</w:t>
+              <w:t xml:space="preserve">vieta042</w:t>
             </w:r>
           </w:p>
         </w:tc>
@@ -23181,7 +23181,7 @@
                 <w:sz w:val="19"/>
                 <w:szCs w:val="19"/>
               </w:rPr>
-              <w:t xml:space="preserve">Phạm Phước Lành</w:t>
+              <w:t xml:space="preserve">Ngô Thanh Tín</w:t>
             </w:r>
           </w:p>
         </w:tc>
@@ -23268,7 +23268,7 @@
                 <w:sz w:val="19"/>
                 <w:szCs w:val="19"/>
               </w:rPr>
-              <w:t xml:space="preserve">VietA#Emp@041*7W</w:t>
+              <w:t xml:space="preserve">VietA#Emp@042*7W</w:t>
             </w:r>
           </w:p>
         </w:tc>
@@ -23328,7 +23328,7 @@
                 <w:sz w:val="19"/>
                 <w:szCs w:val="19"/>
               </w:rPr>
-              <w:t xml:space="preserve">VietA 042</w:t>
+              <w:t xml:space="preserve">VietA 047</w:t>
             </w:r>
           </w:p>
         </w:tc>
@@ -23357,7 +23357,7 @@
                 <w:sz w:val="19"/>
                 <w:szCs w:val="19"/>
               </w:rPr>
-              <w:t xml:space="preserve">vieta042</w:t>
+              <w:t xml:space="preserve">vieta047</w:t>
             </w:r>
           </w:p>
         </w:tc>
@@ -23386,7 +23386,7 @@
                 <w:sz w:val="19"/>
                 <w:szCs w:val="19"/>
               </w:rPr>
-              <w:t xml:space="preserve">Ngô Thanh Tín</w:t>
+              <w:t xml:space="preserve">Nguyễn Thành Lợi</w:t>
             </w:r>
           </w:p>
         </w:tc>
@@ -23415,7 +23415,7 @@
                 <w:sz w:val="19"/>
                 <w:szCs w:val="19"/>
               </w:rPr>
-              <w:t xml:space="preserve">Phòng kinh doanh</w:t>
+              <w:t xml:space="preserve">Xưởng sản xuất gối</w:t>
             </w:r>
           </w:p>
         </w:tc>
@@ -23444,7 +23444,7 @@
                 <w:sz w:val="19"/>
                 <w:szCs w:val="19"/>
               </w:rPr>
-              <w:t xml:space="preserve">Nhân viên kinh doanh</w:t>
+              <w:t xml:space="preserve">Nhân viên thổi gối</w:t>
             </w:r>
           </w:p>
         </w:tc>
@@ -23473,7 +23473,7 @@
                 <w:sz w:val="19"/>
                 <w:szCs w:val="19"/>
               </w:rPr>
-              <w:t xml:space="preserve">VietA#Emp@042*7W</w:t>
+              <w:t xml:space="preserve">VietA#Emp@047*7W</w:t>
             </w:r>
           </w:p>
         </w:tc>
@@ -23533,7 +23533,7 @@
                 <w:sz w:val="19"/>
                 <w:szCs w:val="19"/>
               </w:rPr>
-              <w:t xml:space="preserve">VietA 047</w:t>
+              <w:t xml:space="preserve">VietA 049</w:t>
             </w:r>
           </w:p>
         </w:tc>
@@ -23562,7 +23562,7 @@
                 <w:sz w:val="19"/>
                 <w:szCs w:val="19"/>
               </w:rPr>
-              <w:t xml:space="preserve">vieta047</w:t>
+              <w:t xml:space="preserve">vieta049</w:t>
             </w:r>
           </w:p>
         </w:tc>
@@ -23591,7 +23591,7 @@
                 <w:sz w:val="19"/>
                 <w:szCs w:val="19"/>
               </w:rPr>
-              <w:t xml:space="preserve">Nguyễn Thành Lợi</w:t>
+              <w:t xml:space="preserve">Nguyễn Thị Ngọc</w:t>
             </w:r>
           </w:p>
         </w:tc>
@@ -23649,7 +23649,7 @@
                 <w:sz w:val="19"/>
                 <w:szCs w:val="19"/>
               </w:rPr>
-              <w:t xml:space="preserve">Nhân viên thổi gối</w:t>
+              <w:t xml:space="preserve">Nhân viên may gối</w:t>
             </w:r>
           </w:p>
         </w:tc>
@@ -23678,7 +23678,7 @@
                 <w:sz w:val="19"/>
                 <w:szCs w:val="19"/>
               </w:rPr>
-              <w:t xml:space="preserve">VietA#Emp@047*7W</w:t>
+              <w:t xml:space="preserve">VietA#Emp@049*7W</w:t>
             </w:r>
           </w:p>
         </w:tc>
@@ -23738,7 +23738,7 @@
                 <w:sz w:val="19"/>
                 <w:szCs w:val="19"/>
               </w:rPr>
-              <w:t xml:space="preserve">VietA 049</w:t>
+              <w:t xml:space="preserve">VietA 052</w:t>
             </w:r>
           </w:p>
         </w:tc>
@@ -23767,7 +23767,7 @@
                 <w:sz w:val="19"/>
                 <w:szCs w:val="19"/>
               </w:rPr>
-              <w:t xml:space="preserve">vieta049</w:t>
+              <w:t xml:space="preserve">vieta052</w:t>
             </w:r>
           </w:p>
         </w:tc>
@@ -23796,7 +23796,7 @@
                 <w:sz w:val="19"/>
                 <w:szCs w:val="19"/>
               </w:rPr>
-              <w:t xml:space="preserve">Nguyễn Thị Ngọc</w:t>
+              <w:t xml:space="preserve">Nguyễn Minh Văn</w:t>
             </w:r>
           </w:p>
         </w:tc>
@@ -23825,7 +23825,7 @@
                 <w:sz w:val="19"/>
                 <w:szCs w:val="19"/>
               </w:rPr>
-              <w:t xml:space="preserve">Xưởng sản xuất gối</w:t>
+              <w:t xml:space="preserve">Kho Mỹ Tho</w:t>
             </w:r>
           </w:p>
         </w:tc>
@@ -23854,7 +23854,7 @@
                 <w:sz w:val="19"/>
                 <w:szCs w:val="19"/>
               </w:rPr>
-              <w:t xml:space="preserve">Nhân viên may gối</w:t>
+              <w:t xml:space="preserve">Nhân viên giao hàng Mỹ Tho</w:t>
             </w:r>
           </w:p>
         </w:tc>
@@ -23883,7 +23883,7 @@
                 <w:sz w:val="19"/>
                 <w:szCs w:val="19"/>
               </w:rPr>
-              <w:t xml:space="preserve">VietA#Emp@049*7W</w:t>
+              <w:t xml:space="preserve">VietA#Emp@052*7W</w:t>
             </w:r>
           </w:p>
         </w:tc>
@@ -23943,7 +23943,7 @@
                 <w:sz w:val="19"/>
                 <w:szCs w:val="19"/>
               </w:rPr>
-              <w:t xml:space="preserve">VietA 052</w:t>
+              <w:t xml:space="preserve">VietA 053</w:t>
             </w:r>
           </w:p>
         </w:tc>
@@ -23972,7 +23972,7 @@
                 <w:sz w:val="19"/>
                 <w:szCs w:val="19"/>
               </w:rPr>
-              <w:t xml:space="preserve">vieta052</w:t>
+              <w:t xml:space="preserve">vieta053</w:t>
             </w:r>
           </w:p>
         </w:tc>
@@ -24001,7 +24001,7 @@
                 <w:sz w:val="19"/>
                 <w:szCs w:val="19"/>
               </w:rPr>
-              <w:t xml:space="preserve">Nguyễn Minh Văn</w:t>
+              <w:t xml:space="preserve">Trịnh Dương Minh Nhựt</w:t>
             </w:r>
           </w:p>
         </w:tc>
@@ -24030,7 +24030,7 @@
                 <w:sz w:val="19"/>
                 <w:szCs w:val="19"/>
               </w:rPr>
-              <w:t xml:space="preserve">Kho Mỹ Tho</w:t>
+              <w:t xml:space="preserve">Xưởng sản xuất nệm</w:t>
             </w:r>
           </w:p>
         </w:tc>
@@ -24059,7 +24059,7 @@
                 <w:sz w:val="19"/>
                 <w:szCs w:val="19"/>
               </w:rPr>
-              <w:t xml:space="preserve">Nhân viên giao hàng Mỹ Tho</w:t>
+              <w:t xml:space="preserve">Nhân viên phun keo</w:t>
             </w:r>
           </w:p>
         </w:tc>
@@ -24088,7 +24088,7 @@
                 <w:sz w:val="19"/>
                 <w:szCs w:val="19"/>
               </w:rPr>
-              <w:t xml:space="preserve">VietA#Emp@052*7W</w:t>
+              <w:t xml:space="preserve">VietA#Emp@053*7W</w:t>
             </w:r>
           </w:p>
         </w:tc>
@@ -24148,7 +24148,7 @@
                 <w:sz w:val="19"/>
                 <w:szCs w:val="19"/>
               </w:rPr>
-              <w:t xml:space="preserve">VietA 053</w:t>
+              <w:t xml:space="preserve">VietA 054</w:t>
             </w:r>
           </w:p>
         </w:tc>
@@ -24177,7 +24177,7 @@
                 <w:sz w:val="19"/>
                 <w:szCs w:val="19"/>
               </w:rPr>
-              <w:t xml:space="preserve">vieta053</w:t>
+              <w:t xml:space="preserve">vieta054</w:t>
             </w:r>
           </w:p>
         </w:tc>
@@ -24206,7 +24206,7 @@
                 <w:sz w:val="19"/>
                 <w:szCs w:val="19"/>
               </w:rPr>
-              <w:t xml:space="preserve">Trịnh Dương Minh Nhựt</w:t>
+              <w:t xml:space="preserve">Võ Hoàng Tín</w:t>
             </w:r>
           </w:p>
         </w:tc>
@@ -24264,7 +24264,7 @@
                 <w:sz w:val="19"/>
                 <w:szCs w:val="19"/>
               </w:rPr>
-              <w:t xml:space="preserve">Nhân viên phun keo</w:t>
+              <w:t xml:space="preserve">Nhân viên may viền</w:t>
             </w:r>
           </w:p>
         </w:tc>
@@ -24293,7 +24293,7 @@
                 <w:sz w:val="19"/>
                 <w:szCs w:val="19"/>
               </w:rPr>
-              <w:t xml:space="preserve">VietA#Emp@053*7W</w:t>
+              <w:t xml:space="preserve">VietA#Emp@054*7W</w:t>
             </w:r>
           </w:p>
         </w:tc>
@@ -24353,7 +24353,7 @@
                 <w:sz w:val="19"/>
                 <w:szCs w:val="19"/>
               </w:rPr>
-              <w:t xml:space="preserve">VietA 054</w:t>
+              <w:t xml:space="preserve">VietA 055</w:t>
             </w:r>
           </w:p>
         </w:tc>
@@ -24382,7 +24382,7 @@
                 <w:sz w:val="19"/>
                 <w:szCs w:val="19"/>
               </w:rPr>
-              <w:t xml:space="preserve">vieta054</w:t>
+              <w:t xml:space="preserve">vieta055</w:t>
             </w:r>
           </w:p>
         </w:tc>
@@ -24411,7 +24411,7 @@
                 <w:sz w:val="19"/>
                 <w:szCs w:val="19"/>
               </w:rPr>
-              <w:t xml:space="preserve">Võ Hoàng Tín</w:t>
+              <w:t xml:space="preserve">Phan Quốc Khôi</w:t>
             </w:r>
           </w:p>
         </w:tc>
@@ -24469,7 +24469,7 @@
                 <w:sz w:val="19"/>
                 <w:szCs w:val="19"/>
               </w:rPr>
-              <w:t xml:space="preserve">Nhân viên may viền</w:t>
+              <w:t xml:space="preserve">Tài xế xưởng sản xuất</w:t>
             </w:r>
           </w:p>
         </w:tc>
@@ -24498,7 +24498,7 @@
                 <w:sz w:val="19"/>
                 <w:szCs w:val="19"/>
               </w:rPr>
-              <w:t xml:space="preserve">VietA#Emp@054*7W</w:t>
+              <w:t xml:space="preserve">VietA#Emp@055*7W</w:t>
             </w:r>
           </w:p>
         </w:tc>
@@ -24558,7 +24558,7 @@
                 <w:sz w:val="19"/>
                 <w:szCs w:val="19"/>
               </w:rPr>
-              <w:t xml:space="preserve">VietA 055</w:t>
+              <w:t xml:space="preserve">VietA 056</w:t>
             </w:r>
           </w:p>
         </w:tc>
@@ -24587,7 +24587,7 @@
                 <w:sz w:val="19"/>
                 <w:szCs w:val="19"/>
               </w:rPr>
-              <w:t xml:space="preserve">vieta055</w:t>
+              <w:t xml:space="preserve">vieta056</w:t>
             </w:r>
           </w:p>
         </w:tc>
@@ -24616,7 +24616,7 @@
                 <w:sz w:val="19"/>
                 <w:szCs w:val="19"/>
               </w:rPr>
-              <w:t xml:space="preserve">Phan Quốc Khôi</w:t>
+              <w:t xml:space="preserve">Trần Thị Bảo Châu</w:t>
             </w:r>
           </w:p>
         </w:tc>
@@ -24674,7 +24674,7 @@
                 <w:sz w:val="19"/>
                 <w:szCs w:val="19"/>
               </w:rPr>
-              <w:t xml:space="preserve">Tài xế xưởng sản xuất</w:t>
+              <w:t xml:space="preserve">Kế toán xưởng sản xuất</w:t>
             </w:r>
           </w:p>
         </w:tc>
@@ -24703,7 +24703,7 @@
                 <w:sz w:val="19"/>
                 <w:szCs w:val="19"/>
               </w:rPr>
-              <w:t xml:space="preserve">VietA#Emp@055*7W</w:t>
+              <w:t xml:space="preserve">VietA#Emp@056*7W</w:t>
             </w:r>
           </w:p>
         </w:tc>

</xml_diff>